<commit_message>
Update engineering report and simplify bibliography
</commit_message>
<xml_diff>
--- a/docs/TrialCompiler_项目完整参考文献.docx
+++ b/docs/TrialCompiler_项目完整参考文献.docx
@@ -31,7 +31,7 @@
           <w:color w:val="1F4D78"/>
           <w:sz w:val="20"/>
         </w:rPr>
-        <w:t>规范化来源 208 条  |  A=61  B=55  C=17  D=65  INTERNAL=10</w:t>
+        <w:t>规范化来源 208 条  |  按主题分类并保留原始链接</w:t>
       </w:r>
     </w:p>
     <w:p>
@@ -49,7 +49,7 @@
         <w:ind w:left="540" w:hanging="271"/>
       </w:pPr>
       <w:r>
-        <w:t>法规、伦理、统计与文件要求优先引用A级来源；结构与模板映射可引用A级或B级来源。</w:t>
+        <w:t>法规、伦理、统计与文件要求优先引用监管机构、国际标准组织及正式指南的原始页面。</w:t>
       </w:r>
     </w:p>
     <w:p>
@@ -121,7 +121,7 @@
           <w:b w:val="0"/>
           <w:sz w:val="21"/>
         </w:rPr>
-        <w:t>NMPA and National Health Commission, 2020. 证据等级：A。</w:t>
+        <w:t>NMPA and National Health Commission, 2020。</w:t>
       </w:r>
       <w:r>
         <w:t xml:space="preserve"> </w:t>
@@ -182,7 +182,7 @@
           <w:b w:val="0"/>
           <w:sz w:val="21"/>
         </w:rPr>
-        <w:t>NMPA and NHC and NATCM and NCDC, 2026. 证据等级：A。</w:t>
+        <w:t>NMPA and NHC and NATCM and NCDC, 2026。</w:t>
       </w:r>
       <w:r>
         <w:t xml:space="preserve"> </w:t>
@@ -243,7 +243,7 @@
           <w:b w:val="0"/>
           <w:sz w:val="21"/>
         </w:rPr>
-        <w:t>CDE, 2021. 证据等级：A。</w:t>
+        <w:t>CDE, 2021。</w:t>
       </w:r>
       <w:r>
         <w:t xml:space="preserve"> </w:t>
@@ -304,7 +304,7 @@
           <w:b w:val="0"/>
           <w:sz w:val="21"/>
         </w:rPr>
-        <w:t>CDE, 2022. 证据等级：A。</w:t>
+        <w:t>CDE, 2022。</w:t>
       </w:r>
       <w:r>
         <w:t xml:space="preserve"> </w:t>
@@ -365,7 +365,7 @@
           <w:b w:val="0"/>
           <w:sz w:val="21"/>
         </w:rPr>
-        <w:t>中国食品药品网, 2022. 证据等级：B。</w:t>
+        <w:t>中国食品药品网, 2022。</w:t>
       </w:r>
       <w:r>
         <w:t xml:space="preserve"> </w:t>
@@ -426,7 +426,7 @@
           <w:b w:val="0"/>
           <w:sz w:val="21"/>
         </w:rPr>
-        <w:t>中国食品药品网, 2022. 证据等级：B。</w:t>
+        <w:t>中国食品药品网, 2022。</w:t>
       </w:r>
       <w:r>
         <w:t xml:space="preserve"> </w:t>
@@ -487,7 +487,7 @@
           <w:b w:val="0"/>
           <w:sz w:val="21"/>
         </w:rPr>
-        <w:t>US FDA, 2026. 证据等级：A。</w:t>
+        <w:t>US FDA, 2026。</w:t>
       </w:r>
       <w:r>
         <w:t xml:space="preserve"> </w:t>
@@ -548,7 +548,7 @@
           <w:b w:val="0"/>
           <w:sz w:val="21"/>
         </w:rPr>
-        <w:t>ICH, 2025. 证据等级：A。</w:t>
+        <w:t>ICH, 2025。</w:t>
       </w:r>
       <w:r>
         <w:t xml:space="preserve"> </w:t>
@@ -609,7 +609,7 @@
           <w:b w:val="0"/>
           <w:sz w:val="21"/>
         </w:rPr>
-        <w:t>ICH, 2026. 证据等级：A。</w:t>
+        <w:t>ICH, 2026。</w:t>
       </w:r>
       <w:r>
         <w:t xml:space="preserve"> </w:t>
@@ -670,7 +670,7 @@
           <w:b w:val="0"/>
           <w:sz w:val="21"/>
         </w:rPr>
-        <w:t>ICH, 2021. 证据等级：A。</w:t>
+        <w:t>ICH, 2021。</w:t>
       </w:r>
       <w:r>
         <w:t xml:space="preserve"> </w:t>
@@ -731,7 +731,7 @@
           <w:b w:val="0"/>
           <w:sz w:val="21"/>
         </w:rPr>
-        <w:t>ICH, 1994. 证据等级：A。</w:t>
+        <w:t>ICH, 1994。</w:t>
       </w:r>
       <w:r>
         <w:t xml:space="preserve"> </w:t>
@@ -792,7 +792,7 @@
           <w:b w:val="0"/>
           <w:sz w:val="21"/>
         </w:rPr>
-        <w:t>WHO, 2024. 证据等级：A。</w:t>
+        <w:t>WHO, 2024。</w:t>
       </w:r>
       <w:r>
         <w:t xml:space="preserve"> </w:t>
@@ -853,7 +853,7 @@
           <w:b w:val="0"/>
           <w:sz w:val="21"/>
         </w:rPr>
-        <w:t>WMA, 2024. 证据等级：B。</w:t>
+        <w:t>WMA, 2024。</w:t>
       </w:r>
       <w:r>
         <w:t xml:space="preserve"> </w:t>
@@ -914,7 +914,7 @@
           <w:b w:val="0"/>
           <w:sz w:val="21"/>
         </w:rPr>
-        <w:t>CIOMS/WHO, 2016. 证据等级：A。</w:t>
+        <w:t>CIOMS/WHO, 2016。</w:t>
       </w:r>
       <w:r>
         <w:t xml:space="preserve"> </w:t>
@@ -975,7 +975,7 @@
           <w:b w:val="0"/>
           <w:sz w:val="21"/>
         </w:rPr>
-        <w:t>国家药监局等四部门, 2026. 证据等级：B。</w:t>
+        <w:t>国家药监局等四部门, 2026。</w:t>
       </w:r>
       <w:r>
         <w:t xml:space="preserve"> </w:t>
@@ -1036,7 +1036,7 @@
           <w:b w:val="0"/>
           <w:sz w:val="21"/>
         </w:rPr>
-        <w:t>国家药监局等四部门, 2026. 证据等级：B。</w:t>
+        <w:t>国家药监局等四部门, 2026。</w:t>
       </w:r>
       <w:r>
         <w:t xml:space="preserve"> </w:t>
@@ -1097,7 +1097,7 @@
           <w:b w:val="0"/>
           <w:sz w:val="21"/>
         </w:rPr>
-        <w:t>SPIRIT/CONSORT Group; BMJ, 2025. 证据等级：A。</w:t>
+        <w:t>SPIRIT/CONSORT Group; BMJ, 2025。</w:t>
       </w:r>
       <w:r>
         <w:t xml:space="preserve"> </w:t>
@@ -1158,7 +1158,7 @@
           <w:b w:val="0"/>
           <w:sz w:val="21"/>
         </w:rPr>
-        <w:t>SPIRIT/CONSORT Group; BMJ, 2025. 证据等级：A。</w:t>
+        <w:t>SPIRIT/CONSORT Group; BMJ, 2025。</w:t>
       </w:r>
       <w:r>
         <w:t xml:space="preserve"> </w:t>
@@ -1219,7 +1219,7 @@
           <w:b w:val="0"/>
           <w:sz w:val="21"/>
         </w:rPr>
-        <w:t>SPIRIT/CONSORT Group; BMJ, 2025. 证据等级：A。</w:t>
+        <w:t>SPIRIT/CONSORT Group; BMJ, 2025。</w:t>
       </w:r>
       <w:r>
         <w:t xml:space="preserve"> </w:t>
@@ -1280,7 +1280,7 @@
           <w:b w:val="0"/>
           <w:sz w:val="21"/>
         </w:rPr>
-        <w:t>SPIRIT/CONSORT Group; BMJ, 2025. 证据等级：A。</w:t>
+        <w:t>SPIRIT/CONSORT Group; BMJ, 2025。</w:t>
       </w:r>
       <w:r>
         <w:t xml:space="preserve"> </w:t>
@@ -1341,7 +1341,7 @@
           <w:b w:val="0"/>
           <w:sz w:val="21"/>
         </w:rPr>
-        <w:t>FDA, 2019. 证据等级：A。</w:t>
+        <w:t>FDA, 2019。</w:t>
       </w:r>
       <w:r>
         <w:t xml:space="preserve"> </w:t>
@@ -1402,7 +1402,7 @@
           <w:b w:val="0"/>
           <w:sz w:val="21"/>
         </w:rPr>
-        <w:t>FDA, 2019. 证据等级：A。</w:t>
+        <w:t>FDA, 2019。</w:t>
       </w:r>
       <w:r>
         <w:t xml:space="preserve"> </w:t>
@@ -1463,7 +1463,7 @@
           <w:b w:val="0"/>
           <w:sz w:val="21"/>
         </w:rPr>
-        <w:t>FDA, 2023. 证据等级：A。</w:t>
+        <w:t>FDA, 2023。</w:t>
       </w:r>
       <w:r>
         <w:t xml:space="preserve"> </w:t>
@@ -1524,7 +1524,7 @@
           <w:b w:val="0"/>
           <w:sz w:val="21"/>
         </w:rPr>
-        <w:t>FDA, 2024. 证据等级：A。</w:t>
+        <w:t>FDA, 2024。</w:t>
       </w:r>
       <w:r>
         <w:t xml:space="preserve"> </w:t>
@@ -1585,7 +1585,7 @@
           <w:b w:val="0"/>
           <w:sz w:val="21"/>
         </w:rPr>
-        <w:t>FDA, 2024. 证据等级：A。</w:t>
+        <w:t>FDA, 2024。</w:t>
       </w:r>
       <w:r>
         <w:t xml:space="preserve"> </w:t>
@@ -1646,7 +1646,7 @@
           <w:b w:val="0"/>
           <w:sz w:val="21"/>
         </w:rPr>
-        <w:t>FDA, 2026. 证据等级：A。</w:t>
+        <w:t>FDA, 2026。</w:t>
       </w:r>
       <w:r>
         <w:t xml:space="preserve"> </w:t>
@@ -1707,7 +1707,7 @@
           <w:b w:val="0"/>
           <w:sz w:val="21"/>
         </w:rPr>
-        <w:t>ICH, 2000. 证据等级：A。</w:t>
+        <w:t>ICH, 2000。</w:t>
       </w:r>
       <w:r>
         <w:t xml:space="preserve"> </w:t>
@@ -1768,7 +1768,7 @@
           <w:b w:val="0"/>
           <w:sz w:val="21"/>
         </w:rPr>
-        <w:t>ICH, 1994. 证据等级：A。</w:t>
+        <w:t>ICH, 1994。</w:t>
       </w:r>
       <w:r>
         <w:t xml:space="preserve"> </w:t>
@@ -1829,7 +1829,7 @@
           <w:b w:val="0"/>
           <w:sz w:val="21"/>
         </w:rPr>
-        <w:t>ICH, 1998. 证据等级：A。</w:t>
+        <w:t>ICH, 1998。</w:t>
       </w:r>
       <w:r>
         <w:t xml:space="preserve"> </w:t>
@@ -1890,7 +1890,7 @@
           <w:b w:val="0"/>
           <w:sz w:val="21"/>
         </w:rPr>
-        <w:t>ICH, 1993. 证据等级：A。</w:t>
+        <w:t>ICH, 1993。</w:t>
       </w:r>
       <w:r>
         <w:t xml:space="preserve"> </w:t>
@@ -1951,7 +1951,7 @@
           <w:b w:val="0"/>
           <w:sz w:val="21"/>
         </w:rPr>
-        <w:t>ICH, 2017. 证据等级：A。</w:t>
+        <w:t>ICH, 2017。</w:t>
       </w:r>
       <w:r>
         <w:t xml:space="preserve"> </w:t>
@@ -2012,7 +2012,7 @@
           <w:b w:val="0"/>
           <w:sz w:val="21"/>
         </w:rPr>
-        <w:t>ICH, 2024. 证据等级：A。</w:t>
+        <w:t>ICH, 2024。</w:t>
       </w:r>
       <w:r>
         <w:t xml:space="preserve"> </w:t>
@@ -2073,7 +2073,7 @@
           <w:b w:val="0"/>
           <w:sz w:val="21"/>
         </w:rPr>
-        <w:t>ICH, 2017. 证据等级：A。</w:t>
+        <w:t>ICH, 2017。</w:t>
       </w:r>
       <w:r>
         <w:t xml:space="preserve"> </w:t>
@@ -2134,7 +2134,7 @@
           <w:b w:val="0"/>
           <w:sz w:val="21"/>
         </w:rPr>
-        <w:t>ICH, 2022. 证据等级：A。</w:t>
+        <w:t>ICH, 2022。</w:t>
       </w:r>
       <w:r>
         <w:t xml:space="preserve"> </w:t>
@@ -2195,7 +2195,7 @@
           <w:b w:val="0"/>
           <w:sz w:val="21"/>
         </w:rPr>
-        <w:t>ICH, 2025. 证据等级：A。</w:t>
+        <w:t>ICH, 2025。</w:t>
       </w:r>
       <w:r>
         <w:t xml:space="preserve"> </w:t>
@@ -2256,7 +2256,7 @@
           <w:b w:val="0"/>
           <w:sz w:val="21"/>
         </w:rPr>
-        <w:t>ICH, 2025. 证据等级：A。</w:t>
+        <w:t>ICH, 2025。</w:t>
       </w:r>
       <w:r>
         <w:t xml:space="preserve"> </w:t>
@@ -2317,7 +2317,7 @@
           <w:b w:val="0"/>
           <w:sz w:val="21"/>
         </w:rPr>
-        <w:t>ICH, 2026. 证据等级：A。</w:t>
+        <w:t>ICH, 2026。</w:t>
       </w:r>
       <w:r>
         <w:t xml:space="preserve"> </w:t>
@@ -2378,7 +2378,7 @@
           <w:b w:val="0"/>
           <w:sz w:val="21"/>
         </w:rPr>
-        <w:t>US FDA, 2026. 证据等级：A。</w:t>
+        <w:t>US FDA, 2026。</w:t>
       </w:r>
       <w:r>
         <w:t xml:space="preserve"> </w:t>
@@ -2439,7 +2439,7 @@
           <w:b w:val="0"/>
           <w:sz w:val="21"/>
         </w:rPr>
-        <w:t>European Medicines Agency, 2023. 证据等级：B。</w:t>
+        <w:t>European Medicines Agency, 2023。</w:t>
       </w:r>
       <w:r>
         <w:t xml:space="preserve"> </w:t>
@@ -2500,7 +2500,7 @@
           <w:b w:val="0"/>
           <w:sz w:val="21"/>
         </w:rPr>
-        <w:t>SPIRIT Group, 2013. 证据等级：A。</w:t>
+        <w:t>SPIRIT Group, 2013。</w:t>
       </w:r>
       <w:r>
         <w:t xml:space="preserve"> </w:t>
@@ -2561,7 +2561,7 @@
           <w:b w:val="0"/>
           <w:sz w:val="21"/>
         </w:rPr>
-        <w:t>SPIRIT Group, 2013. 证据等级：A。</w:t>
+        <w:t>SPIRIT Group, 2013。</w:t>
       </w:r>
       <w:r>
         <w:t xml:space="preserve"> </w:t>
@@ -2622,7 +2622,7 @@
           <w:b w:val="0"/>
           <w:sz w:val="21"/>
         </w:rPr>
-        <w:t>SPIRIT Group, 2026. 证据等级：A。</w:t>
+        <w:t>SPIRIT Group, 2026。</w:t>
       </w:r>
       <w:r>
         <w:t xml:space="preserve"> </w:t>
@@ -2683,7 +2683,7 @@
           <w:b w:val="0"/>
           <w:sz w:val="21"/>
         </w:rPr>
-        <w:t>BMJ and SPIRIT-AI Group, 2020. 证据等级：A。</w:t>
+        <w:t>BMJ and SPIRIT-AI Group, 2020。</w:t>
       </w:r>
       <w:r>
         <w:t xml:space="preserve"> </w:t>
@@ -2744,7 +2744,7 @@
           <w:b w:val="0"/>
           <w:sz w:val="21"/>
         </w:rPr>
-        <w:t>BMC Medicine, 2010. 证据等级：B。</w:t>
+        <w:t>BMC Medicine, 2010。</w:t>
       </w:r>
       <w:r>
         <w:t xml:space="preserve"> </w:t>
@@ -2805,7 +2805,7 @@
           <w:b w:val="0"/>
           <w:sz w:val="21"/>
         </w:rPr>
-        <w:t>ClinicalTrials.gov and NLM, 2026. 证据等级：B。</w:t>
+        <w:t>ClinicalTrials.gov and NLM, 2026。</w:t>
       </w:r>
       <w:r>
         <w:t xml:space="preserve"> </w:t>
@@ -2866,7 +2866,7 @@
           <w:b w:val="0"/>
           <w:sz w:val="21"/>
         </w:rPr>
-        <w:t>ICH, 2025. 证据等级：A。</w:t>
+        <w:t>ICH, 2025。</w:t>
       </w:r>
       <w:r>
         <w:t xml:space="preserve"> </w:t>
@@ -2927,7 +2927,7 @@
           <w:b w:val="0"/>
           <w:sz w:val="21"/>
         </w:rPr>
-        <w:t>ICH, 2021. 证据等级：A。</w:t>
+        <w:t>ICH, 2021。</w:t>
       </w:r>
       <w:r>
         <w:t xml:space="preserve"> </w:t>
@@ -2988,7 +2988,7 @@
           <w:b w:val="0"/>
           <w:sz w:val="21"/>
         </w:rPr>
-        <w:t>ICH, 1998. 证据等级：A。</w:t>
+        <w:t>ICH, 1998。</w:t>
       </w:r>
       <w:r>
         <w:t xml:space="preserve"> </w:t>
@@ -3049,7 +3049,7 @@
           <w:b w:val="0"/>
           <w:sz w:val="21"/>
         </w:rPr>
-        <w:t>ICH, 2019. 证据等级：A。</w:t>
+        <w:t>ICH, 2019。</w:t>
       </w:r>
       <w:r>
         <w:t xml:space="preserve"> </w:t>
@@ -3110,7 +3110,7 @@
           <w:b w:val="0"/>
           <w:sz w:val="21"/>
         </w:rPr>
-        <w:t>PLoS Clinical Trials via PMC, 2007. 证据等级：B。</w:t>
+        <w:t>PLoS Clinical Trials via PMC, 2007。</w:t>
       </w:r>
       <w:r>
         <w:t xml:space="preserve"> </w:t>
@@ -3171,7 +3171,7 @@
           <w:b w:val="0"/>
           <w:sz w:val="21"/>
         </w:rPr>
-        <w:t>PMC, 2022. 证据等级：B。</w:t>
+        <w:t>PMC, 2022。</w:t>
       </w:r>
       <w:r>
         <w:t xml:space="preserve"> </w:t>
@@ -3232,7 +3232,7 @@
           <w:b w:val="0"/>
           <w:sz w:val="21"/>
         </w:rPr>
-        <w:t>PubMed, 2016. 证据等级：B。</w:t>
+        <w:t>PubMed, 2016。</w:t>
       </w:r>
       <w:r>
         <w:t xml:space="preserve"> </w:t>
@@ -3293,7 +3293,7 @@
           <w:b w:val="0"/>
           <w:sz w:val="21"/>
         </w:rPr>
-        <w:t>SAGE Journals, 2016. 证据等级：B。</w:t>
+        <w:t>SAGE Journals, 2016。</w:t>
       </w:r>
       <w:r>
         <w:t xml:space="preserve"> </w:t>
@@ -3354,7 +3354,7 @@
           <w:b w:val="0"/>
           <w:sz w:val="21"/>
         </w:rPr>
-        <w:t>PubMed, 2024. 证据等级：B。</w:t>
+        <w:t>PubMed, 2024。</w:t>
       </w:r>
       <w:r>
         <w:t xml:space="preserve"> </w:t>
@@ -3415,7 +3415,7 @@
           <w:b w:val="0"/>
           <w:sz w:val="21"/>
         </w:rPr>
-        <w:t>PMC, 2025. 证据等级：B。</w:t>
+        <w:t>PMC, 2025。</w:t>
       </w:r>
       <w:r>
         <w:t xml:space="preserve"> </w:t>
@@ -3476,7 +3476,7 @@
           <w:b w:val="0"/>
           <w:sz w:val="21"/>
         </w:rPr>
-        <w:t>US FDA, 2026. 证据等级：A。</w:t>
+        <w:t>US FDA, 2026。</w:t>
       </w:r>
       <w:r>
         <w:t xml:space="preserve"> </w:t>
@@ -3537,7 +3537,7 @@
           <w:b w:val="0"/>
           <w:sz w:val="21"/>
         </w:rPr>
-        <w:t>US FDA, 2023. 证据等级：A。</w:t>
+        <w:t>US FDA, 2023。</w:t>
       </w:r>
       <w:r>
         <w:t xml:space="preserve"> </w:t>
@@ -3598,7 +3598,7 @@
           <w:b w:val="0"/>
           <w:sz w:val="21"/>
         </w:rPr>
-        <w:t>HHS OHRP, 2026. 证据等级：B。</w:t>
+        <w:t>HHS OHRP, 2026。</w:t>
       </w:r>
       <w:r>
         <w:t xml:space="preserve"> </w:t>
@@ -3659,7 +3659,7 @@
           <w:b w:val="0"/>
           <w:sz w:val="21"/>
         </w:rPr>
-        <w:t>US FDA / HHS, 2016. 证据等级：A。</w:t>
+        <w:t>US FDA / HHS, 2016。</w:t>
       </w:r>
       <w:r>
         <w:t xml:space="preserve"> </w:t>
@@ -3720,7 +3720,7 @@
           <w:b w:val="0"/>
           <w:sz w:val="21"/>
         </w:rPr>
-        <w:t>ICH, 2017. 证据等级：A。</w:t>
+        <w:t>ICH, 2017。</w:t>
       </w:r>
       <w:r>
         <w:t xml:space="preserve"> </w:t>
@@ -3781,7 +3781,7 @@
           <w:b w:val="0"/>
           <w:sz w:val="21"/>
         </w:rPr>
-        <w:t>EMA, 2026. 证据等级：A。</w:t>
+        <w:t>EMA, 2026。</w:t>
       </w:r>
       <w:r>
         <w:t xml:space="preserve"> </w:t>
@@ -3842,7 +3842,7 @@
           <w:b w:val="0"/>
           <w:sz w:val="21"/>
         </w:rPr>
-        <w:t>US FDA, 2018. 证据等级：A。</w:t>
+        <w:t>US FDA, 2018。</w:t>
       </w:r>
       <w:r>
         <w:t xml:space="preserve"> </w:t>
@@ -3911,7 +3911,7 @@
           <w:b w:val="0"/>
           <w:sz w:val="21"/>
         </w:rPr>
-        <w:t>WHO, 2026. 证据等级：B。</w:t>
+        <w:t>WHO, 2026。</w:t>
       </w:r>
       <w:r>
         <w:t xml:space="preserve"> </w:t>
@@ -3972,7 +3972,7 @@
           <w:b w:val="0"/>
           <w:sz w:val="21"/>
         </w:rPr>
-        <w:t>NIH OHSRP, 2026. 证据等级：B。</w:t>
+        <w:t>NIH OHSRP, 2026。</w:t>
       </w:r>
       <w:r>
         <w:t xml:space="preserve"> </w:t>
@@ -4033,7 +4033,7 @@
           <w:b w:val="0"/>
           <w:sz w:val="21"/>
         </w:rPr>
-        <w:t>NIAID, 2025. 证据等级：B。</w:t>
+        <w:t>NIAID, 2025。</w:t>
       </w:r>
       <w:r>
         <w:t xml:space="preserve"> </w:t>
@@ -4094,7 +4094,7 @@
           <w:b w:val="0"/>
           <w:sz w:val="21"/>
         </w:rPr>
-        <w:t>US FDA, 2026. 证据等级：B。</w:t>
+        <w:t>US FDA, 2026。</w:t>
       </w:r>
       <w:r>
         <w:t xml:space="preserve"> </w:t>
@@ -4155,7 +4155,7 @@
           <w:b w:val="0"/>
           <w:sz w:val="21"/>
         </w:rPr>
-        <w:t>TransCelerate BioPharma, 2026. 证据等级：B。</w:t>
+        <w:t>TransCelerate BioPharma, 2026。</w:t>
       </w:r>
       <w:r>
         <w:t xml:space="preserve"> </w:t>
@@ -4216,7 +4216,7 @@
           <w:b w:val="0"/>
           <w:sz w:val="21"/>
         </w:rPr>
-        <w:t>EU-PEARL, 2023. 证据等级：B。</w:t>
+        <w:t>EU-PEARL, 2023。</w:t>
       </w:r>
       <w:r>
         <w:t xml:space="preserve"> </w:t>
@@ -4277,7 +4277,7 @@
           <w:b w:val="0"/>
           <w:sz w:val="21"/>
         </w:rPr>
-        <w:t>Duke Biostatistics, 2020. 证据等级：B。</w:t>
+        <w:t>Duke Biostatistics, 2020。</w:t>
       </w:r>
       <w:r>
         <w:t xml:space="preserve"> </w:t>
@@ -4338,7 +4338,7 @@
           <w:b w:val="0"/>
           <w:sz w:val="21"/>
         </w:rPr>
-        <w:t>DAC Trials, 2026. 证据等级：B。</w:t>
+        <w:t>DAC Trials, 2026。</w:t>
       </w:r>
       <w:r>
         <w:t xml:space="preserve"> </w:t>
@@ -4399,7 +4399,7 @@
           <w:b w:val="0"/>
           <w:sz w:val="21"/>
         </w:rPr>
-        <w:t>Trials / PMC, 2023. 证据等级：B。</w:t>
+        <w:t>Trials / PMC, 2023。</w:t>
       </w:r>
       <w:r>
         <w:t xml:space="preserve"> </w:t>
@@ -4460,7 +4460,7 @@
           <w:b w:val="0"/>
           <w:sz w:val="21"/>
         </w:rPr>
-        <w:t>ClinicalTrials.gov, 2026. 证据等级：B。</w:t>
+        <w:t>ClinicalTrials.gov, 2026。</w:t>
       </w:r>
       <w:r>
         <w:t xml:space="preserve"> </w:t>
@@ -4521,7 +4521,7 @@
           <w:b w:val="0"/>
           <w:sz w:val="21"/>
         </w:rPr>
-        <w:t>ClinicalTrials.gov, 2026. 证据等级：B。</w:t>
+        <w:t>ClinicalTrials.gov, 2026。</w:t>
       </w:r>
       <w:r>
         <w:t xml:space="preserve"> </w:t>
@@ -4582,7 +4582,7 @@
           <w:b w:val="0"/>
           <w:sz w:val="21"/>
         </w:rPr>
-        <w:t>ICH, 1995. 证据等级：A。</w:t>
+        <w:t>ICH, 1995。</w:t>
       </w:r>
       <w:r>
         <w:t xml:space="preserve"> </w:t>
@@ -4643,7 +4643,7 @@
           <w:b w:val="0"/>
           <w:sz w:val="21"/>
         </w:rPr>
-        <w:t>MRCT Center / NIH / FDA, 2022. 证据等级：B。</w:t>
+        <w:t>MRCT Center / NIH / FDA, 2022。</w:t>
       </w:r>
       <w:r>
         <w:t xml:space="preserve"> </w:t>
@@ -4704,7 +4704,7 @@
           <w:b w:val="0"/>
           <w:sz w:val="21"/>
         </w:rPr>
-        <w:t>National Institute on Aging, 2022. 证据等级：B。</w:t>
+        <w:t>National Institute on Aging, 2022。</w:t>
       </w:r>
       <w:r>
         <w:t xml:space="preserve"> </w:t>
@@ -4765,7 +4765,7 @@
           <w:b w:val="0"/>
           <w:sz w:val="21"/>
         </w:rPr>
-        <w:t>NYU Langone Health, 2018. 证据等级：B。</w:t>
+        <w:t>NYU Langone Health, 2018。</w:t>
       </w:r>
       <w:r>
         <w:t xml:space="preserve"> </w:t>
@@ -4826,7 +4826,7 @@
           <w:b w:val="0"/>
           <w:sz w:val="21"/>
         </w:rPr>
-        <w:t>PMC, 2010. 证据等级：B。</w:t>
+        <w:t>PMC, 2010。</w:t>
       </w:r>
       <w:r>
         <w:t xml:space="preserve"> </w:t>
@@ -4887,7 +4887,7 @@
           <w:b w:val="0"/>
           <w:sz w:val="21"/>
         </w:rPr>
-        <w:t>University at Buffalo CTSI, 2024. 证据等级：B。</w:t>
+        <w:t>University at Buffalo CTSI, 2024。</w:t>
       </w:r>
       <w:r>
         <w:t xml:space="preserve"> </w:t>
@@ -4948,7 +4948,7 @@
           <w:b w:val="0"/>
           <w:sz w:val="21"/>
         </w:rPr>
-        <w:t>Weill Cornell Medicine, 2019. 证据等级：B。</w:t>
+        <w:t>Weill Cornell Medicine, 2019。</w:t>
       </w:r>
       <w:r>
         <w:t xml:space="preserve"> </w:t>
@@ -5009,7 +5009,7 @@
           <w:b w:val="0"/>
           <w:sz w:val="21"/>
         </w:rPr>
-        <w:t>International Society for Clinical Biostatistics, 2016. 证据等级：B。</w:t>
+        <w:t>International Society for Clinical Biostatistics, 2016。</w:t>
       </w:r>
       <w:r>
         <w:t xml:space="preserve"> </w:t>
@@ -5070,7 +5070,7 @@
           <w:b w:val="0"/>
           <w:sz w:val="21"/>
         </w:rPr>
-        <w:t>National Institute on Aging, 2008. 证据等级：B。</w:t>
+        <w:t>National Institute on Aging, 2008。</w:t>
       </w:r>
       <w:r>
         <w:t xml:space="preserve"> </w:t>
@@ -5131,7 +5131,7 @@
           <w:b w:val="0"/>
           <w:sz w:val="21"/>
         </w:rPr>
-        <w:t>ClinicalTrials.gov, 2017. 证据等级：B。</w:t>
+        <w:t>ClinicalTrials.gov, 2017。</w:t>
       </w:r>
       <w:r>
         <w:t xml:space="preserve"> </w:t>
@@ -5192,7 +5192,7 @@
           <w:b w:val="0"/>
           <w:sz w:val="21"/>
         </w:rPr>
-        <w:t>UK Health Research Authority, 2026. 证据等级：B。</w:t>
+        <w:t>UK Health Research Authority, 2026。</w:t>
       </w:r>
       <w:r>
         <w:t xml:space="preserve"> </w:t>
@@ -5253,7 +5253,7 @@
           <w:b w:val="0"/>
           <w:sz w:val="21"/>
         </w:rPr>
-        <w:t>NIH IRBO, 2026. 证据等级：B。</w:t>
+        <w:t>NIH IRBO, 2026。</w:t>
       </w:r>
       <w:r>
         <w:t xml:space="preserve"> </w:t>
@@ -5314,7 +5314,7 @@
           <w:b w:val="0"/>
           <w:sz w:val="21"/>
         </w:rPr>
-        <w:t>NIH/NIMH, 当前官网. 证据等级：B。</w:t>
+        <w:t>NIH/NIMH, 当前官网。</w:t>
       </w:r>
       <w:r>
         <w:t xml:space="preserve"> </w:t>
@@ -5375,7 +5375,7 @@
           <w:b w:val="0"/>
           <w:sz w:val="21"/>
         </w:rPr>
-        <w:t>NIH/NIAID, 当前官网. 证据等级：B。</w:t>
+        <w:t>NIH/NIAID, 当前官网。</w:t>
       </w:r>
       <w:r>
         <w:t xml:space="preserve"> </w:t>
@@ -5436,7 +5436,7 @@
           <w:b w:val="0"/>
           <w:sz w:val="21"/>
         </w:rPr>
-        <w:t>UK Health Research Authority, 当前官网. 证据等级：B。</w:t>
+        <w:t>UK Health Research Authority, 当前官网。</w:t>
       </w:r>
       <w:r>
         <w:t xml:space="preserve"> </w:t>
@@ -5497,7 +5497,7 @@
           <w:b w:val="0"/>
           <w:sz w:val="21"/>
         </w:rPr>
-        <w:t>ICH, 2025. 证据等级：A。</w:t>
+        <w:t>ICH, 2025。</w:t>
       </w:r>
       <w:r>
         <w:t xml:space="preserve"> </w:t>
@@ -5558,7 +5558,7 @@
           <w:b w:val="0"/>
           <w:sz w:val="21"/>
         </w:rPr>
-        <w:t>NIH-FDA, 2021. 证据等级：B。</w:t>
+        <w:t>NIH-FDA, 2021。</w:t>
       </w:r>
       <w:r>
         <w:t xml:space="preserve"> </w:t>
@@ -5619,7 +5619,7 @@
           <w:b w:val="0"/>
           <w:sz w:val="21"/>
         </w:rPr>
-        <w:t>SPIRIT Statement, 2013. 证据等级：B。</w:t>
+        <w:t>SPIRIT Statement, 2013。</w:t>
       </w:r>
       <w:r>
         <w:t xml:space="preserve"> </w:t>
@@ -5680,7 +5680,7 @@
           <w:b w:val="0"/>
           <w:sz w:val="21"/>
         </w:rPr>
-        <w:t>CONSORT-SPIRIT, 2026. 证据等级：B。</w:t>
+        <w:t>CONSORT-SPIRIT, 2026。</w:t>
       </w:r>
       <w:r>
         <w:t xml:space="preserve"> </w:t>
@@ -5741,7 +5741,7 @@
           <w:b w:val="0"/>
           <w:sz w:val="21"/>
         </w:rPr>
-        <w:t>Boston University Medical Campus, 2023. 证据等级：B。</w:t>
+        <w:t>Boston University Medical Campus, 2023。</w:t>
       </w:r>
       <w:r>
         <w:t xml:space="preserve"> </w:t>
@@ -5802,7 +5802,7 @@
           <w:b w:val="0"/>
           <w:sz w:val="21"/>
         </w:rPr>
-        <w:t>Allina Health, 2026. 证据等级：B。</w:t>
+        <w:t>Allina Health, 2026。</w:t>
       </w:r>
       <w:r>
         <w:t xml:space="preserve"> </w:t>
@@ -5863,7 +5863,7 @@
           <w:b w:val="0"/>
           <w:sz w:val="21"/>
         </w:rPr>
-        <w:t>University of Alabama at Birmingham, 2026. 证据等级：B。</w:t>
+        <w:t>University of Alabama at Birmingham, 2026。</w:t>
       </w:r>
       <w:r>
         <w:t xml:space="preserve"> </w:t>
@@ -5924,7 +5924,7 @@
           <w:b w:val="0"/>
           <w:sz w:val="21"/>
         </w:rPr>
-        <w:t>University of Alabama at Birmingham, 2026. 证据等级：B。</w:t>
+        <w:t>University of Alabama at Birmingham, 2026。</w:t>
       </w:r>
       <w:r>
         <w:t xml:space="preserve"> </w:t>
@@ -5985,7 +5985,7 @@
           <w:b w:val="0"/>
           <w:sz w:val="21"/>
         </w:rPr>
-        <w:t>PMC, 2025. 证据等级：B。</w:t>
+        <w:t>PMC, 2025。</w:t>
       </w:r>
       <w:r>
         <w:t xml:space="preserve"> </w:t>
@@ -6046,7 +6046,7 @@
           <w:b w:val="0"/>
           <w:sz w:val="21"/>
         </w:rPr>
-        <w:t>PMC, 2025. 证据等级：B。</w:t>
+        <w:t>PMC, 2025。</w:t>
       </w:r>
       <w:r>
         <w:t xml:space="preserve"> </w:t>
@@ -6107,7 +6107,7 @@
           <w:b w:val="0"/>
           <w:sz w:val="21"/>
         </w:rPr>
-        <w:t>ClinicalTrials.gov, 2019. 证据等级：B。</w:t>
+        <w:t>ClinicalTrials.gov, 2019。</w:t>
       </w:r>
       <w:r>
         <w:t xml:space="preserve"> </w:t>
@@ -6168,7 +6168,7 @@
           <w:b w:val="0"/>
           <w:sz w:val="21"/>
         </w:rPr>
-        <w:t>The PROTEUS Consortium, 2023. 证据等级：B。</w:t>
+        <w:t>The PROTEUS Consortium, 2023。</w:t>
       </w:r>
       <w:r>
         <w:t xml:space="preserve"> </w:t>
@@ -6229,7 +6229,7 @@
           <w:b w:val="0"/>
           <w:sz w:val="21"/>
         </w:rPr>
-        <w:t>TransCelerate BioPharma, 2026. 证据等级：B。</w:t>
+        <w:t>TransCelerate BioPharma, 2026。</w:t>
       </w:r>
       <w:r>
         <w:t xml:space="preserve"> </w:t>
@@ -6290,7 +6290,7 @@
           <w:b w:val="0"/>
           <w:sz w:val="21"/>
         </w:rPr>
-        <w:t>NIH, 2024. 证据等级：B。</w:t>
+        <w:t>NIH, 2024。</w:t>
       </w:r>
       <w:r>
         <w:t xml:space="preserve"> </w:t>
@@ -6351,7 +6351,7 @@
           <w:b w:val="0"/>
           <w:sz w:val="21"/>
         </w:rPr>
-        <w:t>University of Wisconsin IRB, 2026. 证据等级：B。</w:t>
+        <w:t>University of Wisconsin IRB, 2026。</w:t>
       </w:r>
       <w:r>
         <w:t xml:space="preserve"> </w:t>
@@ -6412,7 +6412,7 @@
           <w:b w:val="0"/>
           <w:sz w:val="21"/>
         </w:rPr>
-        <w:t>MRCT Center, 2022. 证据等级：B。</w:t>
+        <w:t>MRCT Center, 2022。</w:t>
       </w:r>
       <w:r>
         <w:t xml:space="preserve"> </w:t>
@@ -6481,7 +6481,7 @@
           <w:b w:val="0"/>
           <w:sz w:val="21"/>
         </w:rPr>
-        <w:t>CDISC, 2026. 证据等级：A。</w:t>
+        <w:t>CDISC, 2026。</w:t>
       </w:r>
       <w:r>
         <w:t xml:space="preserve"> </w:t>
@@ -6542,7 +6542,7 @@
           <w:b w:val="0"/>
           <w:sz w:val="21"/>
         </w:rPr>
-        <w:t>CDISC, 2026. 证据等级：A。</w:t>
+        <w:t>CDISC, 2026。</w:t>
       </w:r>
       <w:r>
         <w:t xml:space="preserve"> </w:t>
@@ -6603,7 +6603,7 @@
           <w:b w:val="0"/>
           <w:sz w:val="21"/>
         </w:rPr>
-        <w:t>CDISC, 2026. 证据等级：A。</w:t>
+        <w:t>CDISC, 2026。</w:t>
       </w:r>
       <w:r>
         <w:t xml:space="preserve"> </w:t>
@@ -6664,7 +6664,7 @@
           <w:b w:val="0"/>
           <w:sz w:val="21"/>
         </w:rPr>
-        <w:t>TransCelerate BioPharma, 2026. 证据等级：A。</w:t>
+        <w:t>TransCelerate BioPharma, 2026。</w:t>
       </w:r>
       <w:r>
         <w:t xml:space="preserve"> </w:t>
@@ -6725,7 +6725,7 @@
           <w:b w:val="0"/>
           <w:sz w:val="21"/>
         </w:rPr>
-        <w:t>TransCelerate BioPharma, 2026. 证据等级：A。</w:t>
+        <w:t>TransCelerate BioPharma, 2026。</w:t>
       </w:r>
       <w:r>
         <w:t xml:space="preserve"> </w:t>
@@ -6786,7 +6786,7 @@
           <w:b w:val="0"/>
           <w:sz w:val="21"/>
         </w:rPr>
-        <w:t>TransCelerate BioPharma, 2016. 证据等级：A。</w:t>
+        <w:t>TransCelerate BioPharma, 2016。</w:t>
       </w:r>
       <w:r>
         <w:t xml:space="preserve"> </w:t>
@@ -6847,7 +6847,7 @@
           <w:b w:val="0"/>
           <w:sz w:val="21"/>
         </w:rPr>
-        <w:t>TransCelerate BioPharma, 2018. 证据等级：A。</w:t>
+        <w:t>TransCelerate BioPharma, 2018。</w:t>
       </w:r>
       <w:r>
         <w:t xml:space="preserve"> </w:t>
@@ -6908,7 +6908,7 @@
           <w:b w:val="0"/>
           <w:sz w:val="21"/>
         </w:rPr>
-        <w:t>CDISC, 2026. 证据等级：A。</w:t>
+        <w:t>CDISC, 2026。</w:t>
       </w:r>
       <w:r>
         <w:t xml:space="preserve"> </w:t>
@@ -6969,7 +6969,7 @@
           <w:b w:val="0"/>
           <w:sz w:val="21"/>
         </w:rPr>
-        <w:t>CDISC, 2026. 证据等级：A。</w:t>
+        <w:t>CDISC, 2026。</w:t>
       </w:r>
       <w:r>
         <w:t xml:space="preserve"> </w:t>
@@ -7030,7 +7030,7 @@
           <w:b w:val="0"/>
           <w:sz w:val="21"/>
         </w:rPr>
-        <w:t>CDISC, 2026. 证据等级：A。</w:t>
+        <w:t>CDISC, 2026。</w:t>
       </w:r>
       <w:r>
         <w:t xml:space="preserve"> </w:t>
@@ -7091,7 +7091,7 @@
           <w:b w:val="0"/>
           <w:sz w:val="21"/>
         </w:rPr>
-        <w:t>CDISC, 2026. 证据等级：A。</w:t>
+        <w:t>CDISC, 2026。</w:t>
       </w:r>
       <w:r>
         <w:t xml:space="preserve"> </w:t>
@@ -7152,7 +7152,7 @@
           <w:b w:val="0"/>
           <w:sz w:val="21"/>
         </w:rPr>
-        <w:t>PMC, 2024. 证据等级：A。</w:t>
+        <w:t>PMC, 2024。</w:t>
       </w:r>
       <w:r>
         <w:t xml:space="preserve"> </w:t>
@@ -7221,7 +7221,7 @@
           <w:b w:val="0"/>
           <w:sz w:val="21"/>
         </w:rPr>
-        <w:t>arXiv, 2024. 证据等级：C。</w:t>
+        <w:t>arXiv, 2024。</w:t>
       </w:r>
       <w:r>
         <w:t xml:space="preserve"> </w:t>
@@ -7282,7 +7282,7 @@
           <w:b w:val="0"/>
           <w:sz w:val="21"/>
         </w:rPr>
-        <w:t>arXiv, 2024. 证据等级：C。</w:t>
+        <w:t>arXiv, 2024。</w:t>
       </w:r>
       <w:r>
         <w:t xml:space="preserve"> </w:t>
@@ -7343,7 +7343,7 @@
           <w:b w:val="0"/>
           <w:sz w:val="21"/>
         </w:rPr>
-        <w:t>PMC, 2026. 证据等级：C。</w:t>
+        <w:t>PMC, 2026。</w:t>
       </w:r>
       <w:r>
         <w:t xml:space="preserve"> </w:t>
@@ -7404,7 +7404,7 @@
           <w:b w:val="0"/>
           <w:sz w:val="21"/>
         </w:rPr>
-        <w:t>PMC, 2025. 证据等级：C。</w:t>
+        <w:t>PMC, 2025。</w:t>
       </w:r>
       <w:r>
         <w:t xml:space="preserve"> </w:t>
@@ -7465,7 +7465,7 @@
           <w:b w:val="0"/>
           <w:sz w:val="21"/>
         </w:rPr>
-        <w:t>PHUSE / LexJansen, 2025. 证据等级：C。</w:t>
+        <w:t>PHUSE / LexJansen, 2025。</w:t>
       </w:r>
       <w:r>
         <w:t xml:space="preserve"> </w:t>
@@ -7526,7 +7526,7 @@
           <w:b w:val="0"/>
           <w:sz w:val="21"/>
         </w:rPr>
-        <w:t>JMIR, 2025. 证据等级：C。</w:t>
+        <w:t>JMIR, 2025。</w:t>
       </w:r>
       <w:r>
         <w:t xml:space="preserve"> </w:t>
@@ -7587,7 +7587,7 @@
           <w:b w:val="0"/>
           <w:sz w:val="21"/>
         </w:rPr>
-        <w:t>AlphaLifeSci, 2025. 证据等级：C。</w:t>
+        <w:t>AlphaLifeSci, 2025。</w:t>
       </w:r>
       <w:r>
         <w:t xml:space="preserve"> </w:t>
@@ -7648,7 +7648,7 @@
           <w:b w:val="0"/>
           <w:sz w:val="21"/>
         </w:rPr>
-        <w:t>European Medicines Agency, 2024. 证据等级：C。</w:t>
+        <w:t>European Medicines Agency, 2024。</w:t>
       </w:r>
       <w:r>
         <w:t xml:space="preserve"> </w:t>
@@ -7709,7 +7709,7 @@
           <w:b w:val="0"/>
           <w:sz w:val="21"/>
         </w:rPr>
-        <w:t>US FDA, 2025. 证据等级：C。</w:t>
+        <w:t>US FDA, 2025。</w:t>
       </w:r>
       <w:r>
         <w:t xml:space="preserve"> </w:t>
@@ -7770,7 +7770,7 @@
           <w:b w:val="0"/>
           <w:sz w:val="21"/>
         </w:rPr>
-        <w:t>World Health Organization, 2021. 证据等级：C。</w:t>
+        <w:t>World Health Organization, 2021。</w:t>
       </w:r>
       <w:r>
         <w:t xml:space="preserve"> </w:t>
@@ -7831,7 +7831,7 @@
           <w:b w:val="0"/>
           <w:sz w:val="21"/>
         </w:rPr>
-        <w:t>FDA Health Canada MHRA, 2021. 证据等级：C。</w:t>
+        <w:t>FDA Health Canada MHRA, 2021。</w:t>
       </w:r>
       <w:r>
         <w:t xml:space="preserve"> </w:t>
@@ -7892,7 +7892,7 @@
           <w:b w:val="0"/>
           <w:sz w:val="21"/>
         </w:rPr>
-        <w:t>WHO, 2021. 证据等级：C。</w:t>
+        <w:t>WHO, 2021。</w:t>
       </w:r>
       <w:r>
         <w:t xml:space="preserve"> </w:t>
@@ -7953,7 +7953,7 @@
           <w:b w:val="0"/>
           <w:sz w:val="21"/>
         </w:rPr>
-        <w:t>WHO, 2024. 证据等级：C。</w:t>
+        <w:t>WHO, 2024。</w:t>
       </w:r>
       <w:r>
         <w:t xml:space="preserve"> </w:t>
@@ -8014,7 +8014,7 @@
           <w:b w:val="0"/>
           <w:sz w:val="21"/>
         </w:rPr>
-        <w:t>Tufts CSDD, 2024. 证据等级：C。</w:t>
+        <w:t>Tufts CSDD, 2024。</w:t>
       </w:r>
       <w:r>
         <w:t xml:space="preserve"> </w:t>
@@ -8075,7 +8075,7 @@
           <w:b w:val="0"/>
           <w:sz w:val="21"/>
         </w:rPr>
-        <w:t>国家药监局药审中心, 2022. 证据等级：C。</w:t>
+        <w:t>国家药监局药审中心, 2022。</w:t>
       </w:r>
       <w:r>
         <w:t xml:space="preserve"> </w:t>
@@ -8136,7 +8136,7 @@
           <w:b w:val="0"/>
           <w:sz w:val="21"/>
         </w:rPr>
-        <w:t>FDA, 2025. 证据等级：C。</w:t>
+        <w:t>FDA, 2025。</w:t>
       </w:r>
       <w:r>
         <w:t xml:space="preserve"> </w:t>
@@ -8205,7 +8205,7 @@
           <w:b w:val="0"/>
           <w:sz w:val="21"/>
         </w:rPr>
-        <w:t>Applied Clinical Trials, 2026. 证据等级：D。</w:t>
+        <w:t>Applied Clinical Trials, 2026。</w:t>
       </w:r>
       <w:r>
         <w:t xml:space="preserve"> </w:t>
@@ -8266,7 +8266,7 @@
           <w:b w:val="0"/>
           <w:sz w:val="21"/>
         </w:rPr>
-        <w:t>ICON plc, 2025. 证据等级：D。</w:t>
+        <w:t>ICON plc, 2025。</w:t>
       </w:r>
       <w:r>
         <w:t xml:space="preserve"> </w:t>
@@ -8327,7 +8327,7 @@
           <w:b w:val="0"/>
           <w:sz w:val="21"/>
         </w:rPr>
-        <w:t>Applied Clinical Trials, 2026. 证据等级：D。</w:t>
+        <w:t>Applied Clinical Trials, 2026。</w:t>
       </w:r>
       <w:r>
         <w:t xml:space="preserve"> </w:t>
@@ -8388,7 +8388,7 @@
           <w:b w:val="0"/>
           <w:sz w:val="21"/>
         </w:rPr>
-        <w:t>Prelude EDC, 2026. 证据等级：D。</w:t>
+        <w:t>Prelude EDC, 2026。</w:t>
       </w:r>
       <w:r>
         <w:t xml:space="preserve"> </w:t>
@@ -8449,7 +8449,7 @@
           <w:b w:val="0"/>
           <w:sz w:val="21"/>
         </w:rPr>
-        <w:t>Docuvera, 2025. 证据等级：D。</w:t>
+        <w:t>Docuvera, 2025。</w:t>
       </w:r>
       <w:r>
         <w:t xml:space="preserve"> </w:t>
@@ -8510,7 +8510,7 @@
           <w:b w:val="0"/>
           <w:sz w:val="21"/>
         </w:rPr>
-        <w:t>Echo360, 2026. 证据等级：D。</w:t>
+        <w:t>Echo360, 2026。</w:t>
       </w:r>
       <w:r>
         <w:t xml:space="preserve"> </w:t>
@@ -8571,7 +8571,7 @@
           <w:b w:val="0"/>
           <w:sz w:val="21"/>
         </w:rPr>
-        <w:t>Deloitte, 2026. 证据等级：D。</w:t>
+        <w:t>Deloitte, 2026。</w:t>
       </w:r>
       <w:r>
         <w:t xml:space="preserve"> </w:t>
@@ -8632,7 +8632,7 @@
           <w:b w:val="0"/>
           <w:sz w:val="21"/>
         </w:rPr>
-        <w:t>AlphaLifeSci, 2026. 证据等级：D。</w:t>
+        <w:t>AlphaLifeSci, 2026。</w:t>
       </w:r>
       <w:r>
         <w:t xml:space="preserve"> </w:t>
@@ -8693,7 +8693,7 @@
           <w:b w:val="0"/>
           <w:sz w:val="21"/>
         </w:rPr>
-        <w:t>PMC, 2016. 证据等级：D。</w:t>
+        <w:t>PMC, 2016。</w:t>
       </w:r>
       <w:r>
         <w:t xml:space="preserve"> </w:t>
@@ -8754,7 +8754,7 @@
           <w:b w:val="0"/>
           <w:sz w:val="21"/>
         </w:rPr>
-        <w:t>Quanticate, 2026. 证据等级：D。</w:t>
+        <w:t>Quanticate, 2026。</w:t>
       </w:r>
       <w:r>
         <w:t xml:space="preserve"> </w:t>
@@ -8815,7 +8815,7 @@
           <w:b w:val="0"/>
           <w:sz w:val="21"/>
         </w:rPr>
-        <w:t>PMC, 2025. 证据等级：D。</w:t>
+        <w:t>PMC, 2025。</w:t>
       </w:r>
       <w:r>
         <w:t xml:space="preserve"> </w:t>
@@ -8876,7 +8876,7 @@
           <w:b w:val="0"/>
           <w:sz w:val="21"/>
         </w:rPr>
-        <w:t>IQVIA, 2026. 证据等级：D。</w:t>
+        <w:t>IQVIA, 2026。</w:t>
       </w:r>
       <w:r>
         <w:t xml:space="preserve"> </w:t>
@@ -8937,7 +8937,7 @@
           <w:b w:val="0"/>
           <w:sz w:val="21"/>
         </w:rPr>
-        <w:t>Precision for Medicine, 2025. 证据等级：D。</w:t>
+        <w:t>Precision for Medicine, 2025。</w:t>
       </w:r>
       <w:r>
         <w:t xml:space="preserve"> </w:t>
@@ -8998,7 +8998,7 @@
           <w:b w:val="0"/>
           <w:sz w:val="21"/>
         </w:rPr>
-        <w:t>CRIO, 2025. 证据等级：D。</w:t>
+        <w:t>CRIO, 2025。</w:t>
       </w:r>
       <w:r>
         <w:t xml:space="preserve"> </w:t>
@@ -9059,7 +9059,7 @@
           <w:b w:val="0"/>
           <w:sz w:val="21"/>
         </w:rPr>
-        <w:t>Veeva Systems, 2026. 证据等级：D。</w:t>
+        <w:t>Veeva Systems, 2026。</w:t>
       </w:r>
       <w:r>
         <w:t xml:space="preserve"> </w:t>
@@ -9120,7 +9120,7 @@
           <w:b w:val="0"/>
           <w:sz w:val="21"/>
         </w:rPr>
-        <w:t>Veeva Systems, 2026. 证据等级：D。</w:t>
+        <w:t>Veeva Systems, 2026。</w:t>
       </w:r>
       <w:r>
         <w:t xml:space="preserve"> </w:t>
@@ -9181,7 +9181,7 @@
           <w:b w:val="0"/>
           <w:sz w:val="21"/>
         </w:rPr>
-        <w:t>Veeva Vault Help, 2025. 证据等级：D。</w:t>
+        <w:t>Veeva Vault Help, 2025。</w:t>
       </w:r>
       <w:r>
         <w:t xml:space="preserve"> </w:t>
@@ -9242,7 +9242,7 @@
           <w:b w:val="0"/>
           <w:sz w:val="21"/>
         </w:rPr>
-        <w:t>Oracle, 2021. 证据等级：D。</w:t>
+        <w:t>Oracle, 2021。</w:t>
       </w:r>
       <w:r>
         <w:t xml:space="preserve"> </w:t>
@@ -9303,7 +9303,7 @@
           <w:b w:val="0"/>
           <w:sz w:val="21"/>
         </w:rPr>
-        <w:t>Oracle, 2026. 证据等级：D。</w:t>
+        <w:t>Oracle, 2026。</w:t>
       </w:r>
       <w:r>
         <w:t xml:space="preserve"> </w:t>
@@ -9364,7 +9364,7 @@
           <w:b w:val="0"/>
           <w:sz w:val="21"/>
         </w:rPr>
-        <w:t>Oracle Documentation, 2026. 证据等级：D。</w:t>
+        <w:t>Oracle Documentation, 2026。</w:t>
       </w:r>
       <w:r>
         <w:t xml:space="preserve"> </w:t>
@@ -9425,7 +9425,7 @@
           <w:b w:val="0"/>
           <w:sz w:val="21"/>
         </w:rPr>
-        <w:t>Medidata, 2026. 证据等级：D。</w:t>
+        <w:t>Medidata, 2026。</w:t>
       </w:r>
       <w:r>
         <w:t xml:space="preserve"> </w:t>
@@ -9486,7 +9486,7 @@
           <w:b w:val="0"/>
           <w:sz w:val="21"/>
         </w:rPr>
-        <w:t>Medidata, 2026. 证据等级：D。</w:t>
+        <w:t>Medidata, 2026。</w:t>
       </w:r>
       <w:r>
         <w:t xml:space="preserve"> </w:t>
@@ -9547,7 +9547,7 @@
           <w:b w:val="0"/>
           <w:sz w:val="21"/>
         </w:rPr>
-        <w:t>Medidata, 2025. 证据等级：D。</w:t>
+        <w:t>Medidata, 2025。</w:t>
       </w:r>
       <w:r>
         <w:t xml:space="preserve"> </w:t>
@@ -9608,7 +9608,7 @@
           <w:b w:val="0"/>
           <w:sz w:val="21"/>
         </w:rPr>
-        <w:t>Medidata and Dassault Systemes, 2024. 证据等级：D。</w:t>
+        <w:t>Medidata and Dassault Systemes, 2024。</w:t>
       </w:r>
       <w:r>
         <w:t xml:space="preserve"> </w:t>
@@ -9669,7 +9669,7 @@
           <w:b w:val="0"/>
           <w:sz w:val="21"/>
         </w:rPr>
-        <w:t>Kitsa, 2026. 证据等级：D。</w:t>
+        <w:t>Kitsa, 2026。</w:t>
       </w:r>
       <w:r>
         <w:t xml:space="preserve"> </w:t>
@@ -9730,7 +9730,7 @@
           <w:b w:val="0"/>
           <w:sz w:val="21"/>
         </w:rPr>
-        <w:t>Tech Mahindra and Kitsa, 2026. 证据等级：D。</w:t>
+        <w:t>Tech Mahindra and Kitsa, 2026。</w:t>
       </w:r>
       <w:r>
         <w:t xml:space="preserve"> </w:t>
@@ -9791,7 +9791,7 @@
           <w:b w:val="0"/>
           <w:sz w:val="21"/>
         </w:rPr>
-        <w:t>Clinion, 2025. 证据等级：D。</w:t>
+        <w:t>Clinion, 2025。</w:t>
       </w:r>
       <w:r>
         <w:t xml:space="preserve"> </w:t>
@@ -9852,7 +9852,7 @@
           <w:b w:val="0"/>
           <w:sz w:val="21"/>
         </w:rPr>
-        <w:t>Kitsa, 2026. 证据等级：D。</w:t>
+        <w:t>Kitsa, 2026。</w:t>
       </w:r>
       <w:r>
         <w:t xml:space="preserve"> </w:t>
@@ -9913,7 +9913,7 @@
           <w:b w:val="0"/>
           <w:sz w:val="21"/>
         </w:rPr>
-        <w:t>CARA Life Sciences, 2026. 证据等级：D。</w:t>
+        <w:t>CARA Life Sciences, 2026。</w:t>
       </w:r>
       <w:r>
         <w:t xml:space="preserve"> </w:t>
@@ -9974,7 +9974,7 @@
           <w:b w:val="0"/>
           <w:sz w:val="21"/>
         </w:rPr>
-        <w:t>TrialAssure, 2026. 证据等级：D。</w:t>
+        <w:t>TrialAssure, 2026。</w:t>
       </w:r>
       <w:r>
         <w:t xml:space="preserve"> </w:t>
@@ -10035,7 +10035,7 @@
           <w:b w:val="0"/>
           <w:sz w:val="21"/>
         </w:rPr>
-        <w:t>TrialAssure, 2026. 证据等级：D。</w:t>
+        <w:t>TrialAssure, 2026。</w:t>
       </w:r>
       <w:r>
         <w:t xml:space="preserve"> </w:t>
@@ -10096,7 +10096,7 @@
           <w:b w:val="0"/>
           <w:sz w:val="21"/>
         </w:rPr>
-        <w:t>Narrativa, 2026. 证据等级：C。</w:t>
+        <w:t>Narrativa, 2026。</w:t>
       </w:r>
       <w:r>
         <w:t xml:space="preserve"> </w:t>
@@ -10157,7 +10157,7 @@
           <w:b w:val="0"/>
           <w:sz w:val="21"/>
         </w:rPr>
-        <w:t>Paperguide, 2026. 证据等级：D。</w:t>
+        <w:t>Paperguide, 2026。</w:t>
       </w:r>
       <w:r>
         <w:t xml:space="preserve"> </w:t>
@@ -10218,7 +10218,7 @@
           <w:b w:val="0"/>
           <w:sz w:val="21"/>
         </w:rPr>
-        <w:t>arXiv, 2024. 证据等级：D。</w:t>
+        <w:t>arXiv, 2024。</w:t>
       </w:r>
       <w:r>
         <w:t xml:space="preserve"> </w:t>
@@ -10279,7 +10279,7 @@
           <w:b w:val="0"/>
           <w:sz w:val="21"/>
         </w:rPr>
-        <w:t>Certara, 2026. 证据等级：D。</w:t>
+        <w:t>Certara, 2026。</w:t>
       </w:r>
       <w:r>
         <w:t xml:space="preserve"> </w:t>
@@ -10340,7 +10340,7 @@
           <w:b w:val="0"/>
           <w:sz w:val="21"/>
         </w:rPr>
-        <w:t>Certara, 2023. 证据等级：D。</w:t>
+        <w:t>Certara, 2023。</w:t>
       </w:r>
       <w:r>
         <w:t xml:space="preserve"> </w:t>
@@ -10401,7 +10401,7 @@
           <w:b w:val="0"/>
           <w:sz w:val="21"/>
         </w:rPr>
-        <w:t>Certara, 2026. 证据等级：D。</w:t>
+        <w:t>Certara, 2026。</w:t>
       </w:r>
       <w:r>
         <w:t xml:space="preserve"> </w:t>
@@ -10462,7 +10462,7 @@
           <w:b w:val="0"/>
           <w:sz w:val="21"/>
         </w:rPr>
-        <w:t>Yseop, 2026. 证据等级：D。</w:t>
+        <w:t>Yseop, 2026。</w:t>
       </w:r>
       <w:r>
         <w:t xml:space="preserve"> </w:t>
@@ -10523,7 +10523,7 @@
           <w:b w:val="0"/>
           <w:sz w:val="21"/>
         </w:rPr>
-        <w:t>Yseop, 2026. 证据等级：D。</w:t>
+        <w:t>Yseop, 2026。</w:t>
       </w:r>
       <w:r>
         <w:t xml:space="preserve"> </w:t>
@@ -10584,7 +10584,7 @@
           <w:b w:val="0"/>
           <w:sz w:val="21"/>
         </w:rPr>
-        <w:t>Yseop, 2026. 证据等级：D。</w:t>
+        <w:t>Yseop, 2026。</w:t>
       </w:r>
       <w:r>
         <w:t xml:space="preserve"> </w:t>
@@ -10645,7 +10645,7 @@
           <w:b w:val="0"/>
           <w:sz w:val="21"/>
         </w:rPr>
-        <w:t>Montrium, 2026. 证据等级：D。</w:t>
+        <w:t>Montrium, 2026。</w:t>
       </w:r>
       <w:r>
         <w:t xml:space="preserve"> </w:t>
@@ -10706,7 +10706,7 @@
           <w:b w:val="0"/>
           <w:sz w:val="21"/>
         </w:rPr>
-        <w:t>Montrium, 2026. 证据等级：D。</w:t>
+        <w:t>Montrium, 2026。</w:t>
       </w:r>
       <w:r>
         <w:t xml:space="preserve"> </w:t>
@@ -10767,7 +10767,7 @@
           <w:b w:val="0"/>
           <w:sz w:val="21"/>
         </w:rPr>
-        <w:t>MasterControl, 2026. 证据等级：D。</w:t>
+        <w:t>MasterControl, 2026。</w:t>
       </w:r>
       <w:r>
         <w:t xml:space="preserve"> </w:t>
@@ -10828,7 +10828,7 @@
           <w:b w:val="0"/>
           <w:sz w:val="21"/>
         </w:rPr>
-        <w:t>MasterControl, 2026. 证据等级：D。</w:t>
+        <w:t>MasterControl, 2026。</w:t>
       </w:r>
       <w:r>
         <w:t xml:space="preserve"> </w:t>
@@ -10889,7 +10889,7 @@
           <w:b w:val="0"/>
           <w:sz w:val="21"/>
         </w:rPr>
-        <w:t>HumanTrue, 2026. 证据等级：D。</w:t>
+        <w:t>HumanTrue, 2026。</w:t>
       </w:r>
       <w:r>
         <w:t xml:space="preserve"> </w:t>
@@ -10950,7 +10950,7 @@
           <w:b w:val="0"/>
           <w:sz w:val="21"/>
         </w:rPr>
-        <w:t>Cori Clinical, 2026. 证据等级：D。</w:t>
+        <w:t>Cori Clinical, 2026。</w:t>
       </w:r>
       <w:r>
         <w:t xml:space="preserve"> </w:t>
@@ -11011,7 +11011,7 @@
           <w:b w:val="0"/>
           <w:sz w:val="21"/>
         </w:rPr>
-        <w:t>Cori Clinical, 2026. 证据等级：D。</w:t>
+        <w:t>Cori Clinical, 2026。</w:t>
       </w:r>
       <w:r>
         <w:t xml:space="preserve"> </w:t>
@@ -11072,7 +11072,7 @@
           <w:b w:val="0"/>
           <w:sz w:val="21"/>
         </w:rPr>
-        <w:t>Cori Clinical, 2026. 证据等级：D。</w:t>
+        <w:t>Cori Clinical, 2026。</w:t>
       </w:r>
       <w:r>
         <w:t xml:space="preserve"> </w:t>
@@ -11133,7 +11133,7 @@
           <w:b w:val="0"/>
           <w:sz w:val="21"/>
         </w:rPr>
-        <w:t>Clinials, 2026. 证据等级：D。</w:t>
+        <w:t>Clinials, 2026。</w:t>
       </w:r>
       <w:r>
         <w:t xml:space="preserve"> </w:t>
@@ -11194,7 +11194,7 @@
           <w:b w:val="0"/>
           <w:sz w:val="21"/>
         </w:rPr>
-        <w:t>Clinials, 2026. 证据等级：D。</w:t>
+        <w:t>Clinials, 2026。</w:t>
       </w:r>
       <w:r>
         <w:t xml:space="preserve"> </w:t>
@@ -11255,7 +11255,7 @@
           <w:b w:val="0"/>
           <w:sz w:val="21"/>
         </w:rPr>
-        <w:t>Taimei Technology, 2026. 证据等级：D。</w:t>
+        <w:t>Taimei Technology, 2026。</w:t>
       </w:r>
       <w:r>
         <w:t xml:space="preserve"> </w:t>
@@ -11316,7 +11316,7 @@
           <w:b w:val="0"/>
           <w:sz w:val="21"/>
         </w:rPr>
-        <w:t>Taimei Technology, 2026. 证据等级：D。</w:t>
+        <w:t>Taimei Technology, 2026。</w:t>
       </w:r>
       <w:r>
         <w:t xml:space="preserve"> </w:t>
@@ -11377,7 +11377,7 @@
           <w:b w:val="0"/>
           <w:sz w:val="21"/>
         </w:rPr>
-        <w:t>Evinova, 2026. 证据等级：D。</w:t>
+        <w:t>Evinova, 2026。</w:t>
       </w:r>
       <w:r>
         <w:t xml:space="preserve"> </w:t>
@@ -11438,7 +11438,7 @@
           <w:b w:val="0"/>
           <w:sz w:val="21"/>
         </w:rPr>
-        <w:t>IQVIA, 2026. 证据等级：D。</w:t>
+        <w:t>IQVIA, 2026。</w:t>
       </w:r>
       <w:r>
         <w:t xml:space="preserve"> </w:t>
@@ -11499,7 +11499,7 @@
           <w:b w:val="0"/>
           <w:sz w:val="21"/>
         </w:rPr>
-        <w:t>Medidata, 2026. 证据等级：D。</w:t>
+        <w:t>Medidata, 2026。</w:t>
       </w:r>
       <w:r>
         <w:t xml:space="preserve"> </w:t>
@@ -11560,7 +11560,7 @@
           <w:b w:val="0"/>
           <w:sz w:val="21"/>
         </w:rPr>
-        <w:t>Medidata, 2026. 证据等级：D。</w:t>
+        <w:t>Medidata, 2026。</w:t>
       </w:r>
       <w:r>
         <w:t xml:space="preserve"> </w:t>
@@ -11629,7 +11629,7 @@
           <w:b w:val="0"/>
           <w:sz w:val="21"/>
         </w:rPr>
-        <w:t>Feishu Aily, 2026. 证据等级：D。</w:t>
+        <w:t>Feishu Aily, 2026。</w:t>
       </w:r>
       <w:r>
         <w:t xml:space="preserve"> </w:t>
@@ -11690,7 +11690,7 @@
           <w:b w:val="0"/>
           <w:sz w:val="21"/>
         </w:rPr>
-        <w:t>Feishu, 2026. 证据等级：D。</w:t>
+        <w:t>Feishu, 2026。</w:t>
       </w:r>
       <w:r>
         <w:t xml:space="preserve"> </w:t>
@@ -11751,7 +11751,7 @@
           <w:b w:val="0"/>
           <w:sz w:val="21"/>
         </w:rPr>
-        <w:t>Feishu, 2026. 证据等级：D。</w:t>
+        <w:t>Feishu, 2026。</w:t>
       </w:r>
       <w:r>
         <w:t xml:space="preserve"> </w:t>
@@ -11812,7 +11812,7 @@
           <w:b w:val="0"/>
           <w:sz w:val="21"/>
         </w:rPr>
-        <w:t>Feishu, 2026. 证据等级：D。</w:t>
+        <w:t>Feishu, 2026。</w:t>
       </w:r>
       <w:r>
         <w:t xml:space="preserve"> </w:t>
@@ -11873,7 +11873,7 @@
           <w:b w:val="0"/>
           <w:sz w:val="21"/>
         </w:rPr>
-        <w:t>Feishu, 2026. 证据等级：D。</w:t>
+        <w:t>Feishu, 2026。</w:t>
       </w:r>
       <w:r>
         <w:t xml:space="preserve"> </w:t>
@@ -11934,7 +11934,7 @@
           <w:b w:val="0"/>
           <w:sz w:val="21"/>
         </w:rPr>
-        <w:t>Feishu, 2026. 证据等级：D。</w:t>
+        <w:t>Feishu, 2026。</w:t>
       </w:r>
       <w:r>
         <w:t xml:space="preserve"> </w:t>
@@ -11995,7 +11995,7 @@
           <w:b w:val="0"/>
           <w:sz w:val="21"/>
         </w:rPr>
-        <w:t>Feishu, 2026. 证据等级：D。</w:t>
+        <w:t>Feishu, 2026。</w:t>
       </w:r>
       <w:r>
         <w:t xml:space="preserve"> </w:t>
@@ -12056,7 +12056,7 @@
           <w:b w:val="0"/>
           <w:sz w:val="21"/>
         </w:rPr>
-        <w:t>Feishu, 2026. 证据等级：D。</w:t>
+        <w:t>Feishu, 2026。</w:t>
       </w:r>
       <w:r>
         <w:t xml:space="preserve"> </w:t>
@@ -12117,7 +12117,7 @@
           <w:b w:val="0"/>
           <w:sz w:val="21"/>
         </w:rPr>
-        <w:t>Feishu, 2026. 证据等级：D。</w:t>
+        <w:t>Feishu, 2026。</w:t>
       </w:r>
       <w:r>
         <w:t xml:space="preserve"> </w:t>
@@ -12178,7 +12178,7 @@
           <w:b w:val="0"/>
           <w:sz w:val="21"/>
         </w:rPr>
-        <w:t>Feishu, 2026. 证据等级：D。</w:t>
+        <w:t>Feishu, 2026。</w:t>
       </w:r>
       <w:r>
         <w:t xml:space="preserve"> </w:t>
@@ -12247,7 +12247,7 @@
           <w:b w:val="0"/>
           <w:sz w:val="21"/>
         </w:rPr>
-        <w:t>TrialCompiler project team, 2026. 证据等级：INTERNAL。</w:t>
+        <w:t>TrialCompiler project team, 2026。</w:t>
       </w:r>
     </w:p>
     <w:p>
@@ -12296,7 +12296,7 @@
           <w:b w:val="0"/>
           <w:sz w:val="21"/>
         </w:rPr>
-        <w:t>TrialCompiler project team, 2026. 证据等级：INTERNAL。</w:t>
+        <w:t>TrialCompiler project team, 2026。</w:t>
       </w:r>
     </w:p>
     <w:p>
@@ -12345,7 +12345,7 @@
           <w:b w:val="0"/>
           <w:sz w:val="21"/>
         </w:rPr>
-        <w:t>TrialCompiler project team, 2026. 证据等级：INTERNAL。</w:t>
+        <w:t>TrialCompiler project team, 2026。</w:t>
       </w:r>
     </w:p>
     <w:p>
@@ -12394,7 +12394,7 @@
           <w:b w:val="0"/>
           <w:sz w:val="21"/>
         </w:rPr>
-        <w:t>TrialCompiler project team, 2026. 证据等级：INTERNAL。</w:t>
+        <w:t>TrialCompiler project team, 2026。</w:t>
       </w:r>
     </w:p>
     <w:p>
@@ -12443,7 +12443,7 @@
           <w:b w:val="0"/>
           <w:sz w:val="21"/>
         </w:rPr>
-        <w:t>TrialCompiler project team, 2026. 证据等级：INTERNAL。</w:t>
+        <w:t>TrialCompiler project team, 2026。</w:t>
       </w:r>
     </w:p>
     <w:p>
@@ -12492,7 +12492,7 @@
           <w:b w:val="0"/>
           <w:sz w:val="21"/>
         </w:rPr>
-        <w:t>TrialCompiler project team, 2026. 证据等级：INTERNAL。</w:t>
+        <w:t>TrialCompiler project team, 2026。</w:t>
       </w:r>
     </w:p>
     <w:p>
@@ -12541,7 +12541,7 @@
           <w:b w:val="0"/>
           <w:sz w:val="21"/>
         </w:rPr>
-        <w:t>TrialCompiler project team, 2026. 证据等级：INTERNAL。</w:t>
+        <w:t>TrialCompiler project team, 2026。</w:t>
       </w:r>
     </w:p>
     <w:p>
@@ -12590,7 +12590,7 @@
           <w:b w:val="0"/>
           <w:sz w:val="21"/>
         </w:rPr>
-        <w:t>TrialCompiler project team, 2026. 证据等级：INTERNAL。</w:t>
+        <w:t>TrialCompiler project team, 2026。</w:t>
       </w:r>
     </w:p>
     <w:p>
@@ -12639,7 +12639,7 @@
           <w:b w:val="0"/>
           <w:sz w:val="21"/>
         </w:rPr>
-        <w:t>TrialCompiler project team, 2026. 证据等级：INTERNAL。</w:t>
+        <w:t>TrialCompiler project team, 2026。</w:t>
       </w:r>
     </w:p>
     <w:p>
@@ -12688,7 +12688,7 @@
           <w:b w:val="0"/>
           <w:sz w:val="21"/>
         </w:rPr>
-        <w:t>TrialCompiler project team, 2026. 证据等级：INTERNAL。</w:t>
+        <w:t>TrialCompiler project team, 2026。</w:t>
       </w:r>
     </w:p>
     <w:p>

</xml_diff>

<commit_message>
Finalize report wording and bibliography links
</commit_message>
<xml_diff>
--- a/docs/TrialCompiler_项目完整参考文献.docx
+++ b/docs/TrialCompiler_项目完整参考文献.docx
@@ -124,7 +124,8 @@
         <w:t>NMPA and National Health Commission, 2020。</w:t>
       </w:r>
       <w:r>
-        <w:t xml:space="preserve"> </w:t>
+        <w:br/>
+        <w:t>链接：</w:t>
       </w:r>
       <w:hyperlink r:id="rId11">
         <w:r>
@@ -132,7 +133,7 @@
             <w:color w:val="2E74B5"/>
             <w:u w:val="single"/>
           </w:rPr>
-          <w:t>原始来源</w:t>
+          <w:t>https://www.nmpa.gov.cn/xxgk/fgwj/xzhgfxwj/20200426162401243.html</w:t>
         </w:r>
       </w:hyperlink>
     </w:p>
@@ -185,7 +186,8 @@
         <w:t>NMPA and NHC and NATCM and NCDC, 2026。</w:t>
       </w:r>
       <w:r>
-        <w:t xml:space="preserve"> </w:t>
+        <w:br/>
+        <w:t>链接：</w:t>
       </w:r>
       <w:hyperlink r:id="rId12">
         <w:r>
@@ -193,7 +195,7 @@
             <w:color w:val="2E74B5"/>
             <w:u w:val="single"/>
           </w:rPr>
-          <w:t>原始来源</w:t>
+          <w:t>https://www.nmpa.gov.cn/xxgk/fgwj/xzhgfxwj/20260608103856150.html</w:t>
         </w:r>
       </w:hyperlink>
     </w:p>
@@ -246,7 +248,8 @@
         <w:t>CDE, 2021。</w:t>
       </w:r>
       <w:r>
-        <w:t xml:space="preserve"> </w:t>
+        <w:br/>
+        <w:t>链接：</w:t>
       </w:r>
       <w:hyperlink r:id="rId13">
         <w:r>
@@ -254,7 +257,7 @@
             <w:color w:val="2E74B5"/>
             <w:u w:val="single"/>
           </w:rPr>
-          <w:t>原始来源</w:t>
+          <w:t>https://www.cde.org.cn/main/att/download/7da62eab6c2d93cb350048a1f507d348</w:t>
         </w:r>
       </w:hyperlink>
     </w:p>
@@ -307,7 +310,8 @@
         <w:t>CDE, 2022。</w:t>
       </w:r>
       <w:r>
-        <w:t xml:space="preserve"> </w:t>
+        <w:br/>
+        <w:t>链接：</w:t>
       </w:r>
       <w:hyperlink r:id="rId14">
         <w:r>
@@ -315,7 +319,7 @@
             <w:color w:val="2E74B5"/>
             <w:u w:val="single"/>
           </w:rPr>
-          <w:t>原始来源</w:t>
+          <w:t>https://pharmwyp.com/posts/56814/3.%E4%B8%B4%E5%BA%8A%E8%AF%95%E9%AA%8C%E5%AE%9E%E6%96%BD/3.4%E8%AF%95%E9%AA%8C%E7%AC%A6%E5%90%88%E6%80%A7/20220623_CDE_%E5%85%B3%E4%BA%8E%E5%8F%91%E5%B8%83%E3%80%8A%E8%8D%AF%E7%89%A9%E4%B8%B4%E5%BA%8A%E8%AF%95%E9%AA%8C%E6%9C%9F%E9%97%B4%E6%96%B9%E6%A1%88%E5%8F%98%E6%9B%B4%E6%8A%80%E6%9C%AF%E6%8C%87%E5%AF%BC%E5%8E%9F%E5%88%99%EF%BC%88%E8%AF%95%E8%A1%8C%EF%BC%89%E3%80%8B%E7%9A%84%E9%80%9A%E5%91%8A%EF%BC%882022%E5%B9%B4%E7%AC%AC34%E5%8F%B7%EF%BC%89.pdf</w:t>
         </w:r>
       </w:hyperlink>
     </w:p>
@@ -368,7 +372,8 @@
         <w:t>中国食品药品网, 2022。</w:t>
       </w:r>
       <w:r>
-        <w:t xml:space="preserve"> </w:t>
+        <w:br/>
+        <w:t>链接：</w:t>
       </w:r>
       <w:hyperlink r:id="rId15">
         <w:r>
@@ -376,7 +381,7 @@
             <w:color w:val="2E74B5"/>
             <w:u w:val="single"/>
           </w:rPr>
-          <w:t>原始来源</w:t>
+          <w:t>https://m.cnpharm.com/c/2022-06-23/829152.shtml</w:t>
         </w:r>
       </w:hyperlink>
     </w:p>
@@ -429,7 +434,8 @@
         <w:t>中国食品药品网, 2022。</w:t>
       </w:r>
       <w:r>
-        <w:t xml:space="preserve"> </w:t>
+        <w:br/>
+        <w:t>链接：</w:t>
       </w:r>
       <w:hyperlink r:id="rId16">
         <w:r>
@@ -437,7 +443,7 @@
             <w:color w:val="2E74B5"/>
             <w:u w:val="single"/>
           </w:rPr>
-          <w:t>原始来源</w:t>
+          <w:t>https://m.cnpharm.com/c/2022-01-04/814382.shtml</w:t>
         </w:r>
       </w:hyperlink>
     </w:p>
@@ -490,7 +496,8 @@
         <w:t>US FDA, 2026。</w:t>
       </w:r>
       <w:r>
-        <w:t xml:space="preserve"> </w:t>
+        <w:br/>
+        <w:t>链接：</w:t>
       </w:r>
       <w:hyperlink r:id="rId17">
         <w:r>
@@ -498,7 +505,7 @@
             <w:color w:val="2E74B5"/>
             <w:u w:val="single"/>
           </w:rPr>
-          <w:t>原始来源</w:t>
+          <w:t>https://www.fda.gov/about-fda/center-drug-evaluation-and-research-cder/artificial-intelligence-drug-development</w:t>
         </w:r>
       </w:hyperlink>
     </w:p>
@@ -551,7 +558,8 @@
         <w:t>ICH, 2025。</w:t>
       </w:r>
       <w:r>
-        <w:t xml:space="preserve"> </w:t>
+        <w:br/>
+        <w:t>链接：</w:t>
       </w:r>
       <w:hyperlink r:id="rId18">
         <w:r>
@@ -559,7 +567,7 @@
             <w:color w:val="2E74B5"/>
             <w:u w:val="single"/>
           </w:rPr>
-          <w:t>原始来源</w:t>
+          <w:t>https://database.ich.org/sites/default/files/ICH_E6%28R3%29_Step4_FinalGuideline_2025_0106_ErrorCorrections_2025_1024.pdf</w:t>
         </w:r>
       </w:hyperlink>
     </w:p>
@@ -612,7 +620,8 @@
         <w:t>ICH, 2026。</w:t>
       </w:r>
       <w:r>
-        <w:t xml:space="preserve"> </w:t>
+        <w:br/>
+        <w:t>链接：</w:t>
       </w:r>
       <w:hyperlink r:id="rId19">
         <w:r>
@@ -620,7 +629,7 @@
             <w:color w:val="2E74B5"/>
             <w:u w:val="single"/>
           </w:rPr>
-          <w:t>原始来源</w:t>
+          <w:t>https://database.ich.org/sites/default/files/ICH_E6%28R3%29_Annex%202_Guideline_Step%204_2026_0603_0.pdf</w:t>
         </w:r>
       </w:hyperlink>
     </w:p>
@@ -673,7 +682,8 @@
         <w:t>ICH, 2021。</w:t>
       </w:r>
       <w:r>
-        <w:t xml:space="preserve"> </w:t>
+        <w:br/>
+        <w:t>链接：</w:t>
       </w:r>
       <w:hyperlink r:id="rId20">
         <w:r>
@@ -681,7 +691,7 @@
             <w:color w:val="2E74B5"/>
             <w:u w:val="single"/>
           </w:rPr>
-          <w:t>原始来源</w:t>
+          <w:t>https://database.ich.org/sites/default/files/ICH_E8-R1_Guideline_Step4_2021_1006.pdf</w:t>
         </w:r>
       </w:hyperlink>
     </w:p>
@@ -734,7 +744,8 @@
         <w:t>ICH, 1994。</w:t>
       </w:r>
       <w:r>
-        <w:t xml:space="preserve"> </w:t>
+        <w:br/>
+        <w:t>链接：</w:t>
       </w:r>
       <w:hyperlink r:id="rId21">
         <w:r>
@@ -742,7 +753,7 @@
             <w:color w:val="2E74B5"/>
             <w:u w:val="single"/>
           </w:rPr>
-          <w:t>原始来源</w:t>
+          <w:t>https://database.ich.org/sites/default/files/E2A_Guideline.pdf</w:t>
         </w:r>
       </w:hyperlink>
     </w:p>
@@ -795,7 +806,8 @@
         <w:t>WHO, 2024。</w:t>
       </w:r>
       <w:r>
-        <w:t xml:space="preserve"> </w:t>
+        <w:br/>
+        <w:t>链接：</w:t>
       </w:r>
       <w:hyperlink r:id="rId22">
         <w:r>
@@ -803,7 +815,7 @@
             <w:color w:val="2E74B5"/>
             <w:u w:val="single"/>
           </w:rPr>
-          <w:t>原始来源</w:t>
+          <w:t>https://iris.who.int/bitstream/handle/10665/378782/9789240097711-eng.pdf</w:t>
         </w:r>
       </w:hyperlink>
     </w:p>
@@ -856,7 +868,8 @@
         <w:t>WMA, 2024。</w:t>
       </w:r>
       <w:r>
-        <w:t xml:space="preserve"> </w:t>
+        <w:br/>
+        <w:t>链接：</w:t>
       </w:r>
       <w:hyperlink r:id="rId23">
         <w:r>
@@ -864,7 +877,7 @@
             <w:color w:val="2E74B5"/>
             <w:u w:val="single"/>
           </w:rPr>
-          <w:t>原始来源</w:t>
+          <w:t>https://www.wma.net/wp-content/uploads/2024/11/HB-E-Version-2024.pdf</w:t>
         </w:r>
       </w:hyperlink>
     </w:p>
@@ -917,7 +930,8 @@
         <w:t>CIOMS/WHO, 2016。</w:t>
       </w:r>
       <w:r>
-        <w:t xml:space="preserve"> </w:t>
+        <w:br/>
+        <w:t>链接：</w:t>
       </w:r>
       <w:hyperlink r:id="rId24">
         <w:r>
@@ -925,7 +939,7 @@
             <w:color w:val="2E74B5"/>
             <w:u w:val="single"/>
           </w:rPr>
-          <w:t>原始来源</w:t>
+          <w:t>https://cioms.ch/wp-content/uploads/2017/01/WEB-CIOMS-EthicalGuidelines.pdf</w:t>
         </w:r>
       </w:hyperlink>
     </w:p>
@@ -978,7 +992,8 @@
         <w:t>国家药监局等四部门, 2026。</w:t>
       </w:r>
       <w:r>
-        <w:t xml:space="preserve"> </w:t>
+        <w:br/>
+        <w:t>链接：</w:t>
       </w:r>
       <w:hyperlink r:id="rId25">
         <w:r>
@@ -986,7 +1001,7 @@
             <w:color w:val="2E74B5"/>
             <w:u w:val="single"/>
           </w:rPr>
-          <w:t>原始来源</w:t>
+          <w:t>https://yjj.sh.gov.cn/cmsres/01/019e5e2d868c470f9927c3a9672fc59c/203167cf5e796696423edf05cb8c3174.doc</w:t>
         </w:r>
       </w:hyperlink>
     </w:p>
@@ -1039,7 +1054,8 @@
         <w:t>国家药监局等四部门, 2026。</w:t>
       </w:r>
       <w:r>
-        <w:t xml:space="preserve"> </w:t>
+        <w:br/>
+        <w:t>链接：</w:t>
       </w:r>
       <w:hyperlink r:id="rId26">
         <w:r>
@@ -1047,7 +1063,7 @@
             <w:color w:val="2E74B5"/>
             <w:u w:val="single"/>
           </w:rPr>
-          <w:t>原始来源</w:t>
+          <w:t>https://yjj.sh.gov.cn/cmsres/6c/6c38f69ae6a942e684221c90927db3c1/b6bd1d09af642f8f1107a80d3e0a3f59.doc</w:t>
         </w:r>
       </w:hyperlink>
     </w:p>
@@ -1100,7 +1116,8 @@
         <w:t>SPIRIT/CONSORT Group; BMJ, 2025。</w:t>
       </w:r>
       <w:r>
-        <w:t xml:space="preserve"> </w:t>
+        <w:br/>
+        <w:t>链接：</w:t>
       </w:r>
       <w:hyperlink r:id="rId27">
         <w:r>
@@ -1108,7 +1125,7 @@
             <w:color w:val="2E74B5"/>
             <w:u w:val="single"/>
           </w:rPr>
-          <w:t>原始来源</w:t>
+          <w:t>https://www.bmj.com/content/389/bmj-2024-081477.full.pdf</w:t>
         </w:r>
       </w:hyperlink>
     </w:p>
@@ -1161,7 +1178,8 @@
         <w:t>SPIRIT/CONSORT Group; BMJ, 2025。</w:t>
       </w:r>
       <w:r>
-        <w:t xml:space="preserve"> </w:t>
+        <w:br/>
+        <w:t>链接：</w:t>
       </w:r>
       <w:hyperlink r:id="rId28">
         <w:r>
@@ -1169,7 +1187,7 @@
             <w:color w:val="2E74B5"/>
             <w:u w:val="single"/>
           </w:rPr>
-          <w:t>原始来源</w:t>
+          <w:t>https://www.bmj.com/content/bmj/389/bmj-2024-081660.full.pdf</w:t>
         </w:r>
       </w:hyperlink>
     </w:p>
@@ -1222,7 +1240,8 @@
         <w:t>SPIRIT/CONSORT Group; BMJ, 2025。</w:t>
       </w:r>
       <w:r>
-        <w:t xml:space="preserve"> </w:t>
+        <w:br/>
+        <w:t>链接：</w:t>
       </w:r>
       <w:hyperlink r:id="rId29">
         <w:r>
@@ -1230,7 +1249,7 @@
             <w:color w:val="2E74B5"/>
             <w:u w:val="single"/>
           </w:rPr>
-          <w:t>原始来源</w:t>
+          <w:t>https://www.bmj.com/content/389/bmj-2024-081123.full.pdf</w:t>
         </w:r>
       </w:hyperlink>
     </w:p>
@@ -1283,7 +1302,8 @@
         <w:t>SPIRIT/CONSORT Group; BMJ, 2025。</w:t>
       </w:r>
       <w:r>
-        <w:t xml:space="preserve"> </w:t>
+        <w:br/>
+        <w:t>链接：</w:t>
       </w:r>
       <w:hyperlink r:id="rId30">
         <w:r>
@@ -1291,7 +1311,7 @@
             <w:color w:val="2E74B5"/>
             <w:u w:val="single"/>
           </w:rPr>
-          <w:t>原始来源</w:t>
+          <w:t>https://www.bmj.com/content/389/bmj-2024-081124.full.pdf</w:t>
         </w:r>
       </w:hyperlink>
     </w:p>
@@ -1344,7 +1364,8 @@
         <w:t>FDA, 2019。</w:t>
       </w:r>
       <w:r>
-        <w:t xml:space="preserve"> </w:t>
+        <w:br/>
+        <w:t>链接：</w:t>
       </w:r>
       <w:hyperlink r:id="rId31">
         <w:r>
@@ -1352,7 +1373,7 @@
             <w:color w:val="2E74B5"/>
             <w:u w:val="single"/>
           </w:rPr>
-          <w:t>原始来源</w:t>
+          <w:t>https://www.fda.gov/media/78495/download</w:t>
         </w:r>
       </w:hyperlink>
     </w:p>
@@ -1405,7 +1426,8 @@
         <w:t>FDA, 2019。</w:t>
       </w:r>
       <w:r>
-        <w:t xml:space="preserve"> </w:t>
+        <w:br/>
+        <w:t>链接：</w:t>
       </w:r>
       <w:hyperlink r:id="rId32">
         <w:r>
@@ -1413,7 +1435,7 @@
             <w:color w:val="2E74B5"/>
             <w:u w:val="single"/>
           </w:rPr>
-          <w:t>原始来源</w:t>
+          <w:t>https://www.fda.gov/media/121320/download</w:t>
         </w:r>
       </w:hyperlink>
     </w:p>
@@ -1466,7 +1488,8 @@
         <w:t>FDA, 2023。</w:t>
       </w:r>
       <w:r>
-        <w:t xml:space="preserve"> </w:t>
+        <w:br/>
+        <w:t>链接：</w:t>
       </w:r>
       <w:hyperlink r:id="rId33">
         <w:r>
@@ -1474,7 +1497,7 @@
             <w:color w:val="2E74B5"/>
             <w:u w:val="single"/>
           </w:rPr>
-          <w:t>原始来源</w:t>
+          <w:t>https://www.fda.gov/media/168507/download</w:t>
         </w:r>
       </w:hyperlink>
     </w:p>
@@ -1527,7 +1550,8 @@
         <w:t>FDA, 2024。</w:t>
       </w:r>
       <w:r>
-        <w:t xml:space="preserve"> </w:t>
+        <w:br/>
+        <w:t>链接：</w:t>
       </w:r>
       <w:hyperlink r:id="rId34">
         <w:r>
@@ -1535,7 +1559,7 @@
             <w:color w:val="2E74B5"/>
             <w:u w:val="single"/>
           </w:rPr>
-          <w:t>原始来源</w:t>
+          <w:t>https://www.fda.gov/media/167696/download</w:t>
         </w:r>
       </w:hyperlink>
     </w:p>
@@ -1588,7 +1612,8 @@
         <w:t>FDA, 2024。</w:t>
       </w:r>
       <w:r>
-        <w:t xml:space="preserve"> </w:t>
+        <w:br/>
+        <w:t>链接：</w:t>
       </w:r>
       <w:hyperlink r:id="rId35">
         <w:r>
@@ -1596,7 +1621,7 @@
             <w:color w:val="2E74B5"/>
             <w:u w:val="single"/>
           </w:rPr>
-          <w:t>原始来源</w:t>
+          <w:t>https://www.fda.gov/media/184745/download</w:t>
         </w:r>
       </w:hyperlink>
     </w:p>
@@ -1649,7 +1674,8 @@
         <w:t>FDA, 2026。</w:t>
       </w:r>
       <w:r>
-        <w:t xml:space="preserve"> </w:t>
+        <w:br/>
+        <w:t>链接：</w:t>
       </w:r>
       <w:hyperlink r:id="rId36">
         <w:r>
@@ -1657,7 +1683,7 @@
             <w:color w:val="2E74B5"/>
             <w:u w:val="single"/>
           </w:rPr>
-          <w:t>原始来源</w:t>
+          <w:t>https://www.fda.gov/media/190505/download</w:t>
         </w:r>
       </w:hyperlink>
     </w:p>
@@ -1710,7 +1736,8 @@
         <w:t>ICH, 2000。</w:t>
       </w:r>
       <w:r>
-        <w:t xml:space="preserve"> </w:t>
+        <w:br/>
+        <w:t>链接：</w:t>
       </w:r>
       <w:hyperlink r:id="rId37">
         <w:r>
@@ -1718,7 +1745,7 @@
             <w:color w:val="2E74B5"/>
             <w:u w:val="single"/>
           </w:rPr>
-          <w:t>原始来源</w:t>
+          <w:t>https://database.ich.org/sites/default/files/E10_Guideline.pdf</w:t>
         </w:r>
       </w:hyperlink>
     </w:p>
@@ -1771,7 +1798,8 @@
         <w:t>ICH, 1994。</w:t>
       </w:r>
       <w:r>
-        <w:t xml:space="preserve"> </w:t>
+        <w:br/>
+        <w:t>链接：</w:t>
       </w:r>
       <w:hyperlink r:id="rId38">
         <w:r>
@@ -1779,7 +1807,7 @@
             <w:color w:val="2E74B5"/>
             <w:u w:val="single"/>
           </w:rPr>
-          <w:t>原始来源</w:t>
+          <w:t>https://database.ich.org/sites/default/files/E4_Guideline.pdf</w:t>
         </w:r>
       </w:hyperlink>
     </w:p>
@@ -1832,7 +1860,8 @@
         <w:t>ICH, 1998。</w:t>
       </w:r>
       <w:r>
-        <w:t xml:space="preserve"> </w:t>
+        <w:br/>
+        <w:t>链接：</w:t>
       </w:r>
       <w:hyperlink r:id="rId39">
         <w:r>
@@ -1840,7 +1869,7 @@
             <w:color w:val="2E74B5"/>
             <w:u w:val="single"/>
           </w:rPr>
-          <w:t>原始来源</w:t>
+          <w:t>https://database.ich.org/sites/default/files/E5_R1__Guideline.pdf</w:t>
         </w:r>
       </w:hyperlink>
     </w:p>
@@ -1893,7 +1922,8 @@
         <w:t>ICH, 1993。</w:t>
       </w:r>
       <w:r>
-        <w:t xml:space="preserve"> </w:t>
+        <w:br/>
+        <w:t>链接：</w:t>
       </w:r>
       <w:hyperlink r:id="rId40">
         <w:r>
@@ -1901,7 +1931,7 @@
             <w:color w:val="2E74B5"/>
             <w:u w:val="single"/>
           </w:rPr>
-          <w:t>原始来源</w:t>
+          <w:t>https://database.ich.org/sites/default/files/E7_Guideline.pdf</w:t>
         </w:r>
       </w:hyperlink>
     </w:p>
@@ -1954,7 +1984,8 @@
         <w:t>ICH, 2017。</w:t>
       </w:r>
       <w:r>
-        <w:t xml:space="preserve"> </w:t>
+        <w:br/>
+        <w:t>链接：</w:t>
       </w:r>
       <w:hyperlink r:id="rId41">
         <w:r>
@@ -1962,7 +1993,7 @@
             <w:color w:val="2E74B5"/>
             <w:u w:val="single"/>
           </w:rPr>
-          <w:t>原始来源</w:t>
+          <w:t>https://database.ich.org/sites/default/files/E11_R1_Guideline.pdf</w:t>
         </w:r>
       </w:hyperlink>
     </w:p>
@@ -2015,7 +2046,8 @@
         <w:t>ICH, 2024。</w:t>
       </w:r>
       <w:r>
-        <w:t xml:space="preserve"> </w:t>
+        <w:br/>
+        <w:t>链接：</w:t>
       </w:r>
       <w:hyperlink r:id="rId42">
         <w:r>
@@ -2023,7 +2055,7 @@
             <w:color w:val="2E74B5"/>
             <w:u w:val="single"/>
           </w:rPr>
-          <w:t>原始来源</w:t>
+          <w:t>https://database.ich.org/sites/default/files/ICH_E11A_Guideline_Step4_2024_0821.pdf</w:t>
         </w:r>
       </w:hyperlink>
     </w:p>
@@ -2076,7 +2108,8 @@
         <w:t>ICH, 2017。</w:t>
       </w:r>
       <w:r>
-        <w:t xml:space="preserve"> </w:t>
+        <w:br/>
+        <w:t>链接：</w:t>
       </w:r>
       <w:hyperlink r:id="rId43">
         <w:r>
@@ -2084,7 +2117,7 @@
             <w:color w:val="2E74B5"/>
             <w:u w:val="single"/>
           </w:rPr>
-          <w:t>原始来源</w:t>
+          <w:t>https://database.ich.org/sites/default/files/E18_Guideline.pdf</w:t>
         </w:r>
       </w:hyperlink>
     </w:p>
@@ -2137,7 +2170,8 @@
         <w:t>ICH, 2022。</w:t>
       </w:r>
       <w:r>
-        <w:t xml:space="preserve"> </w:t>
+        <w:br/>
+        <w:t>链接：</w:t>
       </w:r>
       <w:hyperlink r:id="rId44">
         <w:r>
@@ -2145,7 +2179,7 @@
             <w:color w:val="2E74B5"/>
             <w:u w:val="single"/>
           </w:rPr>
-          <w:t>原始来源</w:t>
+          <w:t>https://database.ich.org/sites/default/files/ICH_E19_Guideline_Step4_2022_0826_0.pdf</w:t>
         </w:r>
       </w:hyperlink>
     </w:p>
@@ -2198,7 +2232,8 @@
         <w:t>ICH, 2025。</w:t>
       </w:r>
       <w:r>
-        <w:t xml:space="preserve"> </w:t>
+        <w:br/>
+        <w:t>链接：</w:t>
       </w:r>
       <w:hyperlink r:id="rId45">
         <w:r>
@@ -2206,7 +2241,7 @@
             <w:color w:val="2E74B5"/>
             <w:u w:val="single"/>
           </w:rPr>
-          <w:t>原始来源</w:t>
+          <w:t>https://database.ich.org/sites/default/files/ICH_E2D%28R1%29_Step4_FinalGuideline_2025_0819.pdf</w:t>
         </w:r>
       </w:hyperlink>
     </w:p>
@@ -2259,7 +2294,8 @@
         <w:t>ICH, 2025。</w:t>
       </w:r>
       <w:r>
-        <w:t xml:space="preserve"> </w:t>
+        <w:br/>
+        <w:t>链接：</w:t>
       </w:r>
       <w:hyperlink r:id="rId46">
         <w:r>
@@ -2267,7 +2303,7 @@
             <w:color w:val="2E74B5"/>
             <w:u w:val="single"/>
           </w:rPr>
-          <w:t>原始来源</w:t>
+          <w:t>https://database.ich.org/sites/default/files/ICH_Step4_M11_Final_Guideline_2025_1119.pdf</w:t>
         </w:r>
       </w:hyperlink>
     </w:p>
@@ -2320,7 +2356,8 @@
         <w:t>ICH, 2026。</w:t>
       </w:r>
       <w:r>
-        <w:t xml:space="preserve"> </w:t>
+        <w:br/>
+        <w:t>链接：</w:t>
       </w:r>
       <w:hyperlink r:id="rId47">
         <w:r>
@@ -2328,7 +2365,7 @@
             <w:color w:val="2E74B5"/>
             <w:u w:val="single"/>
           </w:rPr>
-          <w:t>原始来源</w:t>
+          <w:t>https://database.ich.org/sites/default/files/ICH%20M11%20Explainer_May2026.pdf</w:t>
         </w:r>
       </w:hyperlink>
     </w:p>
@@ -2381,7 +2418,8 @@
         <w:t>US FDA, 2026。</w:t>
       </w:r>
       <w:r>
-        <w:t xml:space="preserve"> </w:t>
+        <w:br/>
+        <w:t>链接：</w:t>
       </w:r>
       <w:hyperlink r:id="rId48">
         <w:r>
@@ -2389,7 +2427,7 @@
             <w:color w:val="2E74B5"/>
             <w:u w:val="single"/>
           </w:rPr>
-          <w:t>原始来源</w:t>
+          <w:t>https://www.fda.gov/regulatory-information/search-fda-guidance-documents/m11-clinical-electronic-structured-harmonised-protocol</w:t>
         </w:r>
       </w:hyperlink>
     </w:p>
@@ -2442,7 +2480,8 @@
         <w:t>European Medicines Agency, 2023。</w:t>
       </w:r>
       <w:r>
-        <w:t xml:space="preserve"> </w:t>
+        <w:br/>
+        <w:t>链接：</w:t>
       </w:r>
       <w:hyperlink r:id="rId49">
         <w:r>
@@ -2450,7 +2489,7 @@
             <w:color w:val="2E74B5"/>
             <w:u w:val="single"/>
           </w:rPr>
-          <w:t>原始来源</w:t>
+          <w:t>https://www.ema.europa.eu/en/ich-m11-guideline-clinical-study-protocol-template-technical-specifications-scientific-guideline</w:t>
         </w:r>
       </w:hyperlink>
     </w:p>
@@ -2503,7 +2542,8 @@
         <w:t>SPIRIT Group, 2013。</w:t>
       </w:r>
       <w:r>
-        <w:t xml:space="preserve"> </w:t>
+        <w:br/>
+        <w:t>链接：</w:t>
       </w:r>
       <w:hyperlink r:id="rId50">
         <w:r>
@@ -2511,7 +2551,7 @@
             <w:color w:val="2E74B5"/>
             <w:u w:val="single"/>
           </w:rPr>
-          <w:t>原始来源</w:t>
+          <w:t>https://www.spirit-statement.org/wp-content/uploads/2013/01/SPIRIT-Checklist-download-8Jan13.pdf</w:t>
         </w:r>
       </w:hyperlink>
     </w:p>
@@ -2564,7 +2604,8 @@
         <w:t>SPIRIT Group, 2013。</w:t>
       </w:r>
       <w:r>
-        <w:t xml:space="preserve"> </w:t>
+        <w:br/>
+        <w:t>链接：</w:t>
       </w:r>
       <w:hyperlink r:id="rId51">
         <w:r>
@@ -2572,7 +2613,7 @@
             <w:color w:val="2E74B5"/>
             <w:u w:val="single"/>
           </w:rPr>
-          <w:t>原始来源</w:t>
+          <w:t>https://www.spirit-statement.org/wp-content/uploads/SPIRIT_2013_Statement_FR_final.pdf</w:t>
         </w:r>
       </w:hyperlink>
     </w:p>
@@ -2625,7 +2666,8 @@
         <w:t>SPIRIT Group, 2026。</w:t>
       </w:r>
       <w:r>
-        <w:t xml:space="preserve"> </w:t>
+        <w:br/>
+        <w:t>链接：</w:t>
       </w:r>
       <w:hyperlink r:id="rId52">
         <w:r>
@@ -2633,7 +2675,7 @@
             <w:color w:val="2E74B5"/>
             <w:u w:val="single"/>
           </w:rPr>
-          <w:t>原始来源</w:t>
+          <w:t>https://www.spirit-statement.org/</w:t>
         </w:r>
       </w:hyperlink>
     </w:p>
@@ -2686,7 +2728,8 @@
         <w:t>BMJ and SPIRIT-AI Group, 2020。</w:t>
       </w:r>
       <w:r>
-        <w:t xml:space="preserve"> </w:t>
+        <w:br/>
+        <w:t>链接：</w:t>
       </w:r>
       <w:hyperlink r:id="rId53">
         <w:r>
@@ -2694,7 +2737,7 @@
             <w:color w:val="2E74B5"/>
             <w:u w:val="single"/>
           </w:rPr>
-          <w:t>原始来源</w:t>
+          <w:t>https://pmc.ncbi.nlm.nih.gov/articles/PMC8212701/</w:t>
         </w:r>
       </w:hyperlink>
     </w:p>
@@ -2747,7 +2790,8 @@
         <w:t>BMC Medicine, 2010。</w:t>
       </w:r>
       <w:r>
-        <w:t xml:space="preserve"> </w:t>
+        <w:br/>
+        <w:t>链接：</w:t>
       </w:r>
       <w:hyperlink r:id="rId54">
         <w:r>
@@ -2755,7 +2799,7 @@
             <w:color w:val="2E74B5"/>
             <w:u w:val="single"/>
           </w:rPr>
-          <w:t>原始来源</w:t>
+          <w:t>https://link.springer.com/article/10.1186/1741-7015-8-18</w:t>
         </w:r>
       </w:hyperlink>
     </w:p>
@@ -2808,7 +2852,8 @@
         <w:t>ClinicalTrials.gov and NLM, 2026。</w:t>
       </w:r>
       <w:r>
-        <w:t xml:space="preserve"> </w:t>
+        <w:br/>
+        <w:t>链接：</w:t>
       </w:r>
       <w:hyperlink r:id="rId55">
         <w:r>
@@ -2816,7 +2861,7 @@
             <w:color w:val="2E74B5"/>
             <w:u w:val="single"/>
           </w:rPr>
-          <w:t>原始来源</w:t>
+          <w:t>https://clinicaltrials.gov/policy/protocol-definitions</w:t>
         </w:r>
       </w:hyperlink>
     </w:p>
@@ -2869,7 +2914,8 @@
         <w:t>ICH, 2025。</w:t>
       </w:r>
       <w:r>
-        <w:t xml:space="preserve"> </w:t>
+        <w:br/>
+        <w:t>链接：</w:t>
       </w:r>
       <w:hyperlink r:id="rId56">
         <w:r>
@@ -2877,7 +2923,7 @@
             <w:color w:val="2E74B5"/>
             <w:u w:val="single"/>
           </w:rPr>
-          <w:t>原始来源</w:t>
+          <w:t>https://database.ich.org/sites/default/files/ICH_E6%28R3%29_Step4_FinalGuideline_2025_0106.pdf</w:t>
         </w:r>
       </w:hyperlink>
     </w:p>
@@ -2930,7 +2976,8 @@
         <w:t>ICH, 2021。</w:t>
       </w:r>
       <w:r>
-        <w:t xml:space="preserve"> </w:t>
+        <w:br/>
+        <w:t>链接：</w:t>
       </w:r>
       <w:hyperlink r:id="rId57">
         <w:r>
@@ -2938,7 +2985,7 @@
             <w:color w:val="2E74B5"/>
             <w:u w:val="single"/>
           </w:rPr>
-          <w:t>原始来源</w:t>
+          <w:t>https://database.ich.org/sites/default/files/E8-R1_Guideline_Step4_2021_1006.pdf</w:t>
         </w:r>
       </w:hyperlink>
     </w:p>
@@ -2991,7 +3038,8 @@
         <w:t>ICH, 1998。</w:t>
       </w:r>
       <w:r>
-        <w:t xml:space="preserve"> </w:t>
+        <w:br/>
+        <w:t>链接：</w:t>
       </w:r>
       <w:hyperlink r:id="rId58">
         <w:r>
@@ -2999,7 +3047,7 @@
             <w:color w:val="2E74B5"/>
             <w:u w:val="single"/>
           </w:rPr>
-          <w:t>原始来源</w:t>
+          <w:t>https://database.ich.org/sites/default/files/E9_Guideline.pdf</w:t>
         </w:r>
       </w:hyperlink>
     </w:p>
@@ -3052,7 +3100,8 @@
         <w:t>ICH, 2019。</w:t>
       </w:r>
       <w:r>
-        <w:t xml:space="preserve"> </w:t>
+        <w:br/>
+        <w:t>链接：</w:t>
       </w:r>
       <w:hyperlink r:id="rId59">
         <w:r>
@@ -3060,7 +3109,7 @@
             <w:color w:val="2E74B5"/>
             <w:u w:val="single"/>
           </w:rPr>
-          <w:t>原始来源</w:t>
+          <w:t>https://database.ich.org/sites/default/files/E9-R1_Step4_Guideline_2019_1203.pdf</w:t>
         </w:r>
       </w:hyperlink>
     </w:p>
@@ -3113,7 +3162,8 @@
         <w:t>PLoS Clinical Trials via PMC, 2007。</w:t>
       </w:r>
       <w:r>
-        <w:t xml:space="preserve"> </w:t>
+        <w:br/>
+        <w:t>链接：</w:t>
       </w:r>
       <w:hyperlink r:id="rId60">
         <w:r>
@@ -3121,7 +3171,7 @@
             <w:color w:val="2E74B5"/>
             <w:u w:val="single"/>
           </w:rPr>
-          <w:t>原始来源</w:t>
+          <w:t>https://pmc.ncbi.nlm.nih.gov/articles/PMC1852589/</w:t>
         </w:r>
       </w:hyperlink>
     </w:p>
@@ -3174,7 +3224,8 @@
         <w:t>PMC, 2022。</w:t>
       </w:r>
       <w:r>
-        <w:t xml:space="preserve"> </w:t>
+        <w:br/>
+        <w:t>链接：</w:t>
       </w:r>
       <w:hyperlink r:id="rId61">
         <w:r>
@@ -3182,7 +3233,7 @@
             <w:color w:val="2E74B5"/>
             <w:u w:val="single"/>
           </w:rPr>
-          <w:t>原始来源</w:t>
+          <w:t>https://pmc.ncbi.nlm.nih.gov/articles/PMC9811046/</w:t>
         </w:r>
       </w:hyperlink>
     </w:p>
@@ -3235,7 +3286,8 @@
         <w:t>PubMed, 2016。</w:t>
       </w:r>
       <w:r>
-        <w:t xml:space="preserve"> </w:t>
+        <w:br/>
+        <w:t>链接：</w:t>
       </w:r>
       <w:hyperlink r:id="rId62">
         <w:r>
@@ -3243,7 +3295,7 @@
             <w:color w:val="2E74B5"/>
             <w:u w:val="single"/>
           </w:rPr>
-          <w:t>原始来源</w:t>
+          <w:t>https://pubmed.ncbi.nlm.nih.gov/30227022/</w:t>
         </w:r>
       </w:hyperlink>
     </w:p>
@@ -3296,7 +3348,8 @@
         <w:t>SAGE Journals, 2016。</w:t>
       </w:r>
       <w:r>
-        <w:t xml:space="preserve"> </w:t>
+        <w:br/>
+        <w:t>链接：</w:t>
       </w:r>
       <w:hyperlink r:id="rId63">
         <w:r>
@@ -3304,7 +3357,7 @@
             <w:color w:val="2E74B5"/>
             <w:u w:val="single"/>
           </w:rPr>
-          <w:t>原始来源</w:t>
+          <w:t>https://journals.sagepub.com/doi/10.1177/2168479016632271</w:t>
         </w:r>
       </w:hyperlink>
     </w:p>
@@ -3357,7 +3410,8 @@
         <w:t>PubMed, 2024。</w:t>
       </w:r>
       <w:r>
-        <w:t xml:space="preserve"> </w:t>
+        <w:br/>
+        <w:t>链接：</w:t>
       </w:r>
       <w:hyperlink r:id="rId64">
         <w:r>
@@ -3365,7 +3419,7 @@
             <w:color w:val="2E74B5"/>
             <w:u w:val="single"/>
           </w:rPr>
-          <w:t>原始来源</w:t>
+          <w:t>https://pubmed.ncbi.nlm.nih.gov/38438658/</w:t>
         </w:r>
       </w:hyperlink>
     </w:p>
@@ -3418,7 +3472,8 @@
         <w:t>PMC, 2025。</w:t>
       </w:r>
       <w:r>
-        <w:t xml:space="preserve"> </w:t>
+        <w:br/>
+        <w:t>链接：</w:t>
       </w:r>
       <w:hyperlink r:id="rId65">
         <w:r>
@@ -3426,7 +3481,7 @@
             <w:color w:val="2E74B5"/>
             <w:u w:val="single"/>
           </w:rPr>
-          <w:t>原始来源</w:t>
+          <w:t>https://pmc.ncbi.nlm.nih.gov/articles/PMC12395810/</w:t>
         </w:r>
       </w:hyperlink>
     </w:p>
@@ -3479,7 +3534,8 @@
         <w:t>US FDA, 2026。</w:t>
       </w:r>
       <w:r>
-        <w:t xml:space="preserve"> </w:t>
+        <w:br/>
+        <w:t>链接：</w:t>
       </w:r>
       <w:hyperlink r:id="rId66">
         <w:r>
@@ -3487,7 +3543,7 @@
             <w:color w:val="2E74B5"/>
             <w:u w:val="single"/>
           </w:rPr>
-          <w:t>原始来源</w:t>
+          <w:t>https://www.fda.gov/science-research/clinical-trials-and-human-subject-protection/ich-guidance-documents</w:t>
         </w:r>
       </w:hyperlink>
     </w:p>
@@ -3540,7 +3596,8 @@
         <w:t>US FDA, 2023。</w:t>
       </w:r>
       <w:r>
-        <w:t xml:space="preserve"> </w:t>
+        <w:br/>
+        <w:t>链接：</w:t>
       </w:r>
       <w:hyperlink r:id="rId67">
         <w:r>
@@ -3548,7 +3605,7 @@
             <w:color w:val="2E74B5"/>
             <w:u w:val="single"/>
           </w:rPr>
-          <w:t>原始来源</w:t>
+          <w:t>https://www.fda.gov/downloads/regulatoryinformation/guidances/ucm405006.pdf</w:t>
         </w:r>
       </w:hyperlink>
     </w:p>
@@ -3601,7 +3658,8 @@
         <w:t>HHS OHRP, 2026。</w:t>
       </w:r>
       <w:r>
-        <w:t xml:space="preserve"> </w:t>
+        <w:br/>
+        <w:t>链接：</w:t>
       </w:r>
       <w:hyperlink r:id="rId68">
         <w:r>
@@ -3609,7 +3667,7 @@
             <w:color w:val="2E74B5"/>
             <w:u w:val="single"/>
           </w:rPr>
-          <w:t>原始来源</w:t>
+          <w:t>https://www.hhs.gov/ohrp/regulations-and-policy/guidance/checklists/index.html</w:t>
         </w:r>
       </w:hyperlink>
     </w:p>
@@ -3662,7 +3720,8 @@
         <w:t>US FDA / HHS, 2016。</w:t>
       </w:r>
       <w:r>
-        <w:t xml:space="preserve"> </w:t>
+        <w:br/>
+        <w:t>链接：</w:t>
       </w:r>
       <w:hyperlink r:id="rId69">
         <w:r>
@@ -3670,7 +3729,7 @@
             <w:color w:val="2E74B5"/>
             <w:u w:val="single"/>
           </w:rPr>
-          <w:t>原始来源</w:t>
+          <w:t>https://www.fda.gov/regulatory-information/search-fda-guidance-documents/use-electronic-informed-consent-clinical-investigations-questions-and-answers</w:t>
         </w:r>
       </w:hyperlink>
     </w:p>
@@ -3723,7 +3782,8 @@
         <w:t>ICH, 2017。</w:t>
       </w:r>
       <w:r>
-        <w:t xml:space="preserve"> </w:t>
+        <w:br/>
+        <w:t>链接：</w:t>
       </w:r>
       <w:hyperlink r:id="rId70">
         <w:r>
@@ -3731,7 +3791,7 @@
             <w:color w:val="2E74B5"/>
             <w:u w:val="single"/>
           </w:rPr>
-          <w:t>原始来源</w:t>
+          <w:t>https://database.ich.org/sites/default/files/E17EWG_Step4_2017_1116.pdf</w:t>
         </w:r>
       </w:hyperlink>
     </w:p>
@@ -3784,7 +3844,8 @@
         <w:t>EMA, 2026。</w:t>
       </w:r>
       <w:r>
-        <w:t xml:space="preserve"> </w:t>
+        <w:br/>
+        <w:t>链接：</w:t>
       </w:r>
       <w:hyperlink r:id="rId71">
         <w:r>
@@ -3792,7 +3853,7 @@
             <w:color w:val="2E74B5"/>
             <w:u w:val="single"/>
           </w:rPr>
-          <w:t>原始来源</w:t>
+          <w:t>https://www.ema.europa.eu/en/ich-guideline-e17-general-principles-planning-design-multi-regional-clinical-trials-scientific-guideline</w:t>
         </w:r>
       </w:hyperlink>
     </w:p>
@@ -3845,7 +3906,8 @@
         <w:t>US FDA, 2018。</w:t>
       </w:r>
       <w:r>
-        <w:t xml:space="preserve"> </w:t>
+        <w:br/>
+        <w:t>链接：</w:t>
       </w:r>
       <w:hyperlink r:id="rId72">
         <w:r>
@@ -3853,7 +3915,7 @@
             <w:color w:val="2E74B5"/>
             <w:u w:val="single"/>
           </w:rPr>
-          <w:t>原始来源</w:t>
+          <w:t>https://www.fda.gov/regulatory-information/search-fda-guidance-documents/e17-general-principles-planning-and-design-multi-regional-clinical-trials</w:t>
         </w:r>
       </w:hyperlink>
     </w:p>
@@ -3914,7 +3976,8 @@
         <w:t>WHO, 2026。</w:t>
       </w:r>
       <w:r>
-        <w:t xml:space="preserve"> </w:t>
+        <w:br/>
+        <w:t>链接：</w:t>
       </w:r>
       <w:hyperlink r:id="rId73">
         <w:r>
@@ -3922,7 +3985,7 @@
             <w:color w:val="2E74B5"/>
             <w:u w:val="single"/>
           </w:rPr>
-          <w:t>原始来源</w:t>
+          <w:t>https://cdn.who.int/media/docs/default-source/documents/ethics/ethics-informedconsent-clinicalstudies.doc?sfvrsn=d69ff68a_0</w:t>
         </w:r>
       </w:hyperlink>
     </w:p>
@@ -3975,7 +4038,8 @@
         <w:t>NIH OHSRP, 2026。</w:t>
       </w:r>
       <w:r>
-        <w:t xml:space="preserve"> </w:t>
+        <w:br/>
+        <w:t>链接：</w:t>
       </w:r>
       <w:hyperlink r:id="rId74">
         <w:r>
@@ -3983,7 +4047,7 @@
             <w:color w:val="2E74B5"/>
             <w:u w:val="single"/>
           </w:rPr>
-          <w:t>原始来源</w:t>
+          <w:t>https://irbo.nih.gov/nih-irb-templates/consent-templates/</w:t>
         </w:r>
       </w:hyperlink>
     </w:p>
@@ -4036,7 +4100,8 @@
         <w:t>NIAID, 2025。</w:t>
       </w:r>
       <w:r>
-        <w:t xml:space="preserve"> </w:t>
+        <w:br/>
+        <w:t>链接：</w:t>
       </w:r>
       <w:hyperlink r:id="rId75">
         <w:r>
@@ -4044,7 +4109,7 @@
             <w:color w:val="2E74B5"/>
             <w:u w:val="single"/>
           </w:rPr>
-          <w:t>原始来源</w:t>
+          <w:t>https://www.niaid.nih.gov/research/dmid-protocols-informed-consent</w:t>
         </w:r>
       </w:hyperlink>
     </w:p>
@@ -4097,7 +4162,8 @@
         <w:t>US FDA, 2026。</w:t>
       </w:r>
       <w:r>
-        <w:t xml:space="preserve"> </w:t>
+        <w:br/>
+        <w:t>链接：</w:t>
       </w:r>
       <w:hyperlink r:id="rId76">
         <w:r>
@@ -4105,7 +4171,7 @@
             <w:color w:val="2E74B5"/>
             <w:u w:val="single"/>
           </w:rPr>
-          <w:t>原始来源</w:t>
+          <w:t>https://www.fda.gov/news-events/expanded-access/informed-consent-template-individual-patient-expanded-access</w:t>
         </w:r>
       </w:hyperlink>
     </w:p>
@@ -4158,7 +4224,8 @@
         <w:t>TransCelerate BioPharma, 2026。</w:t>
       </w:r>
       <w:r>
-        <w:t xml:space="preserve"> </w:t>
+        <w:br/>
+        <w:t>链接：</w:t>
       </w:r>
       <w:hyperlink r:id="rId77">
         <w:r>
@@ -4166,7 +4233,7 @@
             <w:color w:val="2E74B5"/>
             <w:u w:val="single"/>
           </w:rPr>
-          <w:t>原始来源</w:t>
+          <w:t>https://www.transceleratebiopharmainc.com/initiatives/common-statistical-analysis-plan-sap-template/</w:t>
         </w:r>
       </w:hyperlink>
     </w:p>
@@ -4219,7 +4286,8 @@
         <w:t>EU-PEARL, 2023。</w:t>
       </w:r>
       <w:r>
-        <w:t xml:space="preserve"> </w:t>
+        <w:br/>
+        <w:t>链接：</w:t>
       </w:r>
       <w:hyperlink r:id="rId78">
         <w:r>
@@ -4227,7 +4295,7 @@
             <w:color w:val="2E74B5"/>
             <w:u w:val="single"/>
           </w:rPr>
-          <w:t>原始来源</w:t>
+          <w:t>https://eu-pearl.eu/wp-content/uploads/2023/05/3.EU-PEARL_SAP_Template_V3-25April2023.docx</w:t>
         </w:r>
       </w:hyperlink>
     </w:p>
@@ -4280,7 +4348,8 @@
         <w:t>Duke Biostatistics, 2020。</w:t>
       </w:r>
       <w:r>
-        <w:t xml:space="preserve"> </w:t>
+        <w:br/>
+        <w:t>链接：</w:t>
       </w:r>
       <w:hyperlink r:id="rId79">
         <w:r>
@@ -4288,7 +4357,7 @@
             <w:color w:val="2E74B5"/>
             <w:u w:val="single"/>
           </w:rPr>
-          <w:t>原始来源</w:t>
+          <w:t>https://biostat.duke.edu/sites/default/files/2022-06/SAP%20template%20for%20website%202020-06-09.docx</w:t>
         </w:r>
       </w:hyperlink>
     </w:p>
@@ -4341,7 +4410,8 @@
         <w:t>DAC Trials, 2026。</w:t>
       </w:r>
       <w:r>
-        <w:t xml:space="preserve"> </w:t>
+        <w:br/>
+        <w:t>链接：</w:t>
       </w:r>
       <w:hyperlink r:id="rId80">
         <w:r>
@@ -4349,7 +4419,7 @@
             <w:color w:val="2E74B5"/>
             <w:u w:val="single"/>
           </w:rPr>
-          <w:t>原始来源</w:t>
+          <w:t>https://dac-trials.org/resources/statistical-analysis-plan-template/</w:t>
         </w:r>
       </w:hyperlink>
     </w:p>
@@ -4402,7 +4472,8 @@
         <w:t>Trials / PMC, 2023。</w:t>
       </w:r>
       <w:r>
-        <w:t xml:space="preserve"> </w:t>
+        <w:br/>
+        <w:t>链接：</w:t>
       </w:r>
       <w:hyperlink r:id="rId81">
         <w:r>
@@ -4410,7 +4481,7 @@
             <w:color w:val="2E74B5"/>
             <w:u w:val="single"/>
           </w:rPr>
-          <w:t>原始来源</w:t>
+          <w:t>https://pmc.ncbi.nlm.nih.gov/articles/PMC10300078/</w:t>
         </w:r>
       </w:hyperlink>
     </w:p>
@@ -4463,7 +4534,8 @@
         <w:t>ClinicalTrials.gov, 2026。</w:t>
       </w:r>
       <w:r>
-        <w:t xml:space="preserve"> </w:t>
+        <w:br/>
+        <w:t>链接：</w:t>
       </w:r>
       <w:hyperlink r:id="rId82">
         <w:r>
@@ -4471,7 +4543,7 @@
             <w:color w:val="2E74B5"/>
             <w:u w:val="single"/>
           </w:rPr>
-          <w:t>原始来源</w:t>
+          <w:t>https://clinicaltrials.gov/policy/results-definitions</w:t>
         </w:r>
       </w:hyperlink>
     </w:p>
@@ -4524,7 +4596,8 @@
         <w:t>ClinicalTrials.gov, 2026。</w:t>
       </w:r>
       <w:r>
-        <w:t xml:space="preserve"> </w:t>
+        <w:br/>
+        <w:t>链接：</w:t>
       </w:r>
       <w:hyperlink r:id="rId83">
         <w:r>
@@ -4532,7 +4605,7 @@
             <w:color w:val="2E74B5"/>
             <w:u w:val="single"/>
           </w:rPr>
-          <w:t>原始来源</w:t>
+          <w:t>https://clinicaltrials.gov/study-basics/glossary</w:t>
         </w:r>
       </w:hyperlink>
     </w:p>
@@ -4585,7 +4658,8 @@
         <w:t>ICH, 1995。</w:t>
       </w:r>
       <w:r>
-        <w:t xml:space="preserve"> </w:t>
+        <w:br/>
+        <w:t>链接：</w:t>
       </w:r>
       <w:hyperlink r:id="rId84">
         <w:r>
@@ -4593,7 +4667,7 @@
             <w:color w:val="2E74B5"/>
             <w:u w:val="single"/>
           </w:rPr>
-          <w:t>原始来源</w:t>
+          <w:t>https://database.ich.org/sites/default/files/E3_Guideline.pdf</w:t>
         </w:r>
       </w:hyperlink>
     </w:p>
@@ -4646,7 +4720,8 @@
         <w:t>MRCT Center / NIH / FDA, 2022。</w:t>
       </w:r>
       <w:r>
-        <w:t xml:space="preserve"> </w:t>
+        <w:br/>
+        <w:t>链接：</w:t>
       </w:r>
       <w:hyperlink r:id="rId85">
         <w:r>
@@ -4654,7 +4729,7 @@
             <w:color w:val="2E74B5"/>
             <w:u w:val="single"/>
           </w:rPr>
-          <w:t>原始来源</w:t>
+          <w:t>https://mrctcenter.org/diversity-in-clinical-research/wp-content/uploads/sites/8/2022/06/MRCT-Center-NIH-Protocol-Template-Version-1.0.pdf</w:t>
         </w:r>
       </w:hyperlink>
     </w:p>
@@ -4707,7 +4782,8 @@
         <w:t>National Institute on Aging, 2022。</w:t>
       </w:r>
       <w:r>
-        <w:t xml:space="preserve"> </w:t>
+        <w:br/>
+        <w:t>链接：</w:t>
       </w:r>
       <w:hyperlink r:id="rId86">
         <w:r>
@@ -4715,7 +4791,7 @@
             <w:color w:val="2E74B5"/>
             <w:u w:val="single"/>
           </w:rPr>
-          <w:t>原始来源</w:t>
+          <w:t>https://www.nia.nih.gov/sites/default/files/2022-03/nia-informed-consent-template.docx</w:t>
         </w:r>
       </w:hyperlink>
     </w:p>
@@ -4768,7 +4844,8 @@
         <w:t>NYU Langone Health, 2018。</w:t>
       </w:r>
       <w:r>
-        <w:t xml:space="preserve"> </w:t>
+        <w:br/>
+        <w:t>链接：</w:t>
       </w:r>
       <w:hyperlink r:id="rId87">
         <w:r>
@@ -4776,7 +4853,7 @@
             <w:color w:val="2E74B5"/>
             <w:u w:val="single"/>
           </w:rPr>
-          <w:t>原始来源</w:t>
+          <w:t>https://med.nyu.edu/departments-institutes/clinical-translational-science/sites/default/files/standard-consent-template-for-clinical-trials-and-biomedical-research.pdf</w:t>
         </w:r>
       </w:hyperlink>
     </w:p>
@@ -4829,7 +4906,8 @@
         <w:t>PMC, 2010。</w:t>
       </w:r>
       <w:r>
-        <w:t xml:space="preserve"> </w:t>
+        <w:br/>
+        <w:t>链接：</w:t>
       </w:r>
       <w:hyperlink r:id="rId88">
         <w:r>
@@ -4837,7 +4915,7 @@
             <w:color w:val="2E74B5"/>
             <w:u w:val="single"/>
           </w:rPr>
-          <w:t>原始来源</w:t>
+          <w:t>https://pmc.ncbi.nlm.nih.gov/articles/PMC2821287/</w:t>
         </w:r>
       </w:hyperlink>
     </w:p>
@@ -4890,7 +4968,8 @@
         <w:t>University at Buffalo CTSI, 2024。</w:t>
       </w:r>
       <w:r>
-        <w:t xml:space="preserve"> </w:t>
+        <w:br/>
+        <w:t>链接：</w:t>
       </w:r>
       <w:hyperlink r:id="rId89">
         <w:r>
@@ -4898,7 +4977,7 @@
             <w:color w:val="2E74B5"/>
             <w:u w:val="single"/>
           </w:rPr>
-          <w:t>原始来源</w:t>
+          <w:t>https://www.buffalo.edu/content/dam/www/ctsi/Cores/ClinicalResearchOffice/ClinicalTrialsgov%20Registration%20and%20Results%20Guide%201.16.2024.docx</w:t>
         </w:r>
       </w:hyperlink>
     </w:p>
@@ -4951,7 +5030,8 @@
         <w:t>Weill Cornell Medicine, 2019。</w:t>
       </w:r>
       <w:r>
-        <w:t xml:space="preserve"> </w:t>
+        <w:br/>
+        <w:t>链接：</w:t>
       </w:r>
       <w:hyperlink r:id="rId90">
         <w:r>
@@ -4959,7 +5039,7 @@
             <w:color w:val="2E74B5"/>
             <w:u w:val="single"/>
           </w:rPr>
-          <w:t>原始来源</w:t>
+          <w:t>https://research.weill.cornell.edu/sites/default/files/policy_forms/wcm_clinicaltrials.gov_protocol_and_sap_upload_and_redaction_guidance_v1.0_11.9.19.pdf</w:t>
         </w:r>
       </w:hyperlink>
     </w:p>
@@ -5012,7 +5092,8 @@
         <w:t>International Society for Clinical Biostatistics, 2016。</w:t>
       </w:r>
       <w:r>
-        <w:t xml:space="preserve"> </w:t>
+        <w:br/>
+        <w:t>链接：</w:t>
       </w:r>
       <w:hyperlink r:id="rId91">
         <w:r>
@@ -5020,7 +5101,7 @@
             <w:color w:val="2E74B5"/>
             <w:u w:val="single"/>
           </w:rPr>
-          <w:t>原始来源</w:t>
+          <w:t>https://www.iscb.international/files/folders/sira_files/protocol_template_05feb2016_508.pdf</w:t>
         </w:r>
       </w:hyperlink>
     </w:p>
@@ -5073,7 +5154,8 @@
         <w:t>National Institute on Aging, 2008。</w:t>
       </w:r>
       <w:r>
-        <w:t xml:space="preserve"> </w:t>
+        <w:br/>
+        <w:t>链接：</w:t>
       </w:r>
       <w:hyperlink r:id="rId92">
         <w:r>
@@ -5081,7 +5163,7 @@
             <w:color w:val="2E74B5"/>
             <w:u w:val="single"/>
           </w:rPr>
-          <w:t>原始来源</w:t>
+          <w:t>https://www.nia.nih.gov/sites/default/files/2017-06/informed_consent_checklist_1_14_08_updated%20%281%29.doc</w:t>
         </w:r>
       </w:hyperlink>
     </w:p>
@@ -5134,7 +5216,8 @@
         <w:t>ClinicalTrials.gov, 2017。</w:t>
       </w:r>
       <w:r>
-        <w:t xml:space="preserve"> </w:t>
+        <w:br/>
+        <w:t>链接：</w:t>
       </w:r>
       <w:hyperlink r:id="rId93">
         <w:r>
@@ -5142,7 +5225,7 @@
             <w:color w:val="2E74B5"/>
             <w:u w:val="single"/>
           </w:rPr>
-          <w:t>原始来源</w:t>
+          <w:t>https://cdn.clinicaltrials.gov/large-docs/95/NCT01873495/ICF_001.pdf</w:t>
         </w:r>
       </w:hyperlink>
     </w:p>
@@ -5195,7 +5278,8 @@
         <w:t>UK Health Research Authority, 2026。</w:t>
       </w:r>
       <w:r>
-        <w:t xml:space="preserve"> </w:t>
+        <w:br/>
+        <w:t>链接：</w:t>
       </w:r>
       <w:hyperlink r:id="rId94">
         <w:r>
@@ -5203,7 +5287,7 @@
             <w:color w:val="2E74B5"/>
             <w:u w:val="single"/>
           </w:rPr>
-          <w:t>原始来源</w:t>
+          <w:t>https://www.hra.nhs.uk/documents/5771/ctimp-protocol-development-tool_Apr_2026.docx</w:t>
         </w:r>
       </w:hyperlink>
     </w:p>
@@ -5256,7 +5340,8 @@
         <w:t>NIH IRBO, 2026。</w:t>
       </w:r>
       <w:r>
-        <w:t xml:space="preserve"> </w:t>
+        <w:br/>
+        <w:t>链接：</w:t>
       </w:r>
       <w:hyperlink r:id="rId95">
         <w:r>
@@ -5264,7 +5349,7 @@
             <w:color w:val="2E74B5"/>
             <w:u w:val="single"/>
           </w:rPr>
-          <w:t>原始来源</w:t>
+          <w:t>https://irbo.nih.gov/documents/317/2026_01_26__Model_Consent_Template_when_NIH_is_the_Lead_Site_v9.docx</w:t>
         </w:r>
       </w:hyperlink>
     </w:p>
@@ -5317,7 +5402,8 @@
         <w:t>NIH/NIMH, 当前官网。</w:t>
       </w:r>
       <w:r>
-        <w:t xml:space="preserve"> </w:t>
+        <w:br/>
+        <w:t>链接：</w:t>
       </w:r>
       <w:hyperlink r:id="rId96">
         <w:r>
@@ -5325,7 +5411,7 @@
             <w:color w:val="2E74B5"/>
             <w:u w:val="single"/>
           </w:rPr>
-          <w:t>原始来源</w:t>
+          <w:t>https://www.nimh.nih.gov/sites/default/files/documents/funding/clinical-research/clinical-research-toolbox/documents/nimh_documentation_of_informed_consent_template_v1_july_2019.docx</w:t>
         </w:r>
       </w:hyperlink>
     </w:p>
@@ -5378,7 +5464,8 @@
         <w:t>NIH/NIAID, 当前官网。</w:t>
       </w:r>
       <w:r>
-        <w:t xml:space="preserve"> </w:t>
+        <w:br/>
+        <w:t>链接：</w:t>
       </w:r>
       <w:hyperlink r:id="rId97">
         <w:r>
@@ -5386,7 +5473,7 @@
             <w:color w:val="2E74B5"/>
             <w:u w:val="single"/>
           </w:rPr>
-          <w:t>原始来源</w:t>
+          <w:t>https://www.niaid.nih.gov/sites/default/files/statistical-analysis-plan.pdf</w:t>
         </w:r>
       </w:hyperlink>
     </w:p>
@@ -5439,7 +5526,8 @@
         <w:t>UK Health Research Authority, 当前官网。</w:t>
       </w:r>
       <w:r>
-        <w:t xml:space="preserve"> </w:t>
+        <w:br/>
+        <w:t>链接：</w:t>
       </w:r>
       <w:hyperlink r:id="rId98">
         <w:r>
@@ -5447,7 +5535,7 @@
             <w:color w:val="2E74B5"/>
             <w:u w:val="single"/>
           </w:rPr>
-          <w:t>原始来源</w:t>
+          <w:t>https://www.hra.nhs.uk/documents/324/qualitative-protocol-development-tool.docx</w:t>
         </w:r>
       </w:hyperlink>
     </w:p>
@@ -5500,7 +5588,8 @@
         <w:t>ICH, 2025。</w:t>
       </w:r>
       <w:r>
-        <w:t xml:space="preserve"> </w:t>
+        <w:br/>
+        <w:t>链接：</w:t>
       </w:r>
       <w:hyperlink r:id="rId99">
         <w:r>
@@ -5508,7 +5597,7 @@
             <w:color w:val="2E74B5"/>
             <w:u w:val="single"/>
           </w:rPr>
-          <w:t>原始来源</w:t>
+          <w:t>https://database.ich.org/sites/default/files/ICH_Step4_M11_Final_Template_2025_1119.pdf</w:t>
         </w:r>
       </w:hyperlink>
     </w:p>
@@ -5561,7 +5650,8 @@
         <w:t>NIH-FDA, 2021。</w:t>
       </w:r>
       <w:r>
-        <w:t xml:space="preserve"> </w:t>
+        <w:br/>
+        <w:t>链接：</w:t>
       </w:r>
       <w:hyperlink r:id="rId100">
         <w:r>
@@ -5569,7 +5659,7 @@
             <w:color w:val="2E74B5"/>
             <w:u w:val="single"/>
           </w:rPr>
-          <w:t>原始来源</w:t>
+          <w:t>https://www.fda.gov/media/152143/download</w:t>
         </w:r>
       </w:hyperlink>
     </w:p>
@@ -5622,7 +5712,8 @@
         <w:t>SPIRIT Statement, 2013。</w:t>
       </w:r>
       <w:r>
-        <w:t xml:space="preserve"> </w:t>
+        <w:br/>
+        <w:t>链接：</w:t>
       </w:r>
       <w:hyperlink r:id="rId101">
         <w:r>
@@ -5630,7 +5721,7 @@
             <w:color w:val="2E74B5"/>
             <w:u w:val="single"/>
           </w:rPr>
-          <w:t>原始来源</w:t>
+          <w:t>https://www.spirit-statement.org/wp-content/uploads/2013/01/SPIRIT-Figure.doc</w:t>
         </w:r>
       </w:hyperlink>
     </w:p>
@@ -5683,7 +5774,8 @@
         <w:t>CONSORT-SPIRIT, 2026。</w:t>
       </w:r>
       <w:r>
-        <w:t xml:space="preserve"> </w:t>
+        <w:br/>
+        <w:t>链接：</w:t>
       </w:r>
       <w:hyperlink r:id="rId102">
         <w:r>
@@ -5691,7 +5783,7 @@
             <w:color w:val="2E74B5"/>
             <w:u w:val="single"/>
           </w:rPr>
-          <w:t>原始来源</w:t>
+          <w:t>https://www.consort-spirit.org/item18-participanttimeline</w:t>
         </w:r>
       </w:hyperlink>
     </w:p>
@@ -5744,7 +5836,8 @@
         <w:t>Boston University Medical Campus, 2023。</w:t>
       </w:r>
       <w:r>
-        <w:t xml:space="preserve"> </w:t>
+        <w:br/>
+        <w:t>链接：</w:t>
       </w:r>
       <w:hyperlink r:id="rId103">
         <w:r>
@@ -5752,7 +5845,7 @@
             <w:color w:val="2E74B5"/>
             <w:u w:val="single"/>
           </w:rPr>
-          <w:t>原始来源</w:t>
+          <w:t>https://www.bumc.bu.edu/crro/files/2023/09/CRRO-Tool_Schedule-of-Events_9122023.docx</w:t>
         </w:r>
       </w:hyperlink>
     </w:p>
@@ -5805,7 +5898,8 @@
         <w:t>Allina Health, 2026。</w:t>
       </w:r>
       <w:r>
-        <w:t xml:space="preserve"> </w:t>
+        <w:br/>
+        <w:t>链接：</w:t>
       </w:r>
       <w:hyperlink r:id="rId104">
         <w:r>
@@ -5813,7 +5907,7 @@
             <w:color w:val="2E74B5"/>
             <w:u w:val="single"/>
           </w:rPr>
-          <w:t>原始来源</w:t>
+          <w:t>https://www.allinahealth.org/-/media/allina-health/files/for-medical-professionals/instructions-for-the-schedule-of-events.doc</w:t>
         </w:r>
       </w:hyperlink>
     </w:p>
@@ -5866,7 +5960,8 @@
         <w:t>University of Alabama at Birmingham, 2026。</w:t>
       </w:r>
       <w:r>
-        <w:t xml:space="preserve"> </w:t>
+        <w:br/>
+        <w:t>链接：</w:t>
       </w:r>
       <w:hyperlink r:id="rId105">
         <w:r>
@@ -5874,7 +5969,7 @@
             <w:color w:val="2E74B5"/>
             <w:u w:val="single"/>
           </w:rPr>
-          <w:t>原始来源</w:t>
+          <w:t>https://www.uab.edu/ccts/images/kiosk/Simplified_clinical_trial_protocol_template.docx</w:t>
         </w:r>
       </w:hyperlink>
     </w:p>
@@ -5927,7 +6022,8 @@
         <w:t>University of Alabama at Birmingham, 2026。</w:t>
       </w:r>
       <w:r>
-        <w:t xml:space="preserve"> </w:t>
+        <w:br/>
+        <w:t>链接：</w:t>
       </w:r>
       <w:hyperlink r:id="rId106">
         <w:r>
@@ -5935,7 +6031,7 @@
             <w:color w:val="2E74B5"/>
             <w:u w:val="single"/>
           </w:rPr>
-          <w:t>原始来源</w:t>
+          <w:t>https://www.uab.edu/ccts/clinical-trials-kiosk/all-templates-and-tools</w:t>
         </w:r>
       </w:hyperlink>
     </w:p>
@@ -5988,7 +6084,8 @@
         <w:t>PMC, 2025。</w:t>
       </w:r>
       <w:r>
-        <w:t xml:space="preserve"> </w:t>
+        <w:br/>
+        <w:t>链接：</w:t>
       </w:r>
       <w:hyperlink r:id="rId107">
         <w:r>
@@ -5996,7 +6093,7 @@
             <w:color w:val="2E74B5"/>
             <w:u w:val="single"/>
           </w:rPr>
-          <w:t>原始来源</w:t>
+          <w:t>https://pmc.ncbi.nlm.nih.gov/articles/PMC12167819/</w:t>
         </w:r>
       </w:hyperlink>
     </w:p>
@@ -6049,7 +6146,8 @@
         <w:t>PMC, 2025。</w:t>
       </w:r>
       <w:r>
-        <w:t xml:space="preserve"> </w:t>
+        <w:br/>
+        <w:t>链接：</w:t>
       </w:r>
       <w:hyperlink r:id="rId108">
         <w:r>
@@ -6057,7 +6155,7 @@
             <w:color w:val="2E74B5"/>
             <w:u w:val="single"/>
           </w:rPr>
-          <w:t>原始来源</w:t>
+          <w:t>https://pmc.ncbi.nlm.nih.gov/articles/PMC12035670/</w:t>
         </w:r>
       </w:hyperlink>
     </w:p>
@@ -6110,7 +6208,8 @@
         <w:t>ClinicalTrials.gov, 2019。</w:t>
       </w:r>
       <w:r>
-        <w:t xml:space="preserve"> </w:t>
+        <w:br/>
+        <w:t>链接：</w:t>
       </w:r>
       <w:hyperlink r:id="rId109">
         <w:r>
@@ -6118,7 +6217,7 @@
             <w:color w:val="2E74B5"/>
             <w:u w:val="single"/>
           </w:rPr>
-          <w:t>原始来源</w:t>
+          <w:t>https://cdn.clinicaltrials.gov/large-docs/86/NCT04671186/Prot_SAP_000.pdf</w:t>
         </w:r>
       </w:hyperlink>
     </w:p>
@@ -6171,7 +6270,8 @@
         <w:t>The PROTEUS Consortium, 2023。</w:t>
       </w:r>
       <w:r>
-        <w:t xml:space="preserve"> </w:t>
+        <w:br/>
+        <w:t>链接：</w:t>
       </w:r>
       <w:hyperlink r:id="rId110">
         <w:r>
@@ -6179,7 +6279,7 @@
             <w:color w:val="2E74B5"/>
             <w:u w:val="single"/>
           </w:rPr>
-          <w:t>原始来源</w:t>
+          <w:t>https://theproteusconsortium.org/wp-content/uploads/2023/02/230220-SPIRIT-PRO-PROtocol-template.pdf</w:t>
         </w:r>
       </w:hyperlink>
     </w:p>
@@ -6232,7 +6332,8 @@
         <w:t>TransCelerate BioPharma, 2026。</w:t>
       </w:r>
       <w:r>
-        <w:t xml:space="preserve"> </w:t>
+        <w:br/>
+        <w:t>链接：</w:t>
       </w:r>
       <w:hyperlink r:id="rId111">
         <w:r>
@@ -6240,7 +6341,7 @@
             <w:color w:val="2E74B5"/>
             <w:u w:val="single"/>
           </w:rPr>
-          <w:t>原始来源</w:t>
+          <w:t>https://www.transceleratebiopharmainc.com/assets/clinical-content-reuse-solutions/</w:t>
         </w:r>
       </w:hyperlink>
     </w:p>
@@ -6293,7 +6394,8 @@
         <w:t>NIH, 2024。</w:t>
       </w:r>
       <w:r>
-        <w:t xml:space="preserve"> </w:t>
+        <w:br/>
+        <w:t>链接：</w:t>
       </w:r>
       <w:hyperlink r:id="rId112">
         <w:r>
@@ -6301,7 +6403,7 @@
             <w:color w:val="2E74B5"/>
             <w:u w:val="single"/>
           </w:rPr>
-          <w:t>原始来源</w:t>
+          <w:t>https://grants.nih.gov/policy-and-compliance/policy-topics/clinical-trials/protocol-template</w:t>
         </w:r>
       </w:hyperlink>
     </w:p>
@@ -6354,7 +6456,8 @@
         <w:t>University of Wisconsin IRB, 2026。</w:t>
       </w:r>
       <w:r>
-        <w:t xml:space="preserve"> </w:t>
+        <w:br/>
+        <w:t>链接：</w:t>
       </w:r>
       <w:hyperlink r:id="rId113">
         <w:r>
@@ -6362,7 +6465,7 @@
             <w:color w:val="2E74B5"/>
             <w:u w:val="single"/>
           </w:rPr>
-          <w:t>原始来源</w:t>
+          <w:t>https://irb.wisc.edu/manual/investigator-manual/irb-review-requirements-and-application-types/human-research-requiring-a-protocol/protocol-templates/</w:t>
         </w:r>
       </w:hyperlink>
     </w:p>
@@ -6415,7 +6518,8 @@
         <w:t>MRCT Center, 2022。</w:t>
       </w:r>
       <w:r>
-        <w:t xml:space="preserve"> </w:t>
+        <w:br/>
+        <w:t>链接：</w:t>
       </w:r>
       <w:hyperlink r:id="rId114">
         <w:r>
@@ -6423,7 +6527,7 @@
             <w:color w:val="2E74B5"/>
             <w:u w:val="single"/>
           </w:rPr>
-          <w:t>原始来源</w:t>
+          <w:t>https://mrctcenter.org/resource/diversity-inclusion-and-equity-in-clinical-research-diversity-inclusion-overlay-transcelerates-common-protocol-template/</w:t>
         </w:r>
       </w:hyperlink>
     </w:p>
@@ -6484,7 +6588,8 @@
         <w:t>CDISC, 2026。</w:t>
       </w:r>
       <w:r>
-        <w:t xml:space="preserve"> </w:t>
+        <w:br/>
+        <w:t>链接：</w:t>
       </w:r>
       <w:hyperlink r:id="rId115">
         <w:r>
@@ -6492,7 +6597,7 @@
             <w:color w:val="2E74B5"/>
             <w:u w:val="single"/>
           </w:rPr>
-          <w:t>原始来源</w:t>
+          <w:t>https://www.cdisc.org/ddf</w:t>
         </w:r>
       </w:hyperlink>
     </w:p>
@@ -6545,7 +6650,8 @@
         <w:t>CDISC, 2026。</w:t>
       </w:r>
       <w:r>
-        <w:t xml:space="preserve"> </w:t>
+        <w:br/>
+        <w:t>链接：</w:t>
       </w:r>
       <w:hyperlink r:id="rId116">
         <w:r>
@@ -6553,7 +6659,7 @@
             <w:color w:val="2E74B5"/>
             <w:u w:val="single"/>
           </w:rPr>
-          <w:t>原始来源</w:t>
+          <w:t>https://www.cdisc.org/education/usdm-onboarding-package</w:t>
         </w:r>
       </w:hyperlink>
     </w:p>
@@ -6606,7 +6712,8 @@
         <w:t>CDISC, 2026。</w:t>
       </w:r>
       <w:r>
-        <w:t xml:space="preserve"> </w:t>
+        <w:br/>
+        <w:t>链接：</w:t>
       </w:r>
       <w:hyperlink r:id="rId117">
         <w:r>
@@ -6614,7 +6721,7 @@
             <w:color w:val="2E74B5"/>
             <w:u w:val="single"/>
           </w:rPr>
-          <w:t>原始来源</w:t>
+          <w:t>https://github.com/cdisc-org/usdm</w:t>
         </w:r>
       </w:hyperlink>
     </w:p>
@@ -6667,7 +6774,8 @@
         <w:t>TransCelerate BioPharma, 2026。</w:t>
       </w:r>
       <w:r>
-        <w:t xml:space="preserve"> </w:t>
+        <w:br/>
+        <w:t>链接：</w:t>
       </w:r>
       <w:hyperlink r:id="rId118">
         <w:r>
@@ -6675,7 +6783,7 @@
             <w:color w:val="2E74B5"/>
             <w:u w:val="single"/>
           </w:rPr>
-          <w:t>原始来源</w:t>
+          <w:t>https://www.transceleratebiopharmainc.com/initiatives/digital-data-flow/</w:t>
         </w:r>
       </w:hyperlink>
     </w:p>
@@ -6728,7 +6836,8 @@
         <w:t>TransCelerate BioPharma, 2026。</w:t>
       </w:r>
       <w:r>
-        <w:t xml:space="preserve"> </w:t>
+        <w:br/>
+        <w:t>链接：</w:t>
       </w:r>
       <w:hyperlink r:id="rId119">
         <w:r>
@@ -6736,7 +6845,7 @@
             <w:color w:val="2E74B5"/>
             <w:u w:val="single"/>
           </w:rPr>
-          <w:t>原始来源</w:t>
+          <w:t>https://www.transceleratebiopharmainc.com/initiatives/clinical-content-reuse/</w:t>
         </w:r>
       </w:hyperlink>
     </w:p>
@@ -6789,7 +6898,8 @@
         <w:t>TransCelerate BioPharma, 2016。</w:t>
       </w:r>
       <w:r>
-        <w:t xml:space="preserve"> </w:t>
+        <w:br/>
+        <w:t>链接：</w:t>
       </w:r>
       <w:hyperlink r:id="rId120">
         <w:r>
@@ -6797,7 +6907,7 @@
             <w:color w:val="2E74B5"/>
             <w:u w:val="single"/>
           </w:rPr>
-          <w:t>原始来源</w:t>
+          <w:t>https://www.transceleratebiopharmainc.com/news-center/common-protocol-template-now-available/</w:t>
         </w:r>
       </w:hyperlink>
     </w:p>
@@ -6850,7 +6960,8 @@
         <w:t>TransCelerate BioPharma, 2018。</w:t>
       </w:r>
       <w:r>
-        <w:t xml:space="preserve"> </w:t>
+        <w:br/>
+        <w:t>链接：</w:t>
       </w:r>
       <w:hyperlink r:id="rId121">
         <w:r>
@@ -6858,7 +6969,7 @@
             <w:color w:val="2E74B5"/>
             <w:u w:val="single"/>
           </w:rPr>
-          <w:t>原始来源</w:t>
+          <w:t>https://www.transceleratebiopharmainc.com/events/cpt-101-introduction-common-protocol-template-3/</w:t>
         </w:r>
       </w:hyperlink>
     </w:p>
@@ -6911,7 +7022,8 @@
         <w:t>CDISC, 2026。</w:t>
       </w:r>
       <w:r>
-        <w:t xml:space="preserve"> </w:t>
+        <w:br/>
+        <w:t>链接：</w:t>
       </w:r>
       <w:hyperlink r:id="rId122">
         <w:r>
@@ -6919,7 +7031,7 @@
             <w:color w:val="2E74B5"/>
             <w:u w:val="single"/>
           </w:rPr>
-          <w:t>原始来源</w:t>
+          <w:t>https://www.cdisc.org/standards/foundational/protocol</w:t>
         </w:r>
       </w:hyperlink>
     </w:p>
@@ -6972,7 +7084,8 @@
         <w:t>CDISC, 2026。</w:t>
       </w:r>
       <w:r>
-        <w:t xml:space="preserve"> </w:t>
+        <w:br/>
+        <w:t>链接：</w:t>
       </w:r>
       <w:hyperlink r:id="rId123">
         <w:r>
@@ -6980,7 +7093,7 @@
             <w:color w:val="2E74B5"/>
             <w:u w:val="single"/>
           </w:rPr>
-          <w:t>原始来源</w:t>
+          <w:t>https://www.cdisc.org/cdisc-prm-toolset-v1.0</w:t>
         </w:r>
       </w:hyperlink>
     </w:p>
@@ -7033,7 +7146,8 @@
         <w:t>CDISC, 2026。</w:t>
       </w:r>
       <w:r>
-        <w:t xml:space="preserve"> </w:t>
+        <w:br/>
+        <w:t>链接：</w:t>
       </w:r>
       <w:hyperlink r:id="rId124">
         <w:r>
@@ -7041,7 +7155,7 @@
             <w:color w:val="2E74B5"/>
             <w:u w:val="single"/>
           </w:rPr>
-          <w:t>原始来源</w:t>
+          <w:t>https://www.cdisc.org/tmf</w:t>
         </w:r>
       </w:hyperlink>
     </w:p>
@@ -7094,7 +7208,8 @@
         <w:t>CDISC, 2026。</w:t>
       </w:r>
       <w:r>
-        <w:t xml:space="preserve"> </w:t>
+        <w:br/>
+        <w:t>链接：</w:t>
       </w:r>
       <w:hyperlink r:id="rId125">
         <w:r>
@@ -7102,7 +7217,7 @@
             <w:color w:val="2E74B5"/>
             <w:u w:val="single"/>
           </w:rPr>
-          <w:t>原始来源</w:t>
+          <w:t>https://www.cdisc.org/standards/trial-master-file-reference-model</w:t>
         </w:r>
       </w:hyperlink>
     </w:p>
@@ -7155,7 +7270,8 @@
         <w:t>PMC, 2024。</w:t>
       </w:r>
       <w:r>
-        <w:t xml:space="preserve"> </w:t>
+        <w:br/>
+        <w:t>链接：</w:t>
       </w:r>
       <w:hyperlink r:id="rId126">
         <w:r>
@@ -7163,7 +7279,7 @@
             <w:color w:val="2E74B5"/>
             <w:u w:val="single"/>
           </w:rPr>
-          <w:t>原始来源</w:t>
+          <w:t>https://pmc.ncbi.nlm.nih.gov/articles/PMC10956223/</w:t>
         </w:r>
       </w:hyperlink>
     </w:p>
@@ -7224,7 +7340,8 @@
         <w:t>arXiv, 2024。</w:t>
       </w:r>
       <w:r>
-        <w:t xml:space="preserve"> </w:t>
+        <w:br/>
+        <w:t>链接：</w:t>
       </w:r>
       <w:hyperlink r:id="rId127">
         <w:r>
@@ -7232,7 +7349,7 @@
             <w:color w:val="2E74B5"/>
             <w:u w:val="single"/>
           </w:rPr>
-          <w:t>原始来源</w:t>
+          <w:t>https://arxiv.org/pdf/2402.16406</w:t>
         </w:r>
       </w:hyperlink>
     </w:p>
@@ -7285,7 +7402,8 @@
         <w:t>arXiv, 2024。</w:t>
       </w:r>
       <w:r>
-        <w:t xml:space="preserve"> </w:t>
+        <w:br/>
+        <w:t>链接：</w:t>
       </w:r>
       <w:hyperlink r:id="rId128">
         <w:r>
@@ -7293,7 +7411,7 @@
             <w:color w:val="2E74B5"/>
             <w:u w:val="single"/>
           </w:rPr>
-          <w:t>原始来源</w:t>
+          <w:t>https://arxiv.org/pdf/2404.05044</w:t>
         </w:r>
       </w:hyperlink>
     </w:p>
@@ -7346,7 +7464,8 @@
         <w:t>PMC, 2026。</w:t>
       </w:r>
       <w:r>
-        <w:t xml:space="preserve"> </w:t>
+        <w:br/>
+        <w:t>链接：</w:t>
       </w:r>
       <w:hyperlink r:id="rId129">
         <w:r>
@@ -7354,7 +7473,7 @@
             <w:color w:val="2E74B5"/>
             <w:u w:val="single"/>
           </w:rPr>
-          <w:t>原始来源</w:t>
+          <w:t>https://pmc.ncbi.nlm.nih.gov/articles/PMC12816432/</w:t>
         </w:r>
       </w:hyperlink>
     </w:p>
@@ -7407,7 +7526,8 @@
         <w:t>PMC, 2025。</w:t>
       </w:r>
       <w:r>
-        <w:t xml:space="preserve"> </w:t>
+        <w:br/>
+        <w:t>链接：</w:t>
       </w:r>
       <w:hyperlink r:id="rId130">
         <w:r>
@@ -7415,7 +7535,7 @@
             <w:color w:val="2E74B5"/>
             <w:u w:val="single"/>
           </w:rPr>
-          <w:t>原始来源</w:t>
+          <w:t>https://pmc.ncbi.nlm.nih.gov/articles/PMC12522288/</w:t>
         </w:r>
       </w:hyperlink>
     </w:p>
@@ -7468,7 +7588,8 @@
         <w:t>PHUSE / LexJansen, 2025。</w:t>
       </w:r>
       <w:r>
-        <w:t xml:space="preserve"> </w:t>
+        <w:br/>
+        <w:t>链接：</w:t>
       </w:r>
       <w:hyperlink r:id="rId131">
         <w:r>
@@ -7476,7 +7597,7 @@
             <w:color w:val="2E74B5"/>
             <w:u w:val="single"/>
           </w:rPr>
-          <w:t>原始来源</w:t>
+          <w:t>https://www.lexjansen.com/phuse-us/2025/ml/PAP_ML08.pdf</w:t>
         </w:r>
       </w:hyperlink>
     </w:p>
@@ -7529,7 +7650,8 @@
         <w:t>JMIR, 2025。</w:t>
       </w:r>
       <w:r>
-        <w:t xml:space="preserve"> </w:t>
+        <w:br/>
+        <w:t>链接：</w:t>
       </w:r>
       <w:hyperlink r:id="rId132">
         <w:r>
@@ -7537,7 +7659,7 @@
             <w:color w:val="2E74B5"/>
             <w:u w:val="single"/>
           </w:rPr>
-          <w:t>原始来源</w:t>
+          <w:t>https://www.jmir.org/2025/1/e72412</w:t>
         </w:r>
       </w:hyperlink>
     </w:p>
@@ -7590,7 +7712,8 @@
         <w:t>AlphaLifeSci, 2025。</w:t>
       </w:r>
       <w:r>
-        <w:t xml:space="preserve"> </w:t>
+        <w:br/>
+        <w:t>链接：</w:t>
       </w:r>
       <w:hyperlink r:id="rId133">
         <w:r>
@@ -7598,7 +7721,7 @@
             <w:color w:val="2E74B5"/>
             <w:u w:val="single"/>
           </w:rPr>
-          <w:t>原始来源</w:t>
+          <w:t>https://alphalifesci.com/blog/blueprint-for-breakthrough-ai-driven-protocol-authoring-accelerates-phase-iii-clinical-trials</w:t>
         </w:r>
       </w:hyperlink>
     </w:p>
@@ -7651,7 +7774,8 @@
         <w:t>European Medicines Agency, 2024。</w:t>
       </w:r>
       <w:r>
-        <w:t xml:space="preserve"> </w:t>
+        <w:br/>
+        <w:t>链接：</w:t>
       </w:r>
       <w:hyperlink r:id="rId134">
         <w:r>
@@ -7659,7 +7783,7 @@
             <w:color w:val="2E74B5"/>
             <w:u w:val="single"/>
           </w:rPr>
-          <w:t>原始来源</w:t>
+          <w:t>https://www.ema.europa.eu/en/documents/scientific-guideline/reflection-paper-use-artificial-intelligence-ai-medicinal-product-lifecycle_en.pdf</w:t>
         </w:r>
       </w:hyperlink>
     </w:p>
@@ -7712,7 +7836,8 @@
         <w:t>US FDA, 2025。</w:t>
       </w:r>
       <w:r>
-        <w:t xml:space="preserve"> </w:t>
+        <w:br/>
+        <w:t>链接：</w:t>
       </w:r>
       <w:hyperlink r:id="rId135">
         <w:r>
@@ -7720,7 +7845,7 @@
             <w:color w:val="2E74B5"/>
             <w:u w:val="single"/>
           </w:rPr>
-          <w:t>原始来源</w:t>
+          <w:t>https://www.fda.gov/regulatory-information/search-fda-guidance-documents/considerations-use-artificial-intelligence-support-regulatory-decision-making-drug-and-biological</w:t>
         </w:r>
       </w:hyperlink>
     </w:p>
@@ -7773,7 +7898,8 @@
         <w:t>World Health Organization, 2021。</w:t>
       </w:r>
       <w:r>
-        <w:t xml:space="preserve"> </w:t>
+        <w:br/>
+        <w:t>链接：</w:t>
       </w:r>
       <w:hyperlink r:id="rId136">
         <w:r>
@@ -7781,7 +7907,7 @@
             <w:color w:val="2E74B5"/>
             <w:u w:val="single"/>
           </w:rPr>
-          <w:t>原始来源</w:t>
+          <w:t>https://www.who.int/publications/i/item/9789240029200</w:t>
         </w:r>
       </w:hyperlink>
     </w:p>
@@ -7834,7 +7960,8 @@
         <w:t>FDA Health Canada MHRA, 2021。</w:t>
       </w:r>
       <w:r>
-        <w:t xml:space="preserve"> </w:t>
+        <w:br/>
+        <w:t>链接：</w:t>
       </w:r>
       <w:hyperlink r:id="rId137">
         <w:r>
@@ -7842,7 +7969,7 @@
             <w:color w:val="2E74B5"/>
             <w:u w:val="single"/>
           </w:rPr>
-          <w:t>原始来源</w:t>
+          <w:t>https://www.fda.gov/medical-devices/software-medical-device-samd/good-machine-learning-practice-medical-device-development-guiding-principles</w:t>
         </w:r>
       </w:hyperlink>
     </w:p>
@@ -7895,7 +8022,8 @@
         <w:t>WHO, 2021。</w:t>
       </w:r>
       <w:r>
-        <w:t xml:space="preserve"> </w:t>
+        <w:br/>
+        <w:t>链接：</w:t>
       </w:r>
       <w:hyperlink r:id="rId138">
         <w:r>
@@ -7903,7 +8031,7 @@
             <w:color w:val="2E74B5"/>
             <w:u w:val="single"/>
           </w:rPr>
-          <w:t>原始来源</w:t>
+          <w:t>https://iris.who.int/bitstream/handle/10665/341996/9789240029200-eng.pdf</w:t>
         </w:r>
       </w:hyperlink>
     </w:p>
@@ -7956,7 +8084,8 @@
         <w:t>WHO, 2024。</w:t>
       </w:r>
       <w:r>
-        <w:t xml:space="preserve"> </w:t>
+        <w:br/>
+        <w:t>链接：</w:t>
       </w:r>
       <w:hyperlink r:id="rId139">
         <w:r>
@@ -7964,7 +8093,7 @@
             <w:color w:val="2E74B5"/>
             <w:u w:val="single"/>
           </w:rPr>
-          <w:t>原始来源</w:t>
+          <w:t>https://iris.who.int/bitstream/handle/10665/375579/9789240084759-eng.pdf</w:t>
         </w:r>
       </w:hyperlink>
     </w:p>
@@ -8017,7 +8146,8 @@
         <w:t>Tufts CSDD, 2024。</w:t>
       </w:r>
       <w:r>
-        <w:t xml:space="preserve"> </w:t>
+        <w:br/>
+        <w:t>链接：</w:t>
       </w:r>
       <w:hyperlink r:id="rId140">
         <w:r>
@@ -8025,7 +8155,7 @@
             <w:color w:val="2E74B5"/>
             <w:u w:val="single"/>
           </w:rPr>
-          <w:t>原始来源</w:t>
+          <w:t>https://assets-eu.researchsquare.com/files/rs-3168679/v1/f724a62e-b5ca-4d1e-9f95-5d005e9350c8.pdf?c=1710169728</w:t>
         </w:r>
       </w:hyperlink>
     </w:p>
@@ -8078,7 +8208,8 @@
         <w:t>国家药监局药审中心, 2022。</w:t>
       </w:r>
       <w:r>
-        <w:t xml:space="preserve"> </w:t>
+        <w:br/>
+        <w:t>链接：</w:t>
       </w:r>
       <w:hyperlink r:id="rId141">
         <w:r>
@@ -8086,7 +8217,7 @@
             <w:color w:val="2E74B5"/>
             <w:u w:val="single"/>
           </w:rPr>
-          <w:t>原始来源</w:t>
+          <w:t>https://www.cnppa.org/Public/editor/attached/file/20220624/20220624044825_55450.pdf</w:t>
         </w:r>
       </w:hyperlink>
     </w:p>
@@ -8139,7 +8270,8 @@
         <w:t>FDA, 2025。</w:t>
       </w:r>
       <w:r>
-        <w:t xml:space="preserve"> </w:t>
+        <w:br/>
+        <w:t>链接：</w:t>
       </w:r>
       <w:hyperlink r:id="rId142">
         <w:r>
@@ -8147,7 +8279,7 @@
             <w:color w:val="2E74B5"/>
             <w:u w:val="single"/>
           </w:rPr>
-          <w:t>原始来源</w:t>
+          <w:t>https://www.fda.gov/media/190192/download</w:t>
         </w:r>
       </w:hyperlink>
     </w:p>
@@ -8208,7 +8340,8 @@
         <w:t>Applied Clinical Trials, 2026。</w:t>
       </w:r>
       <w:r>
-        <w:t xml:space="preserve"> </w:t>
+        <w:br/>
+        <w:t>链接：</w:t>
       </w:r>
       <w:hyperlink r:id="rId143">
         <w:r>
@@ -8216,7 +8349,7 @@
             <w:color w:val="2E74B5"/>
             <w:u w:val="single"/>
           </w:rPr>
-          <w:t>原始来源</w:t>
+          <w:t>https://www.appliedclinicaltrialsonline.com/view/multidisciplinary-approach-protocol-writing</w:t>
         </w:r>
       </w:hyperlink>
     </w:p>
@@ -8269,7 +8402,8 @@
         <w:t>ICON plc, 2025。</w:t>
       </w:r>
       <w:r>
-        <w:t xml:space="preserve"> </w:t>
+        <w:br/>
+        <w:t>链接：</w:t>
       </w:r>
       <w:hyperlink r:id="rId144">
         <w:r>
@@ -8277,7 +8411,7 @@
             <w:color w:val="2E74B5"/>
             <w:u w:val="single"/>
           </w:rPr>
-          <w:t>原始来源</w:t>
+          <w:t>https://www.iconplc.com/insights/blog/2025/04/09/controlling-complexity-regulator-ready-protocol</w:t>
         </w:r>
       </w:hyperlink>
     </w:p>
@@ -8330,7 +8464,8 @@
         <w:t>Applied Clinical Trials, 2026。</w:t>
       </w:r>
       <w:r>
-        <w:t xml:space="preserve"> </w:t>
+        <w:br/>
+        <w:t>链接：</w:t>
       </w:r>
       <w:hyperlink r:id="rId145">
         <w:r>
@@ -8338,7 +8473,7 @@
             <w:color w:val="2E74B5"/>
             <w:u w:val="single"/>
           </w:rPr>
-          <w:t>原始来源</w:t>
+          <w:t>https://www.appliedclinicaltrialsonline.com/view/shining-a-light-on-the-inefficiencies-in-amendment-implementation</w:t>
         </w:r>
       </w:hyperlink>
     </w:p>
@@ -8391,7 +8526,8 @@
         <w:t>Prelude EDC, 2026。</w:t>
       </w:r>
       <w:r>
-        <w:t xml:space="preserve"> </w:t>
+        <w:br/>
+        <w:t>链接：</w:t>
       </w:r>
       <w:hyperlink r:id="rId146">
         <w:r>
@@ -8399,7 +8535,7 @@
             <w:color w:val="2E74B5"/>
             <w:u w:val="single"/>
           </w:rPr>
-          <w:t>原始来源</w:t>
+          <w:t>https://preludeedc.com/resource/cost-of-protocol-amendments-phase-1/</w:t>
         </w:r>
       </w:hyperlink>
     </w:p>
@@ -8452,7 +8588,8 @@
         <w:t>Docuvera, 2025。</w:t>
       </w:r>
       <w:r>
-        <w:t xml:space="preserve"> </w:t>
+        <w:br/>
+        <w:t>链接：</w:t>
       </w:r>
       <w:hyperlink r:id="rId147">
         <w:r>
@@ -8460,7 +8597,7 @@
             <w:color w:val="2E74B5"/>
             <w:u w:val="single"/>
           </w:rPr>
-          <w:t>原始来源</w:t>
+          <w:t>https://docuvera.com/blog/structured-content-for-medical-writers/</w:t>
         </w:r>
       </w:hyperlink>
     </w:p>
@@ -8513,7 +8650,8 @@
         <w:t>Echo360, 2026。</w:t>
       </w:r>
       <w:r>
-        <w:t xml:space="preserve"> </w:t>
+        <w:br/>
+        <w:t>链接：</w:t>
       </w:r>
       <w:hyperlink r:id="rId148">
         <w:r>
@@ -8521,7 +8659,7 @@
             <w:color w:val="2E74B5"/>
             <w:u w:val="single"/>
           </w:rPr>
-          <w:t>原始来源</w:t>
+          <w:t>https://echo360.com/articles/structured-content-authoring-pharma-tools/</w:t>
         </w:r>
       </w:hyperlink>
     </w:p>
@@ -8574,7 +8712,8 @@
         <w:t>Deloitte, 2026。</w:t>
       </w:r>
       <w:r>
-        <w:t xml:space="preserve"> </w:t>
+        <w:br/>
+        <w:t>链接：</w:t>
       </w:r>
       <w:hyperlink r:id="rId149">
         <w:r>
@@ -8582,7 +8721,7 @@
             <w:color w:val="2E74B5"/>
             <w:u w:val="single"/>
           </w:rPr>
-          <w:t>原始来源</w:t>
+          <w:t>https://www.deloitte.com/us/en/industries/life-sciences-health-care/articles/gen-ai-and-medical-writing.html</w:t>
         </w:r>
       </w:hyperlink>
     </w:p>
@@ -8635,7 +8774,8 @@
         <w:t>AlphaLifeSci, 2026。</w:t>
       </w:r>
       <w:r>
-        <w:t xml:space="preserve"> </w:t>
+        <w:br/>
+        <w:t>链接：</w:t>
       </w:r>
       <w:hyperlink r:id="rId150">
         <w:r>
@@ -8643,7 +8783,7 @@
             <w:color w:val="2E74B5"/>
             <w:u w:val="single"/>
           </w:rPr>
-          <w:t>原始来源</w:t>
+          <w:t>https://alphalifesci.com/products/auroraprime-rma/medical-writing</w:t>
         </w:r>
       </w:hyperlink>
     </w:p>
@@ -8696,7 +8836,8 @@
         <w:t>PMC, 2016。</w:t>
       </w:r>
       <w:r>
-        <w:t xml:space="preserve"> </w:t>
+        <w:br/>
+        <w:t>链接：</w:t>
       </w:r>
       <w:hyperlink r:id="rId151">
         <w:r>
@@ -8704,7 +8845,7 @@
             <w:color w:val="2E74B5"/>
             <w:u w:val="single"/>
           </w:rPr>
-          <w:t>原始来源</w:t>
+          <w:t>https://pmc.ncbi.nlm.nih.gov/articles/PMC5198475/</w:t>
         </w:r>
       </w:hyperlink>
     </w:p>
@@ -8757,7 +8898,8 @@
         <w:t>Quanticate, 2026。</w:t>
       </w:r>
       <w:r>
-        <w:t xml:space="preserve"> </w:t>
+        <w:br/>
+        <w:t>链接：</w:t>
       </w:r>
       <w:hyperlink r:id="rId152">
         <w:r>
@@ -8765,7 +8907,7 @@
             <w:color w:val="2E74B5"/>
             <w:u w:val="single"/>
           </w:rPr>
-          <w:t>原始来源</w:t>
+          <w:t>https://www.quanticate.com/clinical-trial-protocol-development</w:t>
         </w:r>
       </w:hyperlink>
     </w:p>
@@ -8818,7 +8960,8 @@
         <w:t>PMC, 2025。</w:t>
       </w:r>
       <w:r>
-        <w:t xml:space="preserve"> </w:t>
+        <w:br/>
+        <w:t>链接：</w:t>
       </w:r>
       <w:hyperlink r:id="rId153">
         <w:r>
@@ -8826,7 +8969,7 @@
             <w:color w:val="2E74B5"/>
             <w:u w:val="single"/>
           </w:rPr>
-          <w:t>原始来源</w:t>
+          <w:t>https://pmc.ncbi.nlm.nih.gov/articles/PMC12579691/</w:t>
         </w:r>
       </w:hyperlink>
     </w:p>
@@ -8879,7 +9022,8 @@
         <w:t>IQVIA, 2026。</w:t>
       </w:r>
       <w:r>
-        <w:t xml:space="preserve"> </w:t>
+        <w:br/>
+        <w:t>链接：</w:t>
       </w:r>
       <w:hyperlink r:id="rId154">
         <w:r>
@@ -8887,7 +9031,7 @@
             <w:color w:val="2E74B5"/>
             <w:u w:val="single"/>
           </w:rPr>
-          <w:t>原始来源</w:t>
+          <w:t>https://www.iqvia.com/blogs/2026/01/assessing-protocol-complexity-and-its-impact-on-trial-outcomes</w:t>
         </w:r>
       </w:hyperlink>
     </w:p>
@@ -8940,7 +9084,8 @@
         <w:t>Precision for Medicine, 2025。</w:t>
       </w:r>
       <w:r>
-        <w:t xml:space="preserve"> </w:t>
+        <w:br/>
+        <w:t>链接：</w:t>
       </w:r>
       <w:hyperlink r:id="rId155">
         <w:r>
@@ -8948,7 +9093,7 @@
             <w:color w:val="2E74B5"/>
             <w:u w:val="single"/>
           </w:rPr>
-          <w:t>原始来源</w:t>
+          <w:t>https://www.precisionformedicine.com/blog/the-amendment-trap-why-76-of-clinical-trials-face-six-figure-protocol-changes</w:t>
         </w:r>
       </w:hyperlink>
     </w:p>
@@ -9001,7 +9146,8 @@
         <w:t>CRIO, 2025。</w:t>
       </w:r>
       <w:r>
-        <w:t xml:space="preserve"> </w:t>
+        <w:br/>
+        <w:t>链接：</w:t>
       </w:r>
       <w:hyperlink r:id="rId156">
         <w:r>
@@ -9009,7 +9155,7 @@
             <w:color w:val="2E74B5"/>
             <w:u w:val="single"/>
           </w:rPr>
-          <w:t>原始来源</w:t>
+          <w:t>https://clinicalresearch.io/blog/the-rising-complexity-of-study-design-what-it-means-for-clinical-research-sites/</w:t>
         </w:r>
       </w:hyperlink>
     </w:p>
@@ -9062,7 +9208,8 @@
         <w:t>Veeva Systems, 2026。</w:t>
       </w:r>
       <w:r>
-        <w:t xml:space="preserve"> </w:t>
+        <w:br/>
+        <w:t>链接：</w:t>
       </w:r>
       <w:hyperlink r:id="rId157">
         <w:r>
@@ -9070,7 +9217,7 @@
             <w:color w:val="2E74B5"/>
             <w:u w:val="single"/>
           </w:rPr>
-          <w:t>原始来源</w:t>
+          <w:t>https://www.veeva.com/products/clinical-operations/</w:t>
         </w:r>
       </w:hyperlink>
     </w:p>
@@ -9123,7 +9270,8 @@
         <w:t>Veeva Systems, 2026。</w:t>
       </w:r>
       <w:r>
-        <w:t xml:space="preserve"> </w:t>
+        <w:br/>
+        <w:t>链接：</w:t>
       </w:r>
       <w:hyperlink r:id="rId158">
         <w:r>
@@ -9131,7 +9279,7 @@
             <w:color w:val="2E74B5"/>
             <w:u w:val="single"/>
           </w:rPr>
-          <w:t>原始来源</w:t>
+          <w:t>https://www.veeva.com/products/veeva-clinical-platform/</w:t>
         </w:r>
       </w:hyperlink>
     </w:p>
@@ -9184,7 +9332,8 @@
         <w:t>Veeva Vault Help, 2025。</w:t>
       </w:r>
       <w:r>
-        <w:t xml:space="preserve"> </w:t>
+        <w:br/>
+        <w:t>链接：</w:t>
       </w:r>
       <w:hyperlink r:id="rId159">
         <w:r>
@@ -9192,7 +9341,7 @@
             <w:color w:val="2E74B5"/>
             <w:u w:val="single"/>
           </w:rPr>
-          <w:t>原始来源</w:t>
+          <w:t>https://clinical.veevavault.help/en/lr/899718/</w:t>
         </w:r>
       </w:hyperlink>
     </w:p>
@@ -9245,7 +9394,8 @@
         <w:t>Oracle, 2021。</w:t>
       </w:r>
       <w:r>
-        <w:t xml:space="preserve"> </w:t>
+        <w:br/>
+        <w:t>链接：</w:t>
       </w:r>
       <w:hyperlink r:id="rId160">
         <w:r>
@@ -9253,7 +9403,7 @@
             <w:color w:val="2E74B5"/>
             <w:u w:val="single"/>
           </w:rPr>
-          <w:t>原始来源</w:t>
+          <w:t>https://www.oracle.com/a/ocom/docs/industries/life-sciences/clinical-one-overview-solution-brief.pdf</w:t>
         </w:r>
       </w:hyperlink>
     </w:p>
@@ -9306,7 +9456,8 @@
         <w:t>Oracle, 2026。</w:t>
       </w:r>
       <w:r>
-        <w:t xml:space="preserve"> </w:t>
+        <w:br/>
+        <w:t>链接：</w:t>
       </w:r>
       <w:hyperlink r:id="rId161">
         <w:r>
@@ -9314,7 +9465,7 @@
             <w:color w:val="2E74B5"/>
             <w:u w:val="single"/>
           </w:rPr>
-          <w:t>原始来源</w:t>
+          <w:t>https://www.oracle.com/ae/life-sciences/clinical-trial-data-collection/</w:t>
         </w:r>
       </w:hyperlink>
     </w:p>
@@ -9367,7 +9518,8 @@
         <w:t>Oracle Documentation, 2026。</w:t>
       </w:r>
       <w:r>
-        <w:t xml:space="preserve"> </w:t>
+        <w:br/>
+        <w:t>链接：</w:t>
       </w:r>
       <w:hyperlink r:id="rId162">
         <w:r>
@@ -9375,7 +9527,7 @@
             <w:color w:val="2E74B5"/>
             <w:u w:val="single"/>
           </w:rPr>
-          <w:t>原始来源</w:t>
+          <w:t>https://docs.oracle.com/cd/G26828_01/books/CTMS/c-Applying-Protocol-Amendments-to-Sites-and-Clinical-Subjects--ad1003746.html</w:t>
         </w:r>
       </w:hyperlink>
     </w:p>
@@ -9428,7 +9580,8 @@
         <w:t>Medidata, 2026。</w:t>
       </w:r>
       <w:r>
-        <w:t xml:space="preserve"> </w:t>
+        <w:br/>
+        <w:t>链接：</w:t>
       </w:r>
       <w:hyperlink r:id="rId163">
         <w:r>
@@ -9436,7 +9589,7 @@
             <w:color w:val="2E74B5"/>
             <w:u w:val="single"/>
           </w:rPr>
-          <w:t>原始来源</w:t>
+          <w:t>https://www.medidata.com/en/clinical-trial-products/medidata-ai/</w:t>
         </w:r>
       </w:hyperlink>
     </w:p>
@@ -9489,7 +9642,8 @@
         <w:t>Medidata, 2026。</w:t>
       </w:r>
       <w:r>
-        <w:t xml:space="preserve"> </w:t>
+        <w:br/>
+        <w:t>链接：</w:t>
       </w:r>
       <w:hyperlink r:id="rId164">
         <w:r>
@@ -9497,7 +9651,7 @@
             <w:color w:val="2E74B5"/>
             <w:u w:val="single"/>
           </w:rPr>
-          <w:t>原始来源</w:t>
+          <w:t>https://www.medidata.com/en/data-experience/clinical-data-studio/</w:t>
         </w:r>
       </w:hyperlink>
     </w:p>
@@ -9550,7 +9704,8 @@
         <w:t>Medidata, 2025。</w:t>
       </w:r>
       <w:r>
-        <w:t xml:space="preserve"> </w:t>
+        <w:br/>
+        <w:t>链接：</w:t>
       </w:r>
       <w:hyperlink r:id="rId165">
         <w:r>
@@ -9558,7 +9713,7 @@
             <w:color w:val="2E74B5"/>
             <w:u w:val="single"/>
           </w:rPr>
-          <w:t>原始来源</w:t>
+          <w:t>https://www.medidata.com/en/life-science-resources/medidata-blog/ai-study-build/</w:t>
         </w:r>
       </w:hyperlink>
     </w:p>
@@ -9611,7 +9766,8 @@
         <w:t>Medidata and Dassault Systemes, 2024。</w:t>
       </w:r>
       <w:r>
-        <w:t xml:space="preserve"> </w:t>
+        <w:br/>
+        <w:t>链接：</w:t>
       </w:r>
       <w:hyperlink r:id="rId166">
         <w:r>
@@ -9619,7 +9775,7 @@
             <w:color w:val="2E74B5"/>
             <w:u w:val="single"/>
           </w:rPr>
-          <w:t>原始来源</w:t>
+          <w:t>https://www.3ds.com/newsroom/press-releases/medidata-launches-clinical-data-studio-leveraging-ai-modernize-data-experience-clinical-trials</w:t>
         </w:r>
       </w:hyperlink>
     </w:p>
@@ -9672,7 +9828,8 @@
         <w:t>Kitsa, 2026。</w:t>
       </w:r>
       <w:r>
-        <w:t xml:space="preserve"> </w:t>
+        <w:br/>
+        <w:t>链接：</w:t>
       </w:r>
       <w:hyperlink r:id="rId167">
         <w:r>
@@ -9680,7 +9837,7 @@
             <w:color w:val="2E74B5"/>
             <w:u w:val="single"/>
           </w:rPr>
-          <w:t>原始来源</w:t>
+          <w:t>https://kitsa.ai/resources/ai-powered-documentation</w:t>
         </w:r>
       </w:hyperlink>
     </w:p>
@@ -9733,7 +9890,8 @@
         <w:t>Tech Mahindra and Kitsa, 2026。</w:t>
       </w:r>
       <w:r>
-        <w:t xml:space="preserve"> </w:t>
+        <w:br/>
+        <w:t>链接：</w:t>
       </w:r>
       <w:hyperlink r:id="rId168">
         <w:r>
@@ -9741,7 +9899,7 @@
             <w:color w:val="2E74B5"/>
             <w:u w:val="single"/>
           </w:rPr>
-          <w:t>原始来源</w:t>
+          <w:t>https://www.techmahindra.com/insights/news/kitsa-and-tech-mahindra-collaborate-for-next-gen-pharma-solutions/</w:t>
         </w:r>
       </w:hyperlink>
     </w:p>
@@ -9794,7 +9952,8 @@
         <w:t>Clinion, 2025。</w:t>
       </w:r>
       <w:r>
-        <w:t xml:space="preserve"> </w:t>
+        <w:br/>
+        <w:t>链接：</w:t>
       </w:r>
       <w:hyperlink r:id="rId169">
         <w:r>
@@ -9802,7 +9961,7 @@
             <w:color w:val="2E74B5"/>
             <w:u w:val="single"/>
           </w:rPr>
-          <w:t>原始来源</w:t>
+          <w:t>https://www.clinion.com/insight/simplifying-clinical-trial-protocol-with-genai/</w:t>
         </w:r>
       </w:hyperlink>
     </w:p>
@@ -9855,7 +10014,8 @@
         <w:t>Kitsa, 2026。</w:t>
       </w:r>
       <w:r>
-        <w:t xml:space="preserve"> </w:t>
+        <w:br/>
+        <w:t>链接：</w:t>
       </w:r>
       <w:hyperlink r:id="rId170">
         <w:r>
@@ -9863,7 +10023,7 @@
             <w:color w:val="2E74B5"/>
             <w:u w:val="single"/>
           </w:rPr>
-          <w:t>原始来源</w:t>
+          <w:t>https://kitsa.ai/blog</w:t>
         </w:r>
       </w:hyperlink>
     </w:p>
@@ -9916,7 +10076,8 @@
         <w:t>CARA Life Sciences, 2026。</w:t>
       </w:r>
       <w:r>
-        <w:t xml:space="preserve"> </w:t>
+        <w:br/>
+        <w:t>链接：</w:t>
       </w:r>
       <w:hyperlink r:id="rId171">
         <w:r>
@@ -9924,7 +10085,7 @@
             <w:color w:val="2E74B5"/>
             <w:u w:val="single"/>
           </w:rPr>
-          <w:t>原始来源</w:t>
+          <w:t>https://www.caralifesciences.generiscorp.com/clinical-solutions/medical-writing-automatic-clinical-protocol-generation/</w:t>
         </w:r>
       </w:hyperlink>
     </w:p>
@@ -9977,7 +10138,8 @@
         <w:t>TrialAssure, 2026。</w:t>
       </w:r>
       <w:r>
-        <w:t xml:space="preserve"> </w:t>
+        <w:br/>
+        <w:t>链接：</w:t>
       </w:r>
       <w:hyperlink r:id="rId172">
         <w:r>
@@ -9985,7 +10147,7 @@
             <w:color w:val="2E74B5"/>
             <w:u w:val="single"/>
           </w:rPr>
-          <w:t>原始来源</w:t>
+          <w:t>https://trialassure.com/</w:t>
         </w:r>
       </w:hyperlink>
     </w:p>
@@ -10038,7 +10200,8 @@
         <w:t>TrialAssure, 2026。</w:t>
       </w:r>
       <w:r>
-        <w:t xml:space="preserve"> </w:t>
+        <w:br/>
+        <w:t>链接：</w:t>
       </w:r>
       <w:hyperlink r:id="rId173">
         <w:r>
@@ -10046,7 +10209,7 @@
             <w:color w:val="2E74B5"/>
             <w:u w:val="single"/>
           </w:rPr>
-          <w:t>原始来源</w:t>
+          <w:t>https://trialassure.com/software/anonymize/</w:t>
         </w:r>
       </w:hyperlink>
     </w:p>
@@ -10099,7 +10262,8 @@
         <w:t>Narrativa, 2026。</w:t>
       </w:r>
       <w:r>
-        <w:t xml:space="preserve"> </w:t>
+        <w:br/>
+        <w:t>链接：</w:t>
       </w:r>
       <w:hyperlink r:id="rId174">
         <w:r>
@@ -10107,7 +10271,7 @@
             <w:color w:val="2E74B5"/>
             <w:u w:val="single"/>
           </w:rPr>
-          <w:t>原始来源</w:t>
+          <w:t>https://www.narrativa.com/protocol-clinical-trials-automation-with-ai-agents/</w:t>
         </w:r>
       </w:hyperlink>
     </w:p>
@@ -10160,7 +10324,8 @@
         <w:t>Paperguide, 2026。</w:t>
       </w:r>
       <w:r>
-        <w:t xml:space="preserve"> </w:t>
+        <w:br/>
+        <w:t>链接：</w:t>
       </w:r>
       <w:hyperlink r:id="rId175">
         <w:r>
@@ -10168,7 +10333,7 @@
             <w:color w:val="2E74B5"/>
             <w:u w:val="single"/>
           </w:rPr>
-          <w:t>原始来源</w:t>
+          <w:t>https://paperguide.ai/solutions/clinical-trails/</w:t>
         </w:r>
       </w:hyperlink>
     </w:p>
@@ -10221,7 +10386,8 @@
         <w:t>arXiv, 2024。</w:t>
       </w:r>
       <w:r>
-        <w:t xml:space="preserve"> </w:t>
+        <w:br/>
+        <w:t>链接：</w:t>
       </w:r>
       <w:hyperlink r:id="rId176">
         <w:r>
@@ -10229,7 +10395,7 @@
             <w:color w:val="2E74B5"/>
             <w:u w:val="single"/>
           </w:rPr>
-          <w:t>原始来源</w:t>
+          <w:t>https://arxiv.org/abs/2404.05044</w:t>
         </w:r>
       </w:hyperlink>
     </w:p>
@@ -10282,7 +10448,8 @@
         <w:t>Certara, 2026。</w:t>
       </w:r>
       <w:r>
-        <w:t xml:space="preserve"> </w:t>
+        <w:br/>
+        <w:t>链接：</w:t>
       </w:r>
       <w:hyperlink r:id="rId177">
         <w:r>
@@ -10290,7 +10457,7 @@
             <w:color w:val="2E74B5"/>
             <w:u w:val="single"/>
           </w:rPr>
-          <w:t>原始来源</w:t>
+          <w:t>https://www.certara.com/coauthor/</w:t>
         </w:r>
       </w:hyperlink>
     </w:p>
@@ -10343,7 +10510,8 @@
         <w:t>Certara, 2023。</w:t>
       </w:r>
       <w:r>
-        <w:t xml:space="preserve"> </w:t>
+        <w:br/>
+        <w:t>链接：</w:t>
       </w:r>
       <w:hyperlink r:id="rId178">
         <w:r>
@@ -10351,7 +10519,7 @@
             <w:color w:val="2E74B5"/>
             <w:u w:val="single"/>
           </w:rPr>
-          <w:t>原始来源</w:t>
+          <w:t>https://www.certara.com/announcement/certara-launches-coauthor-a-regulatory-and-medical-writing-tool/</w:t>
         </w:r>
       </w:hyperlink>
     </w:p>
@@ -10404,7 +10572,8 @@
         <w:t>Certara, 2026。</w:t>
       </w:r>
       <w:r>
-        <w:t xml:space="preserve"> </w:t>
+        <w:br/>
+        <w:t>链接：</w:t>
       </w:r>
       <w:hyperlink r:id="rId179">
         <w:r>
@@ -10412,7 +10581,7 @@
             <w:color w:val="2E74B5"/>
             <w:u w:val="single"/>
           </w:rPr>
-          <w:t>原始来源</w:t>
+          <w:t>https://www.certara.com/fact-sheet/coauthor/</w:t>
         </w:r>
       </w:hyperlink>
     </w:p>
@@ -10465,7 +10634,8 @@
         <w:t>Yseop, 2026。</w:t>
       </w:r>
       <w:r>
-        <w:t xml:space="preserve"> </w:t>
+        <w:br/>
+        <w:t>链接：</w:t>
       </w:r>
       <w:hyperlink r:id="rId180">
         <w:r>
@@ -10473,7 +10643,7 @@
             <w:color w:val="2E74B5"/>
             <w:u w:val="single"/>
           </w:rPr>
-          <w:t>原始来源</w:t>
+          <w:t>https://yseop.com/medical-writing-automation/</w:t>
         </w:r>
       </w:hyperlink>
     </w:p>
@@ -10526,7 +10696,8 @@
         <w:t>Yseop, 2026。</w:t>
       </w:r>
       <w:r>
-        <w:t xml:space="preserve"> </w:t>
+        <w:br/>
+        <w:t>链接：</w:t>
       </w:r>
       <w:hyperlink r:id="rId181">
         <w:r>
@@ -10534,7 +10705,7 @@
             <w:color w:val="2E74B5"/>
             <w:u w:val="single"/>
           </w:rPr>
-          <w:t>原始来源</w:t>
+          <w:t>https://yseop.com/solutions/life-sciences/clinical/</w:t>
         </w:r>
       </w:hyperlink>
     </w:p>
@@ -10587,7 +10758,8 @@
         <w:t>Yseop, 2026。</w:t>
       </w:r>
       <w:r>
-        <w:t xml:space="preserve"> </w:t>
+        <w:br/>
+        <w:t>链接：</w:t>
       </w:r>
       <w:hyperlink r:id="rId182">
         <w:r>
@@ -10595,7 +10767,7 @@
             <w:color w:val="2E74B5"/>
             <w:u w:val="single"/>
           </w:rPr>
-          <w:t>原始来源</w:t>
+          <w:t>https://yseop.com/automate-medical-regulatory-authoringworkflows/</w:t>
         </w:r>
       </w:hyperlink>
     </w:p>
@@ -10648,7 +10820,8 @@
         <w:t>Montrium, 2026。</w:t>
       </w:r>
       <w:r>
-        <w:t xml:space="preserve"> </w:t>
+        <w:br/>
+        <w:t>链接：</w:t>
       </w:r>
       <w:hyperlink r:id="rId183">
         <w:r>
@@ -10656,7 +10829,7 @@
             <w:color w:val="2E74B5"/>
             <w:u w:val="single"/>
           </w:rPr>
-          <w:t>原始来源</w:t>
+          <w:t>https://www.montrium.com/etmf-connect-features</w:t>
         </w:r>
       </w:hyperlink>
     </w:p>
@@ -10709,7 +10882,8 @@
         <w:t>Montrium, 2026。</w:t>
       </w:r>
       <w:r>
-        <w:t xml:space="preserve"> </w:t>
+        <w:br/>
+        <w:t>链接：</w:t>
       </w:r>
       <w:hyperlink r:id="rId184">
         <w:r>
@@ -10717,7 +10891,7 @@
             <w:color w:val="2E74B5"/>
             <w:u w:val="single"/>
           </w:rPr>
-          <w:t>原始来源</w:t>
+          <w:t>https://www.montrium.com/</w:t>
         </w:r>
       </w:hyperlink>
     </w:p>
@@ -10770,7 +10944,8 @@
         <w:t>MasterControl, 2026。</w:t>
       </w:r>
       <w:r>
-        <w:t xml:space="preserve"> </w:t>
+        <w:br/>
+        <w:t>链接：</w:t>
       </w:r>
       <w:hyperlink r:id="rId185">
         <w:r>
@@ -10778,7 +10953,7 @@
             <w:color w:val="2E74B5"/>
             <w:u w:val="single"/>
           </w:rPr>
-          <w:t>原始来源</w:t>
+          <w:t>https://www.mastercontrol.com/au/clinical/etmf-software-systems/</w:t>
         </w:r>
       </w:hyperlink>
     </w:p>
@@ -10831,7 +11006,8 @@
         <w:t>MasterControl, 2026。</w:t>
       </w:r>
       <w:r>
-        <w:t xml:space="preserve"> </w:t>
+        <w:br/>
+        <w:t>链接：</w:t>
       </w:r>
       <w:hyperlink r:id="rId186">
         <w:r>
@@ -10839,7 +11015,7 @@
             <w:color w:val="2E74B5"/>
             <w:u w:val="single"/>
           </w:rPr>
-          <w:t>原始来源</w:t>
+          <w:t>https://www.mastercontrol.com/resource-center/documents/mastercontrol-etmf-manager/</w:t>
         </w:r>
       </w:hyperlink>
     </w:p>
@@ -10892,7 +11068,8 @@
         <w:t>HumanTrue, 2026。</w:t>
       </w:r>
       <w:r>
-        <w:t xml:space="preserve"> </w:t>
+        <w:br/>
+        <w:t>链接：</w:t>
       </w:r>
       <w:hyperlink r:id="rId187">
         <w:r>
@@ -10900,7 +11077,7 @@
             <w:color w:val="2E74B5"/>
             <w:u w:val="single"/>
           </w:rPr>
-          <w:t>原始来源</w:t>
+          <w:t>https://humantrue.com/quality</w:t>
         </w:r>
       </w:hyperlink>
     </w:p>
@@ -10953,7 +11130,8 @@
         <w:t>Cori Clinical, 2026。</w:t>
       </w:r>
       <w:r>
-        <w:t xml:space="preserve"> </w:t>
+        <w:br/>
+        <w:t>链接：</w:t>
       </w:r>
       <w:hyperlink r:id="rId188">
         <w:r>
@@ -10961,7 +11139,7 @@
             <w:color w:val="2E74B5"/>
             <w:u w:val="single"/>
           </w:rPr>
-          <w:t>原始来源</w:t>
+          <w:t>https://www.cori-clinical.com/</w:t>
         </w:r>
       </w:hyperlink>
     </w:p>
@@ -11014,7 +11192,8 @@
         <w:t>Cori Clinical, 2026。</w:t>
       </w:r>
       <w:r>
-        <w:t xml:space="preserve"> </w:t>
+        <w:br/>
+        <w:t>链接：</w:t>
       </w:r>
       <w:hyperlink r:id="rId189">
         <w:r>
@@ -11022,7 +11201,7 @@
             <w:color w:val="2E74B5"/>
             <w:u w:val="single"/>
           </w:rPr>
-          <w:t>原始来源</w:t>
+          <w:t>https://www.cori-clinical.com/assist</w:t>
         </w:r>
       </w:hyperlink>
     </w:p>
@@ -11075,7 +11254,8 @@
         <w:t>Cori Clinical, 2026。</w:t>
       </w:r>
       <w:r>
-        <w:t xml:space="preserve"> </w:t>
+        <w:br/>
+        <w:t>链接：</w:t>
       </w:r>
       <w:hyperlink r:id="rId190">
         <w:r>
@@ -11083,7 +11263,7 @@
             <w:color w:val="2E74B5"/>
             <w:u w:val="single"/>
           </w:rPr>
-          <w:t>原始来源</w:t>
+          <w:t>https://www.cori-clinical.com/review</w:t>
         </w:r>
       </w:hyperlink>
     </w:p>
@@ -11136,7 +11316,8 @@
         <w:t>Clinials, 2026。</w:t>
       </w:r>
       <w:r>
-        <w:t xml:space="preserve"> </w:t>
+        <w:br/>
+        <w:t>链接：</w:t>
       </w:r>
       <w:hyperlink r:id="rId191">
         <w:r>
@@ -11144,7 +11325,7 @@
             <w:color w:val="2E74B5"/>
             <w:u w:val="single"/>
           </w:rPr>
-          <w:t>原始来源</w:t>
+          <w:t>https://clinials.com/</w:t>
         </w:r>
       </w:hyperlink>
     </w:p>
@@ -11197,7 +11378,8 @@
         <w:t>Clinials, 2026。</w:t>
       </w:r>
       <w:r>
-        <w:t xml:space="preserve"> </w:t>
+        <w:br/>
+        <w:t>链接：</w:t>
       </w:r>
       <w:hyperlink r:id="rId192">
         <w:r>
@@ -11205,7 +11387,7 @@
             <w:color w:val="2E74B5"/>
             <w:u w:val="single"/>
           </w:rPr>
-          <w:t>原始来源</w:t>
+          <w:t>https://clinials.com/about-us</w:t>
         </w:r>
       </w:hyperlink>
     </w:p>
@@ -11258,7 +11440,8 @@
         <w:t>Taimei Technology, 2026。</w:t>
       </w:r>
       <w:r>
-        <w:t xml:space="preserve"> </w:t>
+        <w:br/>
+        <w:t>链接：</w:t>
       </w:r>
       <w:hyperlink r:id="rId193">
         <w:r>
@@ -11266,7 +11449,7 @@
             <w:color w:val="2E74B5"/>
             <w:u w:val="single"/>
           </w:rPr>
-          <w:t>原始来源</w:t>
+          <w:t>https://cn.taimei.com/index/product/id/41</w:t>
         </w:r>
       </w:hyperlink>
     </w:p>
@@ -11319,7 +11502,8 @@
         <w:t>Taimei Technology, 2026。</w:t>
       </w:r>
       <w:r>
-        <w:t xml:space="preserve"> </w:t>
+        <w:br/>
+        <w:t>链接：</w:t>
       </w:r>
       <w:hyperlink r:id="rId194">
         <w:r>
@@ -11327,7 +11511,7 @@
             <w:color w:val="2E74B5"/>
             <w:u w:val="single"/>
           </w:rPr>
-          <w:t>原始来源</w:t>
+          <w:t>https://cn.taimei.com/cn/6466</w:t>
         </w:r>
       </w:hyperlink>
     </w:p>
@@ -11380,7 +11564,8 @@
         <w:t>Evinova, 2026。</w:t>
       </w:r>
       <w:r>
-        <w:t xml:space="preserve"> </w:t>
+        <w:br/>
+        <w:t>链接：</w:t>
       </w:r>
       <w:hyperlink r:id="rId195">
         <w:r>
@@ -11388,7 +11573,7 @@
             <w:color w:val="2E74B5"/>
             <w:u w:val="single"/>
           </w:rPr>
-          <w:t>原始来源</w:t>
+          <w:t>https://evinova.com/sda</w:t>
         </w:r>
       </w:hyperlink>
     </w:p>
@@ -11441,7 +11626,8 @@
         <w:t>IQVIA, 2026。</w:t>
       </w:r>
       <w:r>
-        <w:t xml:space="preserve"> </w:t>
+        <w:br/>
+        <w:t>链接：</w:t>
       </w:r>
       <w:hyperlink r:id="rId196">
         <w:r>
@@ -11449,7 +11635,7 @@
             <w:color w:val="2E74B5"/>
             <w:u w:val="single"/>
           </w:rPr>
-          <w:t>原始来源</w:t>
+          <w:t>https://www.iqvia.com/solutions/research-and-development/consulting/protocol-design-optimization</w:t>
         </w:r>
       </w:hyperlink>
     </w:p>
@@ -11502,7 +11688,8 @@
         <w:t>Medidata, 2026。</w:t>
       </w:r>
       <w:r>
-        <w:t xml:space="preserve"> </w:t>
+        <w:br/>
+        <w:t>链接：</w:t>
       </w:r>
       <w:hyperlink r:id="rId197">
         <w:r>
@@ -11510,7 +11697,7 @@
             <w:color w:val="2E74B5"/>
             <w:u w:val="single"/>
           </w:rPr>
-          <w:t>原始来源</w:t>
+          <w:t>https://www.medidata.com/en/study-experience/protocol-optimization/</w:t>
         </w:r>
       </w:hyperlink>
     </w:p>
@@ -11563,7 +11750,8 @@
         <w:t>Medidata, 2026。</w:t>
       </w:r>
       <w:r>
-        <w:t xml:space="preserve"> </w:t>
+        <w:br/>
+        <w:t>链接：</w:t>
       </w:r>
       <w:hyperlink r:id="rId198">
         <w:r>
@@ -11571,7 +11759,7 @@
             <w:color w:val="2E74B5"/>
             <w:u w:val="single"/>
           </w:rPr>
-          <w:t>原始来源</w:t>
+          <w:t>https://www.medidata.com/en/study-experience/clinical-trial-analytics/</w:t>
         </w:r>
       </w:hyperlink>
     </w:p>
@@ -11632,7 +11820,8 @@
         <w:t>Feishu Aily, 2026。</w:t>
       </w:r>
       <w:r>
-        <w:t xml:space="preserve"> </w:t>
+        <w:br/>
+        <w:t>链接：</w:t>
       </w:r>
       <w:hyperlink r:id="rId199">
         <w:r>
@@ -11640,7 +11829,7 @@
             <w:color w:val="2E74B5"/>
             <w:u w:val="single"/>
           </w:rPr>
-          <w:t>原始来源</w:t>
+          <w:t>https://aily.feishu.cn/hc/1u7kleqg/4q7o7as7</w:t>
         </w:r>
       </w:hyperlink>
     </w:p>
@@ -11693,7 +11882,8 @@
         <w:t>Feishu, 2026。</w:t>
       </w:r>
       <w:r>
-        <w:t xml:space="preserve"> </w:t>
+        <w:br/>
+        <w:t>链接：</w:t>
       </w:r>
       <w:hyperlink r:id="rId200">
         <w:r>
@@ -11701,7 +11891,7 @@
             <w:color w:val="2E74B5"/>
             <w:u w:val="single"/>
           </w:rPr>
-          <w:t>原始来源</w:t>
+          <w:t>https://www.feishu.cn/hc/en-US/articles/790732948604-get-started-with-feishu-aily</w:t>
         </w:r>
       </w:hyperlink>
     </w:p>
@@ -11754,7 +11944,8 @@
         <w:t>Feishu, 2026。</w:t>
       </w:r>
       <w:r>
-        <w:t xml:space="preserve"> </w:t>
+        <w:br/>
+        <w:t>链接：</w:t>
       </w:r>
       <w:hyperlink r:id="rId201">
         <w:r>
@@ -11762,7 +11953,7 @@
             <w:color w:val="2E74B5"/>
             <w:u w:val="single"/>
           </w:rPr>
-          <w:t>原始来源</w:t>
+          <w:t>https://www.feishu.cn/hc/zh-CN/articles/790732948604-%E5%BF%AB%E9%80%9F%E4%BA%86%E8%A7%A3%E9%A3%9E%E4%B9%A6-aily</w:t>
         </w:r>
       </w:hyperlink>
     </w:p>
@@ -11815,7 +12006,8 @@
         <w:t>Feishu, 2026。</w:t>
       </w:r>
       <w:r>
-        <w:t xml:space="preserve"> </w:t>
+        <w:br/>
+        <w:t>链接：</w:t>
       </w:r>
       <w:hyperlink r:id="rId202">
         <w:r>
@@ -11823,7 +12015,7 @@
             <w:color w:val="2E74B5"/>
             <w:u w:val="single"/>
           </w:rPr>
-          <w:t>原始来源</w:t>
+          <w:t>https://www.feishu.cn/hc/en-US/articles/643175485940-use-the-ai-agent-node-in-workflow</w:t>
         </w:r>
       </w:hyperlink>
     </w:p>
@@ -11876,7 +12068,8 @@
         <w:t>Feishu, 2026。</w:t>
       </w:r>
       <w:r>
-        <w:t xml:space="preserve"> </w:t>
+        <w:br/>
+        <w:t>链接：</w:t>
       </w:r>
       <w:hyperlink r:id="rId203">
         <w:r>
@@ -11884,7 +12077,7 @@
             <w:color w:val="2E74B5"/>
             <w:u w:val="single"/>
           </w:rPr>
-          <w:t>原始来源</w:t>
+          <w:t>https://www.feishu.cn/content/3d5z9ttt</w:t>
         </w:r>
       </w:hyperlink>
     </w:p>
@@ -11937,7 +12130,8 @@
         <w:t>Feishu, 2026。</w:t>
       </w:r>
       <w:r>
-        <w:t xml:space="preserve"> </w:t>
+        <w:br/>
+        <w:t>链接：</w:t>
       </w:r>
       <w:hyperlink r:id="rId204">
         <w:r>
@@ -11945,7 +12139,7 @@
             <w:color w:val="2E74B5"/>
             <w:u w:val="single"/>
           </w:rPr>
-          <w:t>原始来源</w:t>
+          <w:t>https://www.feishu.cn/content/kdvbmrpn</w:t>
         </w:r>
       </w:hyperlink>
     </w:p>
@@ -11998,7 +12192,8 @@
         <w:t>Feishu, 2026。</w:t>
       </w:r>
       <w:r>
-        <w:t xml:space="preserve"> </w:t>
+        <w:br/>
+        <w:t>链接：</w:t>
       </w:r>
       <w:hyperlink r:id="rId205">
         <w:r>
@@ -12006,7 +12201,7 @@
             <w:color w:val="2E74B5"/>
             <w:u w:val="single"/>
           </w:rPr>
-          <w:t>原始来源</w:t>
+          <w:t>https://www.feishu.cn/hc/en-US/articles/902812682257-use-ai-generated-text-in-workflow-and-automations</w:t>
         </w:r>
       </w:hyperlink>
     </w:p>
@@ -12059,7 +12254,8 @@
         <w:t>Feishu, 2026。</w:t>
       </w:r>
       <w:r>
-        <w:t xml:space="preserve"> </w:t>
+        <w:br/>
+        <w:t>链接：</w:t>
       </w:r>
       <w:hyperlink r:id="rId206">
         <w:r>
@@ -12067,7 +12263,7 @@
             <w:color w:val="2E74B5"/>
             <w:u w:val="single"/>
           </w:rPr>
-          <w:t>原始来源</w:t>
+          <w:t>https://www.feishu.cn/product/wiki</w:t>
         </w:r>
       </w:hyperlink>
     </w:p>
@@ -12120,7 +12316,8 @@
         <w:t>Feishu, 2026。</w:t>
       </w:r>
       <w:r>
-        <w:t xml:space="preserve"> </w:t>
+        <w:br/>
+        <w:t>链接：</w:t>
       </w:r>
       <w:hyperlink r:id="rId207">
         <w:r>
@@ -12128,7 +12325,7 @@
             <w:color w:val="2E74B5"/>
             <w:u w:val="single"/>
           </w:rPr>
-          <w:t>原始来源</w:t>
+          <w:t>https://www.feishu.cn/hc/en-US/articles/317606642838-use-ai-to-build-workflows-in-base</w:t>
         </w:r>
       </w:hyperlink>
     </w:p>
@@ -12181,7 +12378,8 @@
         <w:t>Feishu, 2026。</w:t>
       </w:r>
       <w:r>
-        <w:t xml:space="preserve"> </w:t>
+        <w:br/>
+        <w:t>链接：</w:t>
       </w:r>
       <w:hyperlink r:id="rId208">
         <w:r>
@@ -12189,7 +12387,7 @@
             <w:color w:val="2E74B5"/>
             <w:u w:val="single"/>
           </w:rPr>
-          <w:t>原始来源</w:t>
+          <w:t>https://www.feishu.cn/hc/en-US/articles/629644238181-overview-of-feishu-ai-plans-and-ai-quota-usage-rules</w:t>
         </w:r>
       </w:hyperlink>
     </w:p>

</xml_diff>